<commit_message>
Update lab 1-4 reports to VGLTU sample format
</commit_message>
<xml_diff>
--- a/lab1/Otchet_Lab1_Web-Dizayn.docx
+++ b/lab1/Otchet_Lab1_Web-Dizayn.docx
@@ -4,378 +4,343 @@
   <w:body>
     <w:p>
       <w:pPr>
-        <w:spacing w:after="0" w:before="0"/>
+        <w:spacing w:after="80" w:before="0" w:line="276" w:lineRule="auto"/>
+        <w:jc w:val="center"/>
       </w:pPr>
       <w:r>
         <w:rPr>
           <w:rFonts w:ascii="Times New Roman" w:hAnsi="Times New Roman" w:eastAsia="Times New Roman"/>
           <w:b w:val="0"/>
+          <w:i w:val="0"/>
           <w:sz w:val="24"/>
+        </w:rPr>
+        <w:t>Министерство науки и высшего образования Российской Федерации</w:t>
+      </w:r>
+    </w:p>
+    <w:p>
+      <w:pPr>
+        <w:spacing w:after="80" w:before="0" w:line="276" w:lineRule="auto"/>
+        <w:jc w:val="center"/>
+      </w:pPr>
+      <w:r>
+        <w:rPr>
+          <w:rFonts w:ascii="Times New Roman" w:hAnsi="Times New Roman" w:eastAsia="Times New Roman"/>
+          <w:b w:val="0"/>
+          <w:i w:val="0"/>
+          <w:sz w:val="24"/>
+        </w:rPr>
+        <w:t>Федеральное государственное бюджетное образовательное</w:t>
+      </w:r>
+    </w:p>
+    <w:p>
+      <w:pPr>
+        <w:spacing w:after="80" w:before="0" w:line="276" w:lineRule="auto"/>
+        <w:jc w:val="center"/>
+      </w:pPr>
+      <w:r>
+        <w:rPr>
+          <w:rFonts w:ascii="Times New Roman" w:hAnsi="Times New Roman" w:eastAsia="Times New Roman"/>
+          <w:b w:val="0"/>
+          <w:i w:val="0"/>
+          <w:sz w:val="24"/>
+        </w:rPr>
+        <w:t>учреждение высшего образования</w:t>
+      </w:r>
+    </w:p>
+    <w:p>
+      <w:pPr>
+        <w:spacing w:after="80" w:before="0" w:line="276" w:lineRule="auto"/>
+        <w:jc w:val="center"/>
+      </w:pPr>
+      <w:r>
+        <w:rPr>
+          <w:rFonts w:ascii="Times New Roman" w:hAnsi="Times New Roman" w:eastAsia="Times New Roman"/>
+          <w:b w:val="0"/>
+          <w:i w:val="0"/>
+          <w:sz w:val="24"/>
+        </w:rPr>
+        <w:t>«Воронежский государственный лесотехнический университет</w:t>
+      </w:r>
+    </w:p>
+    <w:p>
+      <w:pPr>
+        <w:spacing w:after="80" w:before="0" w:line="276" w:lineRule="auto"/>
+        <w:jc w:val="center"/>
+      </w:pPr>
+      <w:r>
+        <w:rPr>
+          <w:rFonts w:ascii="Times New Roman" w:hAnsi="Times New Roman" w:eastAsia="Times New Roman"/>
+          <w:b w:val="0"/>
+          <w:i w:val="0"/>
+          <w:sz w:val="24"/>
+        </w:rPr>
+        <w:t>имени Г.Ф. Морозова»</w:t>
+      </w:r>
+    </w:p>
+    <w:p>
+      <w:pPr>
+        <w:spacing w:after="80" w:before="0" w:line="276" w:lineRule="auto"/>
+        <w:jc w:val="center"/>
+      </w:pPr>
+      <w:r>
+        <w:rPr>
+          <w:rFonts w:ascii="Times New Roman" w:hAnsi="Times New Roman" w:eastAsia="Times New Roman"/>
+          <w:b w:val="0"/>
+          <w:i w:val="0"/>
+          <w:sz w:val="24"/>
+        </w:rPr>
+        <w:t>Кафедра информационных технологий</w:t>
+      </w:r>
+    </w:p>
+    <w:p>
+      <w:pPr>
+        <w:spacing w:after="240" w:before="0" w:line="276" w:lineRule="auto"/>
+        <w:jc w:val="center"/>
+      </w:pPr>
+      <w:r>
+        <w:rPr>
+          <w:rFonts w:ascii="Times New Roman" w:hAnsi="Times New Roman" w:eastAsia="Times New Roman"/>
+          <w:b w:val="0"/>
+          <w:i w:val="0"/>
+          <w:sz w:val="28"/>
         </w:rPr>
       </w:r>
     </w:p>
     <w:p>
       <w:pPr>
-        <w:spacing w:after="0" w:before="0"/>
-      </w:pPr>
-      <w:r>
-        <w:rPr>
-          <w:rFonts w:ascii="Times New Roman" w:hAnsi="Times New Roman" w:eastAsia="Times New Roman"/>
-          <w:b w:val="0"/>
-          <w:sz w:val="24"/>
-        </w:rPr>
-      </w:r>
-    </w:p>
-    <w:p>
-      <w:pPr>
-        <w:spacing w:after="0" w:before="0"/>
-      </w:pPr>
-      <w:r>
-        <w:rPr>
-          <w:rFonts w:ascii="Times New Roman" w:hAnsi="Times New Roman" w:eastAsia="Times New Roman"/>
-          <w:b w:val="0"/>
-          <w:sz w:val="24"/>
-        </w:rPr>
-      </w:r>
-    </w:p>
-    <w:p>
-      <w:pPr>
-        <w:spacing w:after="120" w:before="480" w:line="360" w:lineRule="auto"/>
+        <w:spacing w:after="80" w:before="0" w:line="276" w:lineRule="auto"/>
         <w:jc w:val="center"/>
       </w:pPr>
       <w:r>
         <w:rPr>
           <w:rFonts w:ascii="Times New Roman" w:hAnsi="Times New Roman" w:eastAsia="Times New Roman"/>
           <w:b/>
+          <w:i w:val="0"/>
           <w:sz w:val="32"/>
+        </w:rPr>
+        <w:t>ОТЧЕТ</w:t>
+      </w:r>
+    </w:p>
+    <w:p>
+      <w:pPr>
+        <w:spacing w:after="120" w:before="0" w:line="276" w:lineRule="auto"/>
+        <w:jc w:val="center"/>
+      </w:pPr>
+      <w:r>
+        <w:rPr>
+          <w:rFonts w:ascii="Times New Roman" w:hAnsi="Times New Roman" w:eastAsia="Times New Roman"/>
+          <w:b w:val="0"/>
+          <w:i w:val="0"/>
+          <w:sz w:val="28"/>
+        </w:rPr>
+      </w:r>
+    </w:p>
+    <w:p>
+      <w:pPr>
+        <w:spacing w:after="80" w:before="0" w:line="276" w:lineRule="auto"/>
+        <w:jc w:val="center"/>
+      </w:pPr>
+      <w:r>
+        <w:rPr>
+          <w:rFonts w:ascii="Times New Roman" w:hAnsi="Times New Roman" w:eastAsia="Times New Roman"/>
+          <w:b/>
+          <w:i w:val="0"/>
+          <w:sz w:val="28"/>
         </w:rPr>
         <w:t>Лабораторная работа № 1</w:t>
       </w:r>
     </w:p>
     <w:p>
       <w:pPr>
-        <w:spacing w:after="120" w:before="0" w:line="360" w:lineRule="auto"/>
+        <w:spacing w:after="80" w:before="0" w:line="276" w:lineRule="auto"/>
         <w:jc w:val="center"/>
       </w:pPr>
       <w:r>
         <w:rPr>
           <w:rFonts w:ascii="Times New Roman" w:hAnsi="Times New Roman" w:eastAsia="Times New Roman"/>
           <w:b/>
+          <w:i w:val="0"/>
           <w:sz w:val="28"/>
         </w:rPr>
-        <w:t>по дисциплине «Web-дизайн»</w:t>
+        <w:t>на тему: «Основы верстки»</w:t>
       </w:r>
     </w:p>
     <w:p>
       <w:pPr>
-        <w:spacing w:after="120" w:before="360" w:line="360" w:lineRule="auto"/>
+        <w:spacing w:after="80" w:before="0" w:line="276" w:lineRule="auto"/>
         <w:jc w:val="center"/>
       </w:pPr>
       <w:r>
         <w:rPr>
           <w:rFonts w:ascii="Times New Roman" w:hAnsi="Times New Roman" w:eastAsia="Times New Roman"/>
           <w:b w:val="0"/>
-          <w:sz w:val="24"/>
+          <w:i w:val="0"/>
+          <w:sz w:val="28"/>
         </w:rPr>
-        <w:t>Тема: одностраничный сайт «Легенды русской поэзии»</w:t>
+        <w:t>вариант №_</w:t>
       </w:r>
     </w:p>
     <w:p>
       <w:pPr>
-        <w:spacing w:after="0" w:before="0"/>
+        <w:spacing w:after="160" w:before="0" w:line="276" w:lineRule="auto"/>
+        <w:jc w:val="center"/>
       </w:pPr>
       <w:r>
         <w:rPr>
           <w:rFonts w:ascii="Times New Roman" w:hAnsi="Times New Roman" w:eastAsia="Times New Roman"/>
           <w:b w:val="0"/>
-          <w:sz w:val="24"/>
+          <w:i w:val="0"/>
+          <w:sz w:val="28"/>
         </w:rPr>
       </w:r>
     </w:p>
     <w:p>
       <w:pPr>
-        <w:spacing w:after="0" w:before="0"/>
+        <w:spacing w:after="80" w:before="0" w:line="276" w:lineRule="auto"/>
+        <w:jc w:val="center"/>
       </w:pPr>
       <w:r>
         <w:rPr>
           <w:rFonts w:ascii="Times New Roman" w:hAnsi="Times New Roman" w:eastAsia="Times New Roman"/>
           <w:b w:val="0"/>
+          <w:i w:val="0"/>
           <w:sz w:val="24"/>
+        </w:rPr>
+        <w:t>09.03.02 Информационные системы и технологии</w:t>
+      </w:r>
+    </w:p>
+    <w:p>
+      <w:pPr>
+        <w:spacing w:after="80" w:before="0" w:line="276" w:lineRule="auto"/>
+        <w:jc w:val="center"/>
+      </w:pPr>
+      <w:r>
+        <w:rPr>
+          <w:rFonts w:ascii="Times New Roman" w:hAnsi="Times New Roman" w:eastAsia="Times New Roman"/>
+          <w:b w:val="0"/>
+          <w:i w:val="0"/>
+          <w:sz w:val="24"/>
+        </w:rPr>
+        <w:t>По дисциплине «Web-разработка»</w:t>
+      </w:r>
+    </w:p>
+    <w:p>
+      <w:pPr>
+        <w:spacing w:after="320" w:before="0" w:line="276" w:lineRule="auto"/>
+        <w:jc w:val="center"/>
+      </w:pPr>
+      <w:r>
+        <w:rPr>
+          <w:rFonts w:ascii="Times New Roman" w:hAnsi="Times New Roman" w:eastAsia="Times New Roman"/>
+          <w:b w:val="0"/>
+          <w:i w:val="0"/>
+          <w:sz w:val="28"/>
         </w:rPr>
       </w:r>
     </w:p>
     <w:p>
       <w:pPr>
-        <w:spacing w:after="0" w:before="0"/>
+        <w:spacing w:after="40" w:before="0" w:line="276" w:lineRule="auto"/>
+        <w:jc w:val="left"/>
       </w:pPr>
       <w:r>
         <w:rPr>
           <w:rFonts w:ascii="Times New Roman" w:hAnsi="Times New Roman" w:eastAsia="Times New Roman"/>
           <w:b w:val="0"/>
+          <w:i w:val="0"/>
           <w:sz w:val="24"/>
         </w:rPr>
+        <w:t>Студент группы    ИС2-241-ОБ               _________         А.А. Скопенков</w:t>
       </w:r>
     </w:p>
     <w:p>
       <w:pPr>
-        <w:spacing w:after="0" w:before="0"/>
+        <w:spacing w:after="200" w:before="0" w:line="276" w:lineRule="auto"/>
+        <w:jc w:val="left"/>
       </w:pPr>
       <w:r>
         <w:rPr>
           <w:rFonts w:ascii="Times New Roman" w:hAnsi="Times New Roman" w:eastAsia="Times New Roman"/>
           <w:b w:val="0"/>
-          <w:sz w:val="24"/>
+          <w:i w:val="0"/>
+          <w:sz w:val="18"/>
         </w:rPr>
+        <w:t xml:space="preserve">                                              (номер группы)                            (подпись)                 (инициалы и фамилия)</w:t>
       </w:r>
     </w:p>
     <w:p>
       <w:pPr>
-        <w:spacing w:after="0" w:before="0"/>
+        <w:spacing w:after="40" w:before="0" w:line="276" w:lineRule="auto"/>
+        <w:jc w:val="left"/>
       </w:pPr>
       <w:r>
         <w:rPr>
           <w:rFonts w:ascii="Times New Roman" w:hAnsi="Times New Roman" w:eastAsia="Times New Roman"/>
           <w:b w:val="0"/>
+          <w:i w:val="0"/>
           <w:sz w:val="24"/>
         </w:rPr>
+        <w:t>Руководитель, д.т.н.                                 _________          Д.В. Арапов</w:t>
       </w:r>
     </w:p>
     <w:p>
       <w:pPr>
-        <w:spacing w:after="0" w:before="0" w:line="360" w:lineRule="auto"/>
-        <w:jc w:val="right"/>
+        <w:spacing w:after="200" w:before="0" w:line="276" w:lineRule="auto"/>
+        <w:jc w:val="left"/>
       </w:pPr>
       <w:r>
         <w:rPr>
           <w:rFonts w:ascii="Times New Roman" w:hAnsi="Times New Roman" w:eastAsia="Times New Roman"/>
           <w:b w:val="0"/>
-          <w:sz w:val="24"/>
+          <w:i w:val="0"/>
+          <w:sz w:val="18"/>
         </w:rPr>
-        <w:t>Выполнил:</w:t>
+        <w:t>(ученая степень, ученое звание)                                             (подпись)                  (инициалы и фамилия)</w:t>
       </w:r>
     </w:p>
     <w:p>
       <w:pPr>
-        <w:spacing w:after="0" w:before="0" w:line="360" w:lineRule="auto"/>
-        <w:jc w:val="right"/>
+        <w:spacing w:after="40" w:before="0" w:line="276" w:lineRule="auto"/>
+        <w:jc w:val="left"/>
       </w:pPr>
       <w:r>
         <w:rPr>
           <w:rFonts w:ascii="Times New Roman" w:hAnsi="Times New Roman" w:eastAsia="Times New Roman"/>
           <w:b w:val="0"/>
+          <w:i w:val="0"/>
           <w:sz w:val="24"/>
         </w:rPr>
-        <w:t>студент группы ИС2-241-ОБ</w:t>
+        <w:t>Ассистент                                                    _________         С.О. Бучнев</w:t>
       </w:r>
     </w:p>
     <w:p>
       <w:pPr>
-        <w:spacing w:after="360" w:before="0" w:line="360" w:lineRule="auto"/>
-        <w:jc w:val="right"/>
+        <w:spacing w:after="480" w:before="0" w:line="276" w:lineRule="auto"/>
+        <w:jc w:val="left"/>
       </w:pPr>
       <w:r>
         <w:rPr>
           <w:rFonts w:ascii="Times New Roman" w:hAnsi="Times New Roman" w:eastAsia="Times New Roman"/>
           <w:b w:val="0"/>
-          <w:sz w:val="24"/>
+          <w:i w:val="0"/>
+          <w:sz w:val="18"/>
         </w:rPr>
-        <w:t>Скопенков А.А.</w:t>
+        <w:t>(ученая степень, ученое звание)                                              (подпись)                  (инициалы и фамилия)</w:t>
       </w:r>
     </w:p>
     <w:p>
       <w:pPr>
-        <w:spacing w:after="0" w:before="0" w:line="360" w:lineRule="auto"/>
-        <w:jc w:val="right"/>
+        <w:spacing w:after="80" w:before="0" w:line="276" w:lineRule="auto"/>
+        <w:jc w:val="center"/>
       </w:pPr>
       <w:r>
         <w:rPr>
           <w:rFonts w:ascii="Times New Roman" w:hAnsi="Times New Roman" w:eastAsia="Times New Roman"/>
           <w:b w:val="0"/>
+          <w:i w:val="0"/>
           <w:sz w:val="24"/>
         </w:rPr>
-        <w:t>Проверил:</w:t>
-      </w:r>
-    </w:p>
-    <w:p>
-      <w:pPr>
-        <w:spacing w:after="480" w:before="0" w:line="360" w:lineRule="auto"/>
-        <w:jc w:val="right"/>
-      </w:pPr>
-      <w:r>
-        <w:rPr>
-          <w:rFonts w:ascii="Times New Roman" w:hAnsi="Times New Roman" w:eastAsia="Times New Roman"/>
-          <w:b w:val="0"/>
-          <w:sz w:val="24"/>
-        </w:rPr>
-        <w:t>преподаватель Луцко Д.П.</w:t>
-      </w:r>
-    </w:p>
-    <w:p>
-      <w:pPr>
-        <w:spacing w:after="0" w:before="0"/>
-      </w:pPr>
-      <w:r>
-        <w:rPr>
-          <w:rFonts w:ascii="Times New Roman" w:hAnsi="Times New Roman" w:eastAsia="Times New Roman"/>
-          <w:b w:val="0"/>
-          <w:sz w:val="24"/>
-        </w:rPr>
-      </w:r>
-    </w:p>
-    <w:p>
-      <w:pPr>
-        <w:spacing w:after="0" w:before="0"/>
-      </w:pPr>
-      <w:r>
-        <w:rPr>
-          <w:rFonts w:ascii="Times New Roman" w:hAnsi="Times New Roman" w:eastAsia="Times New Roman"/>
-          <w:b w:val="0"/>
-          <w:sz w:val="24"/>
-        </w:rPr>
-      </w:r>
-    </w:p>
-    <w:p>
-      <w:pPr>
-        <w:spacing w:after="0" w:before="0"/>
-      </w:pPr>
-      <w:r>
-        <w:rPr>
-          <w:rFonts w:ascii="Times New Roman" w:hAnsi="Times New Roman" w:eastAsia="Times New Roman"/>
-          <w:b w:val="0"/>
-          <w:sz w:val="24"/>
-        </w:rPr>
-      </w:r>
-    </w:p>
-    <w:p>
-      <w:pPr>
-        <w:spacing w:after="120" w:before="240" w:line="360" w:lineRule="auto"/>
-        <w:jc w:val="left"/>
-      </w:pPr>
-      <w:r>
-        <w:rPr>
-          <w:rFonts w:ascii="Times New Roman" w:hAnsi="Times New Roman" w:eastAsia="Times New Roman"/>
-          <w:b/>
-          <w:sz w:val="24"/>
-        </w:rPr>
-        <w:t>Подписи:</w:t>
-      </w:r>
-    </w:p>
-    <w:p>
-      <w:pPr>
-        <w:spacing w:after="0" w:before="0"/>
-      </w:pPr>
-      <w:r>
-        <w:rPr>
-          <w:rFonts w:ascii="Times New Roman" w:hAnsi="Times New Roman" w:eastAsia="Times New Roman"/>
-          <w:b w:val="0"/>
-          <w:sz w:val="24"/>
-        </w:rPr>
-      </w:r>
-    </w:p>
-    <w:p>
-      <w:r>
-        <w:rPr>
-          <w:rFonts w:ascii="Times New Roman" w:hAnsi="Times New Roman" w:eastAsia="Times New Roman"/>
-          <w:b w:val="0"/>
-          <w:sz w:val="24"/>
-        </w:rPr>
-        <w:t>Студент _________________ / Скопенков А.А. /</w:t>
-      </w:r>
-    </w:p>
-    <w:p>
-      <w:r>
-        <w:rPr>
-          <w:rFonts w:ascii="Times New Roman" w:hAnsi="Times New Roman" w:eastAsia="Times New Roman"/>
-          <w:b w:val="0"/>
-          <w:sz w:val="24"/>
-        </w:rPr>
-        <w:t>Преподаватель _________________ / Луцко Д.П. /</w:t>
-      </w:r>
-    </w:p>
-    <w:p>
-      <w:pPr>
-        <w:spacing w:after="0" w:before="0"/>
-      </w:pPr>
-      <w:r>
-        <w:rPr>
-          <w:rFonts w:ascii="Times New Roman" w:hAnsi="Times New Roman" w:eastAsia="Times New Roman"/>
-          <w:b w:val="0"/>
-          <w:sz w:val="24"/>
-        </w:rPr>
-      </w:r>
-    </w:p>
-    <w:p>
-      <w:pPr>
-        <w:spacing w:after="0" w:before="0"/>
-      </w:pPr>
-      <w:r>
-        <w:rPr>
-          <w:rFonts w:ascii="Times New Roman" w:hAnsi="Times New Roman" w:eastAsia="Times New Roman"/>
-          <w:b w:val="0"/>
-          <w:sz w:val="24"/>
-        </w:rPr>
-      </w:r>
-    </w:p>
-    <w:p>
-      <w:pPr>
-        <w:spacing w:after="0" w:before="0"/>
-      </w:pPr>
-      <w:r>
-        <w:rPr>
-          <w:rFonts w:ascii="Times New Roman" w:hAnsi="Times New Roman" w:eastAsia="Times New Roman"/>
-          <w:b w:val="0"/>
-          <w:sz w:val="24"/>
-        </w:rPr>
-      </w:r>
-    </w:p>
-    <w:p>
-      <w:pPr>
-        <w:spacing w:after="0" w:before="0"/>
-      </w:pPr>
-      <w:r>
-        <w:rPr>
-          <w:rFonts w:ascii="Times New Roman" w:hAnsi="Times New Roman" w:eastAsia="Times New Roman"/>
-          <w:b w:val="0"/>
-          <w:sz w:val="24"/>
-        </w:rPr>
-      </w:r>
-    </w:p>
-    <w:p>
-      <w:pPr>
-        <w:spacing w:after="0" w:before="0"/>
-      </w:pPr>
-      <w:r>
-        <w:rPr>
-          <w:rFonts w:ascii="Times New Roman" w:hAnsi="Times New Roman" w:eastAsia="Times New Roman"/>
-          <w:b w:val="0"/>
-          <w:sz w:val="24"/>
-        </w:rPr>
-      </w:r>
-    </w:p>
-    <w:p>
-      <w:pPr>
-        <w:spacing w:after="0" w:before="0"/>
-      </w:pPr>
-      <w:r>
-        <w:rPr>
-          <w:rFonts w:ascii="Times New Roman" w:hAnsi="Times New Roman" w:eastAsia="Times New Roman"/>
-          <w:b w:val="0"/>
-          <w:sz w:val="24"/>
-        </w:rPr>
-      </w:r>
-    </w:p>
-    <w:p>
-      <w:pPr>
-        <w:spacing w:after="120" w:before="0" w:line="360" w:lineRule="auto"/>
-        <w:jc w:val="center"/>
-      </w:pPr>
-      <w:r>
-        <w:rPr>
-          <w:rFonts w:ascii="Times New Roman" w:hAnsi="Times New Roman" w:eastAsia="Times New Roman"/>
-          <w:b/>
-          <w:sz w:val="24"/>
-        </w:rPr>
-        <w:t>2026 г.</w:t>
+        <w:t>Воронеж 2026</w:t>
       </w:r>
     </w:p>
     <w:p>
@@ -385,564 +350,92 @@
     </w:p>
     <w:p>
       <w:pPr>
-        <w:spacing w:after="240" w:before="240" w:line="360" w:lineRule="auto"/>
+        <w:spacing w:after="80" w:before="0" w:line="276" w:lineRule="auto"/>
         <w:jc w:val="center"/>
       </w:pPr>
       <w:r>
         <w:rPr>
           <w:rFonts w:ascii="Times New Roman" w:hAnsi="Times New Roman" w:eastAsia="Times New Roman"/>
           <w:b/>
+          <w:i w:val="0"/>
           <w:sz w:val="28"/>
         </w:rPr>
-        <w:t>1. Цель работы</w:t>
+        <w:t>ОГЛАВЛЕНИЕ</w:t>
       </w:r>
     </w:p>
     <w:p>
       <w:pPr>
-        <w:spacing w:after="120" w:before="0" w:line="360" w:lineRule="auto"/>
-        <w:ind w:firstLine="709"/>
-        <w:jc w:val="both"/>
-      </w:pPr>
-      <w:r>
-        <w:rPr>
-          <w:rFonts w:ascii="Times New Roman" w:hAnsi="Times New Roman" w:eastAsia="Times New Roman"/>
-          <w:b w:val="0"/>
-          <w:sz w:val="24"/>
-        </w:rPr>
-        <w:t>Изучить основы вёрстки одностраничного сайта на чистом HTML и CSS без фреймворков и JavaScript: структура документа, шапка и подвал, якорная навигация, внешние стили и текстово-графический контент.</w:t>
-      </w:r>
-    </w:p>
-    <w:p>
-      <w:pPr>
-        <w:spacing w:after="240" w:before="240" w:line="360" w:lineRule="auto"/>
-        <w:jc w:val="center"/>
-      </w:pPr>
-      <w:r>
-        <w:rPr>
-          <w:rFonts w:ascii="Times New Roman" w:hAnsi="Times New Roman" w:eastAsia="Times New Roman"/>
-          <w:b/>
-          <w:sz w:val="28"/>
-        </w:rPr>
-        <w:t>2. Задание</w:t>
-      </w:r>
-    </w:p>
-    <w:p>
-      <w:pPr>
-        <w:spacing w:after="120" w:before="0" w:line="360" w:lineRule="auto"/>
-        <w:ind w:firstLine="709"/>
-        <w:jc w:val="both"/>
-      </w:pPr>
-      <w:r>
-        <w:rPr>
-          <w:rFonts w:ascii="Times New Roman" w:hAnsi="Times New Roman" w:eastAsia="Times New Roman"/>
-          <w:b w:val="0"/>
-          <w:sz w:val="24"/>
-        </w:rPr>
-        <w:t>Сверстать сайт «Легенды русской поэзии»: index.html, style/style.css, изображения в src/. Нужны шапка и подвал с логотипом и меню, а также четыре секции поэтов (Есенин, Пушкин, Маяковский, Лермонтов) с портретом, фрагментом стиха и ссылкой на Википедию.</w:t>
-      </w:r>
-    </w:p>
-    <w:p>
-      <w:pPr>
-        <w:spacing w:after="240" w:before="240" w:line="360" w:lineRule="auto"/>
-        <w:jc w:val="center"/>
-      </w:pPr>
-      <w:r>
-        <w:rPr>
-          <w:rFonts w:ascii="Times New Roman" w:hAnsi="Times New Roman" w:eastAsia="Times New Roman"/>
-          <w:b/>
-          <w:sz w:val="28"/>
-        </w:rPr>
-        <w:t>3. Описание сайта</w:t>
-      </w:r>
-    </w:p>
-    <w:p>
-      <w:pPr>
-        <w:spacing w:after="120" w:before="0" w:line="360" w:lineRule="auto"/>
-        <w:ind w:firstLine="709"/>
-        <w:jc w:val="both"/>
-      </w:pPr>
-      <w:r>
-        <w:rPr>
-          <w:rFonts w:ascii="Times New Roman" w:hAnsi="Times New Roman" w:eastAsia="Times New Roman"/>
-          <w:b w:val="0"/>
-          <w:sz w:val="24"/>
-        </w:rPr>
-        <w:t>Страница на HTML5 (lang="ru"), title — «Лабораторная работа 1», стили — style/style.css, шрифт Times New Roman. Header и footer с фоном cyan: слева логотип и название, справа меню с якорями #esenin, #pushkin, #mayakovsky, #lermontov.</w:t>
-      </w:r>
-    </w:p>
-    <w:p>
-      <w:pPr>
-        <w:spacing w:after="120" w:before="0" w:line="360" w:lineRule="auto"/>
-        <w:ind w:firstLine="709"/>
-        <w:jc w:val="both"/>
-      </w:pPr>
-      <w:r>
-        <w:rPr>
-          <w:rFonts w:ascii="Times New Roman" w:hAnsi="Times New Roman" w:eastAsia="Times New Roman"/>
-          <w:b w:val="0"/>
-          <w:sz w:val="24"/>
-        </w:rPr>
-        <w:t>В main — четыре секции .poet. Есенин и Маяковский слева; Пушкин и Лермонтов — колонка max-content по центру, текст внутри слева. В каждой секции: h1, h2, портрет 180px, стих и синяя ссылка «Ссылка на страницу википедии» (target="_blank").</w:t>
-      </w:r>
-    </w:p>
-    <w:p>
-      <w:pPr>
-        <w:spacing w:after="240" w:before="240" w:line="360" w:lineRule="auto"/>
-        <w:jc w:val="center"/>
-      </w:pPr>
-      <w:r>
-        <w:rPr>
-          <w:rFonts w:ascii="Times New Roman" w:hAnsi="Times New Roman" w:eastAsia="Times New Roman"/>
-          <w:b/>
-          <w:sz w:val="28"/>
-        </w:rPr>
-        <w:t>4. Скриншоты результата</w:t>
-      </w:r>
-    </w:p>
-    <w:p>
-      <w:pPr>
-        <w:spacing w:after="120" w:before="0" w:line="360" w:lineRule="auto"/>
-        <w:ind w:firstLine="709"/>
-        <w:jc w:val="both"/>
-      </w:pPr>
-      <w:r>
-        <w:rPr>
-          <w:rFonts w:ascii="Times New Roman" w:hAnsi="Times New Roman" w:eastAsia="Times New Roman"/>
-          <w:b w:val="0"/>
-          <w:sz w:val="24"/>
-        </w:rPr>
-        <w:t>Ниже — снимки экрана готовой страницы.</w:t>
-      </w:r>
-    </w:p>
-    <w:p>
-      <w:pPr>
-        <w:jc w:val="center"/>
-      </w:pPr>
-      <w:r>
-        <w:drawing>
-          <wp:inline xmlns:a="http://schemas.openxmlformats.org/drawingml/2006/main" xmlns:pic="http://schemas.openxmlformats.org/drawingml/2006/picture">
-            <wp:extent cx="5580000" cy="2859750"/>
-            <wp:docPr id="1" name="Picture 1"/>
-            <wp:cNvGraphicFramePr>
-              <a:graphicFrameLocks noChangeAspect="1"/>
-            </wp:cNvGraphicFramePr>
-            <a:graphic>
-              <a:graphicData uri="http://schemas.openxmlformats.org/drawingml/2006/picture">
-                <pic:pic>
-                  <pic:nvPicPr>
-                    <pic:cNvPr id="0" name="01_full_top.png"/>
-                    <pic:cNvPicPr/>
-                  </pic:nvPicPr>
-                  <pic:blipFill>
-                    <a:blip r:embed="rId9"/>
-                    <a:stretch>
-                      <a:fillRect/>
-                    </a:stretch>
-                  </pic:blipFill>
-                  <pic:spPr>
-                    <a:xfrm>
-                      <a:off x="0" y="0"/>
-                      <a:ext cx="5580000" cy="2859750"/>
-                    </a:xfrm>
-                    <a:prstGeom prst="rect"/>
-                  </pic:spPr>
-                </pic:pic>
-              </a:graphicData>
-            </a:graphic>
-          </wp:inline>
-        </w:drawing>
-      </w:r>
-    </w:p>
-    <w:p>
-      <w:pPr>
-        <w:spacing w:after="240" w:before="80" w:line="360" w:lineRule="auto"/>
-        <w:jc w:val="center"/>
-      </w:pPr>
-      <w:r>
-        <w:rPr>
-          <w:rFonts w:ascii="Times New Roman" w:hAnsi="Times New Roman" w:eastAsia="Times New Roman"/>
-          <w:b w:val="0"/>
-          <w:sz w:val="22"/>
-        </w:rPr>
-        <w:t>Рисунок 1 — Шапка сайта и секция «Сергей Есенин»</w:t>
-      </w:r>
-    </w:p>
-    <w:p>
-      <w:pPr>
-        <w:jc w:val="center"/>
-      </w:pPr>
-      <w:r>
-        <w:drawing>
-          <wp:inline xmlns:a="http://schemas.openxmlformats.org/drawingml/2006/main" xmlns:pic="http://schemas.openxmlformats.org/drawingml/2006/picture">
-            <wp:extent cx="5580000" cy="2859750"/>
-            <wp:docPr id="2" name="Picture 2"/>
-            <wp:cNvGraphicFramePr>
-              <a:graphicFrameLocks noChangeAspect="1"/>
-            </wp:cNvGraphicFramePr>
-            <a:graphic>
-              <a:graphicData uri="http://schemas.openxmlformats.org/drawingml/2006/picture">
-                <pic:pic>
-                  <pic:nvPicPr>
-                    <pic:cNvPr id="0" name="02_esenin.png"/>
-                    <pic:cNvPicPr/>
-                  </pic:nvPicPr>
-                  <pic:blipFill>
-                    <a:blip r:embed="rId10"/>
-                    <a:stretch>
-                      <a:fillRect/>
-                    </a:stretch>
-                  </pic:blipFill>
-                  <pic:spPr>
-                    <a:xfrm>
-                      <a:off x="0" y="0"/>
-                      <a:ext cx="5580000" cy="2859750"/>
-                    </a:xfrm>
-                    <a:prstGeom prst="rect"/>
-                  </pic:spPr>
-                </pic:pic>
-              </a:graphicData>
-            </a:graphic>
-          </wp:inline>
-        </w:drawing>
-      </w:r>
-    </w:p>
-    <w:p>
-      <w:pPr>
-        <w:spacing w:after="240" w:before="80" w:line="360" w:lineRule="auto"/>
-        <w:jc w:val="center"/>
-      </w:pPr>
-      <w:r>
-        <w:rPr>
-          <w:rFonts w:ascii="Times New Roman" w:hAnsi="Times New Roman" w:eastAsia="Times New Roman"/>
-          <w:b w:val="0"/>
-          <w:sz w:val="22"/>
-        </w:rPr>
-        <w:t>Рисунок 2 — Секция «Сергей Есенин»</w:t>
-      </w:r>
-    </w:p>
-    <w:p>
-      <w:pPr>
-        <w:jc w:val="center"/>
-      </w:pPr>
-      <w:r>
-        <w:drawing>
-          <wp:inline xmlns:a="http://schemas.openxmlformats.org/drawingml/2006/main" xmlns:pic="http://schemas.openxmlformats.org/drawingml/2006/picture">
-            <wp:extent cx="5580000" cy="2859750"/>
-            <wp:docPr id="3" name="Picture 3"/>
-            <wp:cNvGraphicFramePr>
-              <a:graphicFrameLocks noChangeAspect="1"/>
-            </wp:cNvGraphicFramePr>
-            <a:graphic>
-              <a:graphicData uri="http://schemas.openxmlformats.org/drawingml/2006/picture">
-                <pic:pic>
-                  <pic:nvPicPr>
-                    <pic:cNvPr id="0" name="03_pushkin.png"/>
-                    <pic:cNvPicPr/>
-                  </pic:nvPicPr>
-                  <pic:blipFill>
-                    <a:blip r:embed="rId11"/>
-                    <a:stretch>
-                      <a:fillRect/>
-                    </a:stretch>
-                  </pic:blipFill>
-                  <pic:spPr>
-                    <a:xfrm>
-                      <a:off x="0" y="0"/>
-                      <a:ext cx="5580000" cy="2859750"/>
-                    </a:xfrm>
-                    <a:prstGeom prst="rect"/>
-                  </pic:spPr>
-                </pic:pic>
-              </a:graphicData>
-            </a:graphic>
-          </wp:inline>
-        </w:drawing>
-      </w:r>
-    </w:p>
-    <w:p>
-      <w:pPr>
-        <w:spacing w:after="240" w:before="80" w:line="360" w:lineRule="auto"/>
-        <w:jc w:val="center"/>
-      </w:pPr>
-      <w:r>
-        <w:rPr>
-          <w:rFonts w:ascii="Times New Roman" w:hAnsi="Times New Roman" w:eastAsia="Times New Roman"/>
-          <w:b w:val="0"/>
-          <w:sz w:val="22"/>
-        </w:rPr>
-        <w:t>Рисунок 3 — Секция «Александр Пушкин»</w:t>
-      </w:r>
-    </w:p>
-    <w:p>
-      <w:pPr>
-        <w:jc w:val="center"/>
-      </w:pPr>
-      <w:r>
-        <w:drawing>
-          <wp:inline xmlns:a="http://schemas.openxmlformats.org/drawingml/2006/main" xmlns:pic="http://schemas.openxmlformats.org/drawingml/2006/picture">
-            <wp:extent cx="5580000" cy="2859750"/>
-            <wp:docPr id="4" name="Picture 4"/>
-            <wp:cNvGraphicFramePr>
-              <a:graphicFrameLocks noChangeAspect="1"/>
-            </wp:cNvGraphicFramePr>
-            <a:graphic>
-              <a:graphicData uri="http://schemas.openxmlformats.org/drawingml/2006/picture">
-                <pic:pic>
-                  <pic:nvPicPr>
-                    <pic:cNvPr id="0" name="04_mayakovsky.png"/>
-                    <pic:cNvPicPr/>
-                  </pic:nvPicPr>
-                  <pic:blipFill>
-                    <a:blip r:embed="rId12"/>
-                    <a:stretch>
-                      <a:fillRect/>
-                    </a:stretch>
-                  </pic:blipFill>
-                  <pic:spPr>
-                    <a:xfrm>
-                      <a:off x="0" y="0"/>
-                      <a:ext cx="5580000" cy="2859750"/>
-                    </a:xfrm>
-                    <a:prstGeom prst="rect"/>
-                  </pic:spPr>
-                </pic:pic>
-              </a:graphicData>
-            </a:graphic>
-          </wp:inline>
-        </w:drawing>
-      </w:r>
-    </w:p>
-    <w:p>
-      <w:pPr>
-        <w:spacing w:after="240" w:before="80" w:line="360" w:lineRule="auto"/>
-        <w:jc w:val="center"/>
-      </w:pPr>
-      <w:r>
-        <w:rPr>
-          <w:rFonts w:ascii="Times New Roman" w:hAnsi="Times New Roman" w:eastAsia="Times New Roman"/>
-          <w:b w:val="0"/>
-          <w:sz w:val="22"/>
-        </w:rPr>
-        <w:t>Рисунок 4 — Секция «Владимир Маяковский»</w:t>
-      </w:r>
-    </w:p>
-    <w:p>
-      <w:pPr>
-        <w:jc w:val="center"/>
-      </w:pPr>
-      <w:r>
-        <w:drawing>
-          <wp:inline xmlns:a="http://schemas.openxmlformats.org/drawingml/2006/main" xmlns:pic="http://schemas.openxmlformats.org/drawingml/2006/picture">
-            <wp:extent cx="5580000" cy="2859750"/>
-            <wp:docPr id="5" name="Picture 5"/>
-            <wp:cNvGraphicFramePr>
-              <a:graphicFrameLocks noChangeAspect="1"/>
-            </wp:cNvGraphicFramePr>
-            <a:graphic>
-              <a:graphicData uri="http://schemas.openxmlformats.org/drawingml/2006/picture">
-                <pic:pic>
-                  <pic:nvPicPr>
-                    <pic:cNvPr id="0" name="05_lermontov.png"/>
-                    <pic:cNvPicPr/>
-                  </pic:nvPicPr>
-                  <pic:blipFill>
-                    <a:blip r:embed="rId13"/>
-                    <a:stretch>
-                      <a:fillRect/>
-                    </a:stretch>
-                  </pic:blipFill>
-                  <pic:spPr>
-                    <a:xfrm>
-                      <a:off x="0" y="0"/>
-                      <a:ext cx="5580000" cy="2859750"/>
-                    </a:xfrm>
-                    <a:prstGeom prst="rect"/>
-                  </pic:spPr>
-                </pic:pic>
-              </a:graphicData>
-            </a:graphic>
-          </wp:inline>
-        </w:drawing>
-      </w:r>
-    </w:p>
-    <w:p>
-      <w:pPr>
-        <w:spacing w:after="240" w:before="80" w:line="360" w:lineRule="auto"/>
-        <w:jc w:val="center"/>
-      </w:pPr>
-      <w:r>
-        <w:rPr>
-          <w:rFonts w:ascii="Times New Roman" w:hAnsi="Times New Roman" w:eastAsia="Times New Roman"/>
-          <w:b w:val="0"/>
-          <w:sz w:val="22"/>
-        </w:rPr>
-        <w:t>Рисунок 5 — Секция «Михаил Лермонтов» и подвал</w:t>
-      </w:r>
-    </w:p>
-    <w:p>
-      <w:pPr>
-        <w:jc w:val="center"/>
-      </w:pPr>
-      <w:r>
-        <w:drawing>
-          <wp:inline xmlns:a="http://schemas.openxmlformats.org/drawingml/2006/main" xmlns:pic="http://schemas.openxmlformats.org/drawingml/2006/picture">
-            <wp:extent cx="5580000" cy="2859750"/>
-            <wp:docPr id="6" name="Picture 6"/>
-            <wp:cNvGraphicFramePr>
-              <a:graphicFrameLocks noChangeAspect="1"/>
-            </wp:cNvGraphicFramePr>
-            <a:graphic>
-              <a:graphicData uri="http://schemas.openxmlformats.org/drawingml/2006/picture">
-                <pic:pic>
-                  <pic:nvPicPr>
-                    <pic:cNvPr id="0" name="05_lermontov.png"/>
-                    <pic:cNvPicPr/>
-                  </pic:nvPicPr>
-                  <pic:blipFill>
-                    <a:blip r:embed="rId13"/>
-                    <a:stretch>
-                      <a:fillRect/>
-                    </a:stretch>
-                  </pic:blipFill>
-                  <pic:spPr>
-                    <a:xfrm>
-                      <a:off x="0" y="0"/>
-                      <a:ext cx="5580000" cy="2859750"/>
-                    </a:xfrm>
-                    <a:prstGeom prst="rect"/>
-                  </pic:spPr>
-                </pic:pic>
-              </a:graphicData>
-            </a:graphic>
-          </wp:inline>
-        </w:drawing>
-      </w:r>
-    </w:p>
-    <w:p>
-      <w:pPr>
-        <w:spacing w:after="240" w:before="80" w:line="360" w:lineRule="auto"/>
-        <w:jc w:val="center"/>
-      </w:pPr>
-      <w:r>
-        <w:rPr>
-          <w:rFonts w:ascii="Times New Roman" w:hAnsi="Times New Roman" w:eastAsia="Times New Roman"/>
-          <w:b w:val="0"/>
-          <w:sz w:val="22"/>
-        </w:rPr>
-        <w:t>Рисунок 6 — Подвал сайта</w:t>
-      </w:r>
-    </w:p>
-    <w:p>
-      <w:pPr>
-        <w:spacing w:after="240" w:before="240" w:line="360" w:lineRule="auto"/>
-        <w:jc w:val="center"/>
-      </w:pPr>
-      <w:r>
-        <w:rPr>
-          <w:rFonts w:ascii="Times New Roman" w:hAnsi="Times New Roman" w:eastAsia="Times New Roman"/>
-          <w:b/>
-          <w:sz w:val="28"/>
-        </w:rPr>
-        <w:t>5. Вывод</w:t>
-      </w:r>
-    </w:p>
-    <w:p>
-      <w:pPr>
-        <w:spacing w:after="120" w:before="0" w:line="360" w:lineRule="auto"/>
-        <w:ind w:firstLine="709"/>
-        <w:jc w:val="both"/>
-      </w:pPr>
-      <w:r>
-        <w:rPr>
-          <w:rFonts w:ascii="Times New Roman" w:hAnsi="Times New Roman" w:eastAsia="Times New Roman"/>
-          <w:b w:val="0"/>
-          <w:sz w:val="24"/>
-        </w:rPr>
-        <w:t>Создан одностраничный сайт на чистом HTML и CSS: шапка и подвал с якорями, четыре блока поэтов (слева / по центру), внешние стили и изображения. ТЗ выполнено без JavaScript и фреймворков.</w:t>
-      </w:r>
-    </w:p>
-    <w:p>
-      <w:pPr>
-        <w:spacing w:after="0" w:before="0"/>
-      </w:pPr>
-      <w:r>
-        <w:rPr>
-          <w:rFonts w:ascii="Times New Roman" w:hAnsi="Times New Roman" w:eastAsia="Times New Roman"/>
-          <w:b w:val="0"/>
-          <w:sz w:val="24"/>
-        </w:rPr>
-      </w:r>
-    </w:p>
-    <w:p>
-      <w:pPr>
-        <w:spacing w:after="0" w:before="0"/>
-      </w:pPr>
-      <w:r>
-        <w:rPr>
-          <w:rFonts w:ascii="Times New Roman" w:hAnsi="Times New Roman" w:eastAsia="Times New Roman"/>
-          <w:b w:val="0"/>
-          <w:sz w:val="24"/>
-        </w:rPr>
-      </w:r>
-    </w:p>
-    <w:p>
-      <w:pPr>
-        <w:spacing w:after="120" w:before="0" w:line="360" w:lineRule="auto"/>
-        <w:jc w:val="left"/>
-      </w:pPr>
-      <w:r>
-        <w:rPr>
-          <w:rFonts w:ascii="Times New Roman" w:hAnsi="Times New Roman" w:eastAsia="Times New Roman"/>
-          <w:b/>
-          <w:sz w:val="24"/>
-        </w:rPr>
-        <w:t>Подписи:</w:t>
-      </w:r>
-    </w:p>
-    <w:p>
-      <w:pPr>
-        <w:spacing w:after="0" w:before="0"/>
-      </w:pPr>
-      <w:r>
-        <w:rPr>
-          <w:rFonts w:ascii="Times New Roman" w:hAnsi="Times New Roman" w:eastAsia="Times New Roman"/>
-          <w:b w:val="0"/>
-          <w:sz w:val="24"/>
-        </w:rPr>
-      </w:r>
-    </w:p>
-    <w:p>
-      <w:r>
-        <w:rPr>
-          <w:rFonts w:ascii="Times New Roman" w:hAnsi="Times New Roman" w:eastAsia="Times New Roman"/>
-          <w:b w:val="0"/>
-          <w:sz w:val="24"/>
-        </w:rPr>
-        <w:t>Студент _________________ / Скопенков А.А. /</w:t>
-      </w:r>
-    </w:p>
-    <w:p>
-      <w:r>
-        <w:rPr>
-          <w:rFonts w:ascii="Times New Roman" w:hAnsi="Times New Roman" w:eastAsia="Times New Roman"/>
-          <w:b w:val="0"/>
-          <w:sz w:val="24"/>
-        </w:rPr>
-        <w:t>Преподаватель _________________ / Луцко Д.П. /</w:t>
-      </w:r>
-    </w:p>
-    <w:p>
-      <w:pPr>
-        <w:spacing w:after="120" w:before="240" w:line="360" w:lineRule="auto"/>
+        <w:spacing w:after="120" w:before="0" w:line="276" w:lineRule="auto"/>
         <w:jc w:val="left"/>
       </w:pPr>
       <w:r>
         <w:rPr>
           <w:rFonts w:ascii="Times New Roman" w:hAnsi="Times New Roman" w:eastAsia="Times New Roman"/>
           <w:b w:val="0"/>
+          <w:i w:val="0"/>
           <w:sz w:val="24"/>
         </w:rPr>
-        <w:t>Группа: ИС2-241-ОБ</w:t>
+        <w:t>ВВЕДЕНИЕ.............................................................................................................3</w:t>
+      </w:r>
+    </w:p>
+    <w:p>
+      <w:pPr>
+        <w:spacing w:after="120" w:before="0" w:line="276" w:lineRule="auto"/>
+        <w:jc w:val="left"/>
+      </w:pPr>
+      <w:r>
+        <w:rPr>
+          <w:rFonts w:ascii="Times New Roman" w:hAnsi="Times New Roman" w:eastAsia="Times New Roman"/>
+          <w:b w:val="0"/>
+          <w:i w:val="0"/>
+          <w:sz w:val="24"/>
+        </w:rPr>
+        <w:t>Лабораторная работа №1. Основы верстки……………………………………..4</w:t>
+      </w:r>
+    </w:p>
+    <w:p>
+      <w:pPr>
+        <w:spacing w:after="120" w:before="0" w:line="276" w:lineRule="auto"/>
+        <w:jc w:val="left"/>
+      </w:pPr>
+      <w:r>
+        <w:rPr>
+          <w:rFonts w:ascii="Times New Roman" w:hAnsi="Times New Roman" w:eastAsia="Times New Roman"/>
+          <w:b w:val="0"/>
+          <w:i w:val="0"/>
+          <w:sz w:val="24"/>
+        </w:rPr>
+        <w:t>Контрольные вопросы …………………….……………………………………..8</w:t>
+      </w:r>
+    </w:p>
+    <w:p>
+      <w:pPr>
+        <w:spacing w:after="120" w:before="0" w:line="276" w:lineRule="auto"/>
+        <w:jc w:val="left"/>
+      </w:pPr>
+      <w:r>
+        <w:rPr>
+          <w:rFonts w:ascii="Times New Roman" w:hAnsi="Times New Roman" w:eastAsia="Times New Roman"/>
+          <w:b w:val="0"/>
+          <w:i w:val="0"/>
+          <w:sz w:val="24"/>
+        </w:rPr>
+        <w:t>ЗАКЛЮЧЕНИЕ….................................................................................................11</w:t>
+      </w:r>
+    </w:p>
+    <w:p>
+      <w:pPr>
+        <w:spacing w:after="120" w:before="0" w:line="276" w:lineRule="auto"/>
+        <w:jc w:val="left"/>
+      </w:pPr>
+      <w:r>
+        <w:rPr>
+          <w:rFonts w:ascii="Times New Roman" w:hAnsi="Times New Roman" w:eastAsia="Times New Roman"/>
+          <w:b w:val="0"/>
+          <w:i w:val="0"/>
+          <w:sz w:val="24"/>
+        </w:rPr>
+        <w:t>СПИСОК ИСПОЛЬЗУЕМЫХ ИСТОЧНИКОВ….............................................12</w:t>
       </w:r>
     </w:p>
     <w:p>
@@ -952,1626 +445,49 @@
     </w:p>
     <w:p>
       <w:pPr>
-        <w:spacing w:after="240" w:before="240" w:line="360" w:lineRule="auto"/>
+        <w:spacing w:after="80" w:before="0" w:line="276" w:lineRule="auto"/>
         <w:jc w:val="center"/>
       </w:pPr>
       <w:r>
         <w:rPr>
           <w:rFonts w:ascii="Times New Roman" w:hAnsi="Times New Roman" w:eastAsia="Times New Roman"/>
           <w:b/>
+          <w:i w:val="0"/>
           <w:sz w:val="28"/>
         </w:rPr>
-        <w:t>Приложение А. Исходный код HTML (index.html)</w:t>
+        <w:t>ВВЕДЕНИЕ</w:t>
       </w:r>
     </w:p>
     <w:p>
       <w:pPr>
-        <w:spacing w:after="120" w:before="0" w:line="360" w:lineRule="auto"/>
-        <w:jc w:val="left"/>
+        <w:spacing w:after="120" w:before="0" w:line="276" w:lineRule="auto"/>
+        <w:ind w:firstLine="709"/>
+        <w:jc w:val="both"/>
       </w:pPr>
       <w:r>
         <w:rPr>
           <w:rFonts w:ascii="Times New Roman" w:hAnsi="Times New Roman" w:eastAsia="Times New Roman"/>
           <w:b w:val="0"/>
-          <w:sz w:val="24"/>
+          <w:i w:val="0"/>
+          <w:sz w:val="28"/>
         </w:rPr>
-        <w:t>Листинг кода разметки (шрифт 9 пт):</w:t>
+        <w:t>Лабораторный практикум для обучающихся по направлению 09.03.02 – Информационные системы и технологии разработан на кафедре информационных технологий. Данный материал использован для подготовки к выполнению лабораторных работ по курсу «Web-разработка».</w:t>
       </w:r>
     </w:p>
     <w:p>
       <w:pPr>
-        <w:spacing w:after="0" w:before="0" w:line="240" w:lineRule="auto"/>
-        <w:jc w:val="left"/>
+        <w:spacing w:after="120" w:before="0" w:line="276" w:lineRule="auto"/>
+        <w:ind w:firstLine="709"/>
+        <w:jc w:val="both"/>
       </w:pPr>
       <w:r>
         <w:rPr>
-          <w:rFonts w:ascii="Courier New" w:hAnsi="Courier New" w:eastAsia="Courier New"/>
+          <w:rFonts w:ascii="Times New Roman" w:hAnsi="Times New Roman" w:eastAsia="Times New Roman"/>
           <w:b w:val="0"/>
-          <w:sz w:val="18"/>
+          <w:i w:val="0"/>
+          <w:sz w:val="28"/>
         </w:rPr>
-        <w:t>&lt;!DOCTYPE html&gt;</w:t>
-      </w:r>
-    </w:p>
-    <w:p>
-      <w:pPr>
-        <w:spacing w:after="0" w:before="0" w:line="240" w:lineRule="auto"/>
-        <w:jc w:val="left"/>
-      </w:pPr>
-      <w:r>
-        <w:rPr>
-          <w:rFonts w:ascii="Courier New" w:hAnsi="Courier New" w:eastAsia="Courier New"/>
-          <w:b w:val="0"/>
-          <w:sz w:val="18"/>
-        </w:rPr>
-        <w:t>&lt;html lang="ru"&gt;</w:t>
-      </w:r>
-    </w:p>
-    <w:p>
-      <w:pPr>
-        <w:spacing w:after="0" w:before="0" w:line="240" w:lineRule="auto"/>
-        <w:jc w:val="left"/>
-      </w:pPr>
-      <w:r>
-        <w:rPr>
-          <w:rFonts w:ascii="Courier New" w:hAnsi="Courier New" w:eastAsia="Courier New"/>
-          <w:b w:val="0"/>
-          <w:sz w:val="18"/>
-        </w:rPr>
-        <w:t>&lt;head&gt;</w:t>
-      </w:r>
-    </w:p>
-    <w:p>
-      <w:pPr>
-        <w:spacing w:after="0" w:before="0" w:line="240" w:lineRule="auto"/>
-        <w:jc w:val="left"/>
-      </w:pPr>
-      <w:r>
-        <w:rPr>
-          <w:rFonts w:ascii="Courier New" w:hAnsi="Courier New" w:eastAsia="Courier New"/>
-          <w:b w:val="0"/>
-          <w:sz w:val="18"/>
-        </w:rPr>
-        <w:t xml:space="preserve">    &lt;meta charset="UTF-8"&gt;</w:t>
-      </w:r>
-    </w:p>
-    <w:p>
-      <w:pPr>
-        <w:spacing w:after="0" w:before="0" w:line="240" w:lineRule="auto"/>
-        <w:jc w:val="left"/>
-      </w:pPr>
-      <w:r>
-        <w:rPr>
-          <w:rFonts w:ascii="Courier New" w:hAnsi="Courier New" w:eastAsia="Courier New"/>
-          <w:b w:val="0"/>
-          <w:sz w:val="18"/>
-        </w:rPr>
-        <w:t xml:space="preserve">    &lt;meta name="viewport" content="width=device-width, initial-scale=1.0"&gt;</w:t>
-      </w:r>
-    </w:p>
-    <w:p>
-      <w:pPr>
-        <w:spacing w:after="0" w:before="0" w:line="240" w:lineRule="auto"/>
-        <w:jc w:val="left"/>
-      </w:pPr>
-      <w:r>
-        <w:rPr>
-          <w:rFonts w:ascii="Courier New" w:hAnsi="Courier New" w:eastAsia="Courier New"/>
-          <w:b w:val="0"/>
-          <w:sz w:val="18"/>
-        </w:rPr>
-        <w:t xml:space="preserve">    &lt;link rel="stylesheet" href="style/style.css"&gt;</w:t>
-      </w:r>
-    </w:p>
-    <w:p>
-      <w:pPr>
-        <w:spacing w:after="0" w:before="0" w:line="240" w:lineRule="auto"/>
-        <w:jc w:val="left"/>
-      </w:pPr>
-      <w:r>
-        <w:rPr>
-          <w:rFonts w:ascii="Courier New" w:hAnsi="Courier New" w:eastAsia="Courier New"/>
-          <w:b w:val="0"/>
-          <w:sz w:val="18"/>
-        </w:rPr>
-        <w:t xml:space="preserve">    &lt;title&gt;Лабораторная работа 1&lt;/title&gt;</w:t>
-      </w:r>
-    </w:p>
-    <w:p>
-      <w:pPr>
-        <w:spacing w:after="0" w:before="0" w:line="240" w:lineRule="auto"/>
-        <w:jc w:val="left"/>
-      </w:pPr>
-      <w:r>
-        <w:rPr>
-          <w:rFonts w:ascii="Courier New" w:hAnsi="Courier New" w:eastAsia="Courier New"/>
-          <w:b w:val="0"/>
-          <w:sz w:val="18"/>
-        </w:rPr>
-        <w:t>&lt;/head&gt;</w:t>
-      </w:r>
-    </w:p>
-    <w:p>
-      <w:pPr>
-        <w:spacing w:after="0" w:before="0" w:line="240" w:lineRule="auto"/>
-        <w:jc w:val="left"/>
-      </w:pPr>
-      <w:r>
-        <w:rPr>
-          <w:rFonts w:ascii="Courier New" w:hAnsi="Courier New" w:eastAsia="Courier New"/>
-          <w:b w:val="0"/>
-          <w:sz w:val="18"/>
-        </w:rPr>
-        <w:t>&lt;body&gt;</w:t>
-      </w:r>
-    </w:p>
-    <w:p>
-      <w:pPr>
-        <w:spacing w:after="0" w:before="0" w:line="240" w:lineRule="auto"/>
-        <w:jc w:val="left"/>
-      </w:pPr>
-      <w:r>
-        <w:rPr>
-          <w:rFonts w:ascii="Courier New" w:hAnsi="Courier New" w:eastAsia="Courier New"/>
-          <w:b w:val="0"/>
-          <w:sz w:val="18"/>
-        </w:rPr>
-        <w:t xml:space="preserve">    &lt;header&gt;</w:t>
-      </w:r>
-    </w:p>
-    <w:p>
-      <w:pPr>
-        <w:spacing w:after="0" w:before="0" w:line="240" w:lineRule="auto"/>
-        <w:jc w:val="left"/>
-      </w:pPr>
-      <w:r>
-        <w:rPr>
-          <w:rFonts w:ascii="Courier New" w:hAnsi="Courier New" w:eastAsia="Courier New"/>
-          <w:b w:val="0"/>
-          <w:sz w:val="18"/>
-        </w:rPr>
-        <w:t xml:space="preserve">        &lt;div class="container"&gt;</w:t>
-      </w:r>
-    </w:p>
-    <w:p>
-      <w:pPr>
-        <w:spacing w:after="0" w:before="0" w:line="240" w:lineRule="auto"/>
-        <w:jc w:val="left"/>
-      </w:pPr>
-      <w:r>
-        <w:rPr>
-          <w:rFonts w:ascii="Courier New" w:hAnsi="Courier New" w:eastAsia="Courier New"/>
-          <w:b w:val="0"/>
-          <w:sz w:val="18"/>
-        </w:rPr>
-        <w:t xml:space="preserve">            &lt;div class="bloc-img"&gt;</w:t>
-      </w:r>
-    </w:p>
-    <w:p>
-      <w:pPr>
-        <w:spacing w:after="0" w:before="0" w:line="240" w:lineRule="auto"/>
-        <w:jc w:val="left"/>
-      </w:pPr>
-      <w:r>
-        <w:rPr>
-          <w:rFonts w:ascii="Courier New" w:hAnsi="Courier New" w:eastAsia="Courier New"/>
-          <w:b w:val="0"/>
-          <w:sz w:val="18"/>
-        </w:rPr>
-        <w:t xml:space="preserve">                &lt;img src="src/2026-09-07_22-39-20.png" alt="logo"&gt;</w:t>
-      </w:r>
-    </w:p>
-    <w:p>
-      <w:pPr>
-        <w:spacing w:after="0" w:before="0" w:line="240" w:lineRule="auto"/>
-        <w:jc w:val="left"/>
-      </w:pPr>
-      <w:r>
-        <w:rPr>
-          <w:rFonts w:ascii="Courier New" w:hAnsi="Courier New" w:eastAsia="Courier New"/>
-          <w:b w:val="0"/>
-          <w:sz w:val="18"/>
-        </w:rPr>
-        <w:t xml:space="preserve">                &lt;h1 class="logo"&gt;Легенды русской&lt;br&gt;поэзии&lt;/h1&gt;</w:t>
-      </w:r>
-    </w:p>
-    <w:p>
-      <w:pPr>
-        <w:spacing w:after="0" w:before="0" w:line="240" w:lineRule="auto"/>
-        <w:jc w:val="left"/>
-      </w:pPr>
-      <w:r>
-        <w:rPr>
-          <w:rFonts w:ascii="Courier New" w:hAnsi="Courier New" w:eastAsia="Courier New"/>
-          <w:b w:val="0"/>
-          <w:sz w:val="18"/>
-        </w:rPr>
-        <w:t xml:space="preserve">            &lt;/div&gt;</w:t>
-      </w:r>
-    </w:p>
-    <w:p>
-      <w:pPr>
-        <w:spacing w:after="0" w:before="0" w:line="240" w:lineRule="auto"/>
-        <w:jc w:val="left"/>
-      </w:pPr>
-      <w:r>
-        <w:rPr>
-          <w:rFonts w:ascii="Courier New" w:hAnsi="Courier New" w:eastAsia="Courier New"/>
-          <w:b w:val="0"/>
-          <w:sz w:val="18"/>
-        </w:rPr>
-        <w:t xml:space="preserve">            &lt;nav class="nav"&gt;</w:t>
-      </w:r>
-    </w:p>
-    <w:p>
-      <w:pPr>
-        <w:spacing w:after="0" w:before="0" w:line="240" w:lineRule="auto"/>
-        <w:jc w:val="left"/>
-      </w:pPr>
-      <w:r>
-        <w:rPr>
-          <w:rFonts w:ascii="Courier New" w:hAnsi="Courier New" w:eastAsia="Courier New"/>
-          <w:b w:val="0"/>
-          <w:sz w:val="18"/>
-        </w:rPr>
-        <w:t xml:space="preserve">                &lt;ul class="nav-list"&gt;</w:t>
-      </w:r>
-    </w:p>
-    <w:p>
-      <w:pPr>
-        <w:spacing w:after="0" w:before="0" w:line="240" w:lineRule="auto"/>
-        <w:jc w:val="left"/>
-      </w:pPr>
-      <w:r>
-        <w:rPr>
-          <w:rFonts w:ascii="Courier New" w:hAnsi="Courier New" w:eastAsia="Courier New"/>
-          <w:b w:val="0"/>
-          <w:sz w:val="18"/>
-        </w:rPr>
-        <w:t xml:space="preserve">                    &lt;li class="nav-item"&gt;</w:t>
-      </w:r>
-    </w:p>
-    <w:p>
-      <w:pPr>
-        <w:spacing w:after="0" w:before="0" w:line="240" w:lineRule="auto"/>
-        <w:jc w:val="left"/>
-      </w:pPr>
-      <w:r>
-        <w:rPr>
-          <w:rFonts w:ascii="Courier New" w:hAnsi="Courier New" w:eastAsia="Courier New"/>
-          <w:b w:val="0"/>
-          <w:sz w:val="18"/>
-        </w:rPr>
-        <w:t xml:space="preserve">                        &lt;a href="#esenin" class="nav-link"&gt;Есенин&lt;/a&gt;</w:t>
-      </w:r>
-    </w:p>
-    <w:p>
-      <w:pPr>
-        <w:spacing w:after="0" w:before="0" w:line="240" w:lineRule="auto"/>
-        <w:jc w:val="left"/>
-      </w:pPr>
-      <w:r>
-        <w:rPr>
-          <w:rFonts w:ascii="Courier New" w:hAnsi="Courier New" w:eastAsia="Courier New"/>
-          <w:b w:val="0"/>
-          <w:sz w:val="18"/>
-        </w:rPr>
-        <w:t xml:space="preserve">                    &lt;/li&gt;</w:t>
-      </w:r>
-    </w:p>
-    <w:p>
-      <w:pPr>
-        <w:spacing w:after="0" w:before="0" w:line="240" w:lineRule="auto"/>
-        <w:jc w:val="left"/>
-      </w:pPr>
-      <w:r>
-        <w:rPr>
-          <w:rFonts w:ascii="Courier New" w:hAnsi="Courier New" w:eastAsia="Courier New"/>
-          <w:b w:val="0"/>
-          <w:sz w:val="18"/>
-        </w:rPr>
-        <w:t xml:space="preserve">                    &lt;li class="nav-item"&gt;</w:t>
-      </w:r>
-    </w:p>
-    <w:p>
-      <w:pPr>
-        <w:spacing w:after="0" w:before="0" w:line="240" w:lineRule="auto"/>
-        <w:jc w:val="left"/>
-      </w:pPr>
-      <w:r>
-        <w:rPr>
-          <w:rFonts w:ascii="Courier New" w:hAnsi="Courier New" w:eastAsia="Courier New"/>
-          <w:b w:val="0"/>
-          <w:sz w:val="18"/>
-        </w:rPr>
-        <w:t xml:space="preserve">                        &lt;a href="#pushkin" class="nav-link"&gt;Пушкин&lt;/a&gt;</w:t>
-      </w:r>
-    </w:p>
-    <w:p>
-      <w:pPr>
-        <w:spacing w:after="0" w:before="0" w:line="240" w:lineRule="auto"/>
-        <w:jc w:val="left"/>
-      </w:pPr>
-      <w:r>
-        <w:rPr>
-          <w:rFonts w:ascii="Courier New" w:hAnsi="Courier New" w:eastAsia="Courier New"/>
-          <w:b w:val="0"/>
-          <w:sz w:val="18"/>
-        </w:rPr>
-        <w:t xml:space="preserve">                    &lt;/li&gt;</w:t>
-      </w:r>
-    </w:p>
-    <w:p>
-      <w:pPr>
-        <w:spacing w:after="0" w:before="0" w:line="240" w:lineRule="auto"/>
-        <w:jc w:val="left"/>
-      </w:pPr>
-      <w:r>
-        <w:rPr>
-          <w:rFonts w:ascii="Courier New" w:hAnsi="Courier New" w:eastAsia="Courier New"/>
-          <w:b w:val="0"/>
-          <w:sz w:val="18"/>
-        </w:rPr>
-        <w:t xml:space="preserve">                    &lt;li class="nav-item"&gt;</w:t>
-      </w:r>
-    </w:p>
-    <w:p>
-      <w:pPr>
-        <w:spacing w:after="0" w:before="0" w:line="240" w:lineRule="auto"/>
-        <w:jc w:val="left"/>
-      </w:pPr>
-      <w:r>
-        <w:rPr>
-          <w:rFonts w:ascii="Courier New" w:hAnsi="Courier New" w:eastAsia="Courier New"/>
-          <w:b w:val="0"/>
-          <w:sz w:val="18"/>
-        </w:rPr>
-        <w:t xml:space="preserve">                        &lt;a href="#mayakovsky" class="nav-link"&gt;Маяковский&lt;/a&gt;</w:t>
-      </w:r>
-    </w:p>
-    <w:p>
-      <w:pPr>
-        <w:spacing w:after="0" w:before="0" w:line="240" w:lineRule="auto"/>
-        <w:jc w:val="left"/>
-      </w:pPr>
-      <w:r>
-        <w:rPr>
-          <w:rFonts w:ascii="Courier New" w:hAnsi="Courier New" w:eastAsia="Courier New"/>
-          <w:b w:val="0"/>
-          <w:sz w:val="18"/>
-        </w:rPr>
-        <w:t xml:space="preserve">                    &lt;/li&gt;</w:t>
-      </w:r>
-    </w:p>
-    <w:p>
-      <w:pPr>
-        <w:spacing w:after="0" w:before="0" w:line="240" w:lineRule="auto"/>
-        <w:jc w:val="left"/>
-      </w:pPr>
-      <w:r>
-        <w:rPr>
-          <w:rFonts w:ascii="Courier New" w:hAnsi="Courier New" w:eastAsia="Courier New"/>
-          <w:b w:val="0"/>
-          <w:sz w:val="18"/>
-        </w:rPr>
-        <w:t xml:space="preserve">                    &lt;li class="nav-item"&gt;</w:t>
-      </w:r>
-    </w:p>
-    <w:p>
-      <w:pPr>
-        <w:spacing w:after="0" w:before="0" w:line="240" w:lineRule="auto"/>
-        <w:jc w:val="left"/>
-      </w:pPr>
-      <w:r>
-        <w:rPr>
-          <w:rFonts w:ascii="Courier New" w:hAnsi="Courier New" w:eastAsia="Courier New"/>
-          <w:b w:val="0"/>
-          <w:sz w:val="18"/>
-        </w:rPr>
-        <w:t xml:space="preserve">                        &lt;a href="#lermontov" class="nav-link"&gt;Лермонтов&lt;/a&gt;</w:t>
-      </w:r>
-    </w:p>
-    <w:p>
-      <w:pPr>
-        <w:spacing w:after="0" w:before="0" w:line="240" w:lineRule="auto"/>
-        <w:jc w:val="left"/>
-      </w:pPr>
-      <w:r>
-        <w:rPr>
-          <w:rFonts w:ascii="Courier New" w:hAnsi="Courier New" w:eastAsia="Courier New"/>
-          <w:b w:val="0"/>
-          <w:sz w:val="18"/>
-        </w:rPr>
-        <w:t xml:space="preserve">                    &lt;/li&gt;</w:t>
-      </w:r>
-    </w:p>
-    <w:p>
-      <w:pPr>
-        <w:spacing w:after="0" w:before="0" w:line="240" w:lineRule="auto"/>
-        <w:jc w:val="left"/>
-      </w:pPr>
-      <w:r>
-        <w:rPr>
-          <w:rFonts w:ascii="Courier New" w:hAnsi="Courier New" w:eastAsia="Courier New"/>
-          <w:b w:val="0"/>
-          <w:sz w:val="18"/>
-        </w:rPr>
-        <w:t xml:space="preserve">                &lt;/ul&gt;</w:t>
-      </w:r>
-    </w:p>
-    <w:p>
-      <w:pPr>
-        <w:spacing w:after="0" w:before="0" w:line="240" w:lineRule="auto"/>
-        <w:jc w:val="left"/>
-      </w:pPr>
-      <w:r>
-        <w:rPr>
-          <w:rFonts w:ascii="Courier New" w:hAnsi="Courier New" w:eastAsia="Courier New"/>
-          <w:b w:val="0"/>
-          <w:sz w:val="18"/>
-        </w:rPr>
-        <w:t xml:space="preserve">            &lt;/nav&gt;</w:t>
-      </w:r>
-    </w:p>
-    <w:p>
-      <w:pPr>
-        <w:spacing w:after="0" w:before="0" w:line="240" w:lineRule="auto"/>
-        <w:jc w:val="left"/>
-      </w:pPr>
-      <w:r>
-        <w:rPr>
-          <w:rFonts w:ascii="Courier New" w:hAnsi="Courier New" w:eastAsia="Courier New"/>
-          <w:b w:val="0"/>
-          <w:sz w:val="18"/>
-        </w:rPr>
-        <w:t xml:space="preserve">        &lt;/div&gt;</w:t>
-      </w:r>
-    </w:p>
-    <w:p>
-      <w:pPr>
-        <w:spacing w:after="0" w:before="0" w:line="240" w:lineRule="auto"/>
-        <w:jc w:val="left"/>
-      </w:pPr>
-      <w:r>
-        <w:rPr>
-          <w:rFonts w:ascii="Courier New" w:hAnsi="Courier New" w:eastAsia="Courier New"/>
-          <w:b w:val="0"/>
-          <w:sz w:val="18"/>
-        </w:rPr>
-        <w:t xml:space="preserve">    &lt;/header&gt;</w:t>
-      </w:r>
-    </w:p>
-    <w:p>
-      <w:pPr>
-        <w:spacing w:after="0" w:before="0" w:line="240" w:lineRule="auto"/>
-        <w:jc w:val="left"/>
-      </w:pPr>
-      <w:r>
-        <w:rPr>
-          <w:rFonts w:ascii="Courier New" w:hAnsi="Courier New" w:eastAsia="Courier New"/>
-          <w:b w:val="0"/>
-          <w:sz w:val="18"/>
-        </w:rPr>
-        <w:t xml:space="preserve"> </w:t>
-      </w:r>
-    </w:p>
-    <w:p>
-      <w:pPr>
-        <w:spacing w:after="0" w:before="0" w:line="240" w:lineRule="auto"/>
-        <w:jc w:val="left"/>
-      </w:pPr>
-      <w:r>
-        <w:rPr>
-          <w:rFonts w:ascii="Courier New" w:hAnsi="Courier New" w:eastAsia="Courier New"/>
-          <w:b w:val="0"/>
-          <w:sz w:val="18"/>
-        </w:rPr>
-        <w:t xml:space="preserve"> </w:t>
-      </w:r>
-    </w:p>
-    <w:p>
-      <w:pPr>
-        <w:spacing w:after="0" w:before="0" w:line="240" w:lineRule="auto"/>
-        <w:jc w:val="left"/>
-      </w:pPr>
-      <w:r>
-        <w:rPr>
-          <w:rFonts w:ascii="Courier New" w:hAnsi="Courier New" w:eastAsia="Courier New"/>
-          <w:b w:val="0"/>
-          <w:sz w:val="18"/>
-        </w:rPr>
-        <w:t xml:space="preserve">    &lt;!-- main --&gt;</w:t>
-      </w:r>
-    </w:p>
-    <w:p>
-      <w:pPr>
-        <w:spacing w:after="0" w:before="0" w:line="240" w:lineRule="auto"/>
-        <w:jc w:val="left"/>
-      </w:pPr>
-      <w:r>
-        <w:rPr>
-          <w:rFonts w:ascii="Courier New" w:hAnsi="Courier New" w:eastAsia="Courier New"/>
-          <w:b w:val="0"/>
-          <w:sz w:val="18"/>
-        </w:rPr>
-        <w:t xml:space="preserve">    &lt;main class="main"&gt;</w:t>
-      </w:r>
-    </w:p>
-    <w:p>
-      <w:pPr>
-        <w:spacing w:after="0" w:before="0" w:line="240" w:lineRule="auto"/>
-        <w:jc w:val="left"/>
-      </w:pPr>
-      <w:r>
-        <w:rPr>
-          <w:rFonts w:ascii="Courier New" w:hAnsi="Courier New" w:eastAsia="Courier New"/>
-          <w:b w:val="0"/>
-          <w:sz w:val="18"/>
-        </w:rPr>
-        <w:t xml:space="preserve">        &lt;section class="poet" id="esenin"&gt;</w:t>
-      </w:r>
-    </w:p>
-    <w:p>
-      <w:pPr>
-        <w:spacing w:after="0" w:before="0" w:line="240" w:lineRule="auto"/>
-        <w:jc w:val="left"/>
-      </w:pPr>
-      <w:r>
-        <w:rPr>
-          <w:rFonts w:ascii="Courier New" w:hAnsi="Courier New" w:eastAsia="Courier New"/>
-          <w:b w:val="0"/>
-          <w:sz w:val="18"/>
-        </w:rPr>
-        <w:t xml:space="preserve">            &lt;h1&gt;Сергей Есенин&lt;/h1&gt;</w:t>
-      </w:r>
-    </w:p>
-    <w:p>
-      <w:pPr>
-        <w:spacing w:after="0" w:before="0" w:line="240" w:lineRule="auto"/>
-        <w:jc w:val="left"/>
-      </w:pPr>
-      <w:r>
-        <w:rPr>
-          <w:rFonts w:ascii="Courier New" w:hAnsi="Courier New" w:eastAsia="Courier New"/>
-          <w:b w:val="0"/>
-          <w:sz w:val="18"/>
-        </w:rPr>
-        <w:t xml:space="preserve">            &lt;h2&gt;Заметался пожар голубой...&lt;/h2&gt;</w:t>
-      </w:r>
-    </w:p>
-    <w:p>
-      <w:pPr>
-        <w:spacing w:after="0" w:before="0" w:line="240" w:lineRule="auto"/>
-        <w:jc w:val="left"/>
-      </w:pPr>
-      <w:r>
-        <w:rPr>
-          <w:rFonts w:ascii="Courier New" w:hAnsi="Courier New" w:eastAsia="Courier New"/>
-          <w:b w:val="0"/>
-          <w:sz w:val="18"/>
-        </w:rPr>
-        <w:t xml:space="preserve">            &lt;img src="src/2026-09-07_23-01-01.png" alt="Сергей Есенин"&gt;</w:t>
-      </w:r>
-    </w:p>
-    <w:p>
-      <w:pPr>
-        <w:spacing w:after="0" w:before="0" w:line="240" w:lineRule="auto"/>
-        <w:jc w:val="left"/>
-      </w:pPr>
-      <w:r>
-        <w:rPr>
-          <w:rFonts w:ascii="Courier New" w:hAnsi="Courier New" w:eastAsia="Courier New"/>
-          <w:b w:val="0"/>
-          <w:sz w:val="18"/>
-        </w:rPr>
-        <w:t xml:space="preserve">            &lt;p&gt;</w:t>
-      </w:r>
-    </w:p>
-    <w:p>
-      <w:pPr>
-        <w:spacing w:after="0" w:before="0" w:line="240" w:lineRule="auto"/>
-        <w:jc w:val="left"/>
-      </w:pPr>
-      <w:r>
-        <w:rPr>
-          <w:rFonts w:ascii="Courier New" w:hAnsi="Courier New" w:eastAsia="Courier New"/>
-          <w:b w:val="0"/>
-          <w:sz w:val="18"/>
-        </w:rPr>
-        <w:t xml:space="preserve">                Заметался пожар голубой,&lt;br&gt;</w:t>
-      </w:r>
-    </w:p>
-    <w:p>
-      <w:pPr>
-        <w:spacing w:after="0" w:before="0" w:line="240" w:lineRule="auto"/>
-        <w:jc w:val="left"/>
-      </w:pPr>
-      <w:r>
-        <w:rPr>
-          <w:rFonts w:ascii="Courier New" w:hAnsi="Courier New" w:eastAsia="Courier New"/>
-          <w:b w:val="0"/>
-          <w:sz w:val="18"/>
-        </w:rPr>
-        <w:t xml:space="preserve">                Позабылись родимые дали.&lt;br&gt;</w:t>
-      </w:r>
-    </w:p>
-    <w:p>
-      <w:pPr>
-        <w:spacing w:after="0" w:before="0" w:line="240" w:lineRule="auto"/>
-        <w:jc w:val="left"/>
-      </w:pPr>
-      <w:r>
-        <w:rPr>
-          <w:rFonts w:ascii="Courier New" w:hAnsi="Courier New" w:eastAsia="Courier New"/>
-          <w:b w:val="0"/>
-          <w:sz w:val="18"/>
-        </w:rPr>
-        <w:t xml:space="preserve">                В первый раз я запел про любовь,&lt;br&gt;</w:t>
-      </w:r>
-    </w:p>
-    <w:p>
-      <w:pPr>
-        <w:spacing w:after="0" w:before="0" w:line="240" w:lineRule="auto"/>
-        <w:jc w:val="left"/>
-      </w:pPr>
-      <w:r>
-        <w:rPr>
-          <w:rFonts w:ascii="Courier New" w:hAnsi="Courier New" w:eastAsia="Courier New"/>
-          <w:b w:val="0"/>
-          <w:sz w:val="18"/>
-        </w:rPr>
-        <w:t xml:space="preserve">                В первый раз отрекаюсь скандалить.</w:t>
-      </w:r>
-    </w:p>
-    <w:p>
-      <w:pPr>
-        <w:spacing w:after="0" w:before="0" w:line="240" w:lineRule="auto"/>
-        <w:jc w:val="left"/>
-      </w:pPr>
-      <w:r>
-        <w:rPr>
-          <w:rFonts w:ascii="Courier New" w:hAnsi="Courier New" w:eastAsia="Courier New"/>
-          <w:b w:val="0"/>
-          <w:sz w:val="18"/>
-        </w:rPr>
-        <w:t xml:space="preserve">            &lt;/p&gt;</w:t>
-      </w:r>
-    </w:p>
-    <w:p>
-      <w:pPr>
-        <w:spacing w:after="0" w:before="0" w:line="240" w:lineRule="auto"/>
-        <w:jc w:val="left"/>
-      </w:pPr>
-      <w:r>
-        <w:rPr>
-          <w:rFonts w:ascii="Courier New" w:hAnsi="Courier New" w:eastAsia="Courier New"/>
-          <w:b w:val="0"/>
-          <w:sz w:val="18"/>
-        </w:rPr>
-        <w:t xml:space="preserve">            &lt;a href="https://ru.wikipedia.org/wiki/Есенин,_Сергей_Александрович" target="_blank"&gt;</w:t>
-      </w:r>
-    </w:p>
-    <w:p>
-      <w:pPr>
-        <w:spacing w:after="0" w:before="0" w:line="240" w:lineRule="auto"/>
-        <w:jc w:val="left"/>
-      </w:pPr>
-      <w:r>
-        <w:rPr>
-          <w:rFonts w:ascii="Courier New" w:hAnsi="Courier New" w:eastAsia="Courier New"/>
-          <w:b w:val="0"/>
-          <w:sz w:val="18"/>
-        </w:rPr>
-        <w:t xml:space="preserve">                Ссылка на страницу википедии</w:t>
-      </w:r>
-    </w:p>
-    <w:p>
-      <w:pPr>
-        <w:spacing w:after="0" w:before="0" w:line="240" w:lineRule="auto"/>
-        <w:jc w:val="left"/>
-      </w:pPr>
-      <w:r>
-        <w:rPr>
-          <w:rFonts w:ascii="Courier New" w:hAnsi="Courier New" w:eastAsia="Courier New"/>
-          <w:b w:val="0"/>
-          <w:sz w:val="18"/>
-        </w:rPr>
-        <w:t xml:space="preserve">            &lt;/a&gt;</w:t>
-      </w:r>
-    </w:p>
-    <w:p>
-      <w:pPr>
-        <w:spacing w:after="0" w:before="0" w:line="240" w:lineRule="auto"/>
-        <w:jc w:val="left"/>
-      </w:pPr>
-      <w:r>
-        <w:rPr>
-          <w:rFonts w:ascii="Courier New" w:hAnsi="Courier New" w:eastAsia="Courier New"/>
-          <w:b w:val="0"/>
-          <w:sz w:val="18"/>
-        </w:rPr>
-        <w:t xml:space="preserve">        &lt;/section&gt;</w:t>
-      </w:r>
-    </w:p>
-    <w:p>
-      <w:pPr>
-        <w:spacing w:after="0" w:before="0" w:line="240" w:lineRule="auto"/>
-        <w:jc w:val="left"/>
-      </w:pPr>
-      <w:r>
-        <w:rPr>
-          <w:rFonts w:ascii="Courier New" w:hAnsi="Courier New" w:eastAsia="Courier New"/>
-          <w:b w:val="0"/>
-          <w:sz w:val="18"/>
-        </w:rPr>
-        <w:t xml:space="preserve"> </w:t>
-      </w:r>
-    </w:p>
-    <w:p>
-      <w:pPr>
-        <w:spacing w:after="0" w:before="0" w:line="240" w:lineRule="auto"/>
-        <w:jc w:val="left"/>
-      </w:pPr>
-      <w:r>
-        <w:rPr>
-          <w:rFonts w:ascii="Courier New" w:hAnsi="Courier New" w:eastAsia="Courier New"/>
-          <w:b w:val="0"/>
-          <w:sz w:val="18"/>
-        </w:rPr>
-        <w:t xml:space="preserve">        &lt;section class="poet" id="pushkin"&gt;</w:t>
-      </w:r>
-    </w:p>
-    <w:p>
-      <w:pPr>
-        <w:spacing w:after="0" w:before="0" w:line="240" w:lineRule="auto"/>
-        <w:jc w:val="left"/>
-      </w:pPr>
-      <w:r>
-        <w:rPr>
-          <w:rFonts w:ascii="Courier New" w:hAnsi="Courier New" w:eastAsia="Courier New"/>
-          <w:b w:val="0"/>
-          <w:sz w:val="18"/>
-        </w:rPr>
-        <w:t xml:space="preserve">            &lt;h1&gt;Александр Пушкин&lt;/h1&gt;</w:t>
-      </w:r>
-    </w:p>
-    <w:p>
-      <w:pPr>
-        <w:spacing w:after="0" w:before="0" w:line="240" w:lineRule="auto"/>
-        <w:jc w:val="left"/>
-      </w:pPr>
-      <w:r>
-        <w:rPr>
-          <w:rFonts w:ascii="Courier New" w:hAnsi="Courier New" w:eastAsia="Courier New"/>
-          <w:b w:val="0"/>
-          <w:sz w:val="18"/>
-        </w:rPr>
-        <w:t xml:space="preserve">            &lt;h2&gt;У Лукоморья&lt;/h2&gt;</w:t>
-      </w:r>
-    </w:p>
-    <w:p>
-      <w:pPr>
-        <w:spacing w:after="0" w:before="0" w:line="240" w:lineRule="auto"/>
-        <w:jc w:val="left"/>
-      </w:pPr>
-      <w:r>
-        <w:rPr>
-          <w:rFonts w:ascii="Courier New" w:hAnsi="Courier New" w:eastAsia="Courier New"/>
-          <w:b w:val="0"/>
-          <w:sz w:val="18"/>
-        </w:rPr>
-        <w:t xml:space="preserve">            &lt;img src="src/pushkin.jpg" alt="Александр Пушкин"&gt;</w:t>
-      </w:r>
-    </w:p>
-    <w:p>
-      <w:pPr>
-        <w:spacing w:after="0" w:before="0" w:line="240" w:lineRule="auto"/>
-        <w:jc w:val="left"/>
-      </w:pPr>
-      <w:r>
-        <w:rPr>
-          <w:rFonts w:ascii="Courier New" w:hAnsi="Courier New" w:eastAsia="Courier New"/>
-          <w:b w:val="0"/>
-          <w:sz w:val="18"/>
-        </w:rPr>
-        <w:t xml:space="preserve">            &lt;p&gt;</w:t>
-      </w:r>
-    </w:p>
-    <w:p>
-      <w:pPr>
-        <w:spacing w:after="0" w:before="0" w:line="240" w:lineRule="auto"/>
-        <w:jc w:val="left"/>
-      </w:pPr>
-      <w:r>
-        <w:rPr>
-          <w:rFonts w:ascii="Courier New" w:hAnsi="Courier New" w:eastAsia="Courier New"/>
-          <w:b w:val="0"/>
-          <w:sz w:val="18"/>
-        </w:rPr>
-        <w:t xml:space="preserve">                У лукоморья дуб зелёный&lt;br&gt;</w:t>
-      </w:r>
-    </w:p>
-    <w:p>
-      <w:pPr>
-        <w:spacing w:after="0" w:before="0" w:line="240" w:lineRule="auto"/>
-        <w:jc w:val="left"/>
-      </w:pPr>
-      <w:r>
-        <w:rPr>
-          <w:rFonts w:ascii="Courier New" w:hAnsi="Courier New" w:eastAsia="Courier New"/>
-          <w:b w:val="0"/>
-          <w:sz w:val="18"/>
-        </w:rPr>
-        <w:t xml:space="preserve">                Златая цепь на дубе том:&lt;br&gt;</w:t>
-      </w:r>
-    </w:p>
-    <w:p>
-      <w:pPr>
-        <w:spacing w:after="0" w:before="0" w:line="240" w:lineRule="auto"/>
-        <w:jc w:val="left"/>
-      </w:pPr>
-      <w:r>
-        <w:rPr>
-          <w:rFonts w:ascii="Courier New" w:hAnsi="Courier New" w:eastAsia="Courier New"/>
-          <w:b w:val="0"/>
-          <w:sz w:val="18"/>
-        </w:rPr>
-        <w:t xml:space="preserve">                И днём и ночью кот учёный&lt;br&gt;</w:t>
-      </w:r>
-    </w:p>
-    <w:p>
-      <w:pPr>
-        <w:spacing w:after="0" w:before="0" w:line="240" w:lineRule="auto"/>
-        <w:jc w:val="left"/>
-      </w:pPr>
-      <w:r>
-        <w:rPr>
-          <w:rFonts w:ascii="Courier New" w:hAnsi="Courier New" w:eastAsia="Courier New"/>
-          <w:b w:val="0"/>
-          <w:sz w:val="18"/>
-        </w:rPr>
-        <w:t xml:space="preserve">                Всё ходит по цепи кругом;</w:t>
-      </w:r>
-    </w:p>
-    <w:p>
-      <w:pPr>
-        <w:spacing w:after="0" w:before="0" w:line="240" w:lineRule="auto"/>
-        <w:jc w:val="left"/>
-      </w:pPr>
-      <w:r>
-        <w:rPr>
-          <w:rFonts w:ascii="Courier New" w:hAnsi="Courier New" w:eastAsia="Courier New"/>
-          <w:b w:val="0"/>
-          <w:sz w:val="18"/>
-        </w:rPr>
-        <w:t xml:space="preserve">            &lt;/p&gt;</w:t>
-      </w:r>
-    </w:p>
-    <w:p>
-      <w:pPr>
-        <w:spacing w:after="0" w:before="0" w:line="240" w:lineRule="auto"/>
-        <w:jc w:val="left"/>
-      </w:pPr>
-      <w:r>
-        <w:rPr>
-          <w:rFonts w:ascii="Courier New" w:hAnsi="Courier New" w:eastAsia="Courier New"/>
-          <w:b w:val="0"/>
-          <w:sz w:val="18"/>
-        </w:rPr>
-        <w:t xml:space="preserve">            &lt;a href="https://ru.wikipedia.org/wiki/Пушкин,_Александр_Сергеевич" target="_blank"&gt;</w:t>
-      </w:r>
-    </w:p>
-    <w:p>
-      <w:pPr>
-        <w:spacing w:after="0" w:before="0" w:line="240" w:lineRule="auto"/>
-        <w:jc w:val="left"/>
-      </w:pPr>
-      <w:r>
-        <w:rPr>
-          <w:rFonts w:ascii="Courier New" w:hAnsi="Courier New" w:eastAsia="Courier New"/>
-          <w:b w:val="0"/>
-          <w:sz w:val="18"/>
-        </w:rPr>
-        <w:t xml:space="preserve">                Ссылка на страницу википедии</w:t>
-      </w:r>
-    </w:p>
-    <w:p>
-      <w:pPr>
-        <w:spacing w:after="0" w:before="0" w:line="240" w:lineRule="auto"/>
-        <w:jc w:val="left"/>
-      </w:pPr>
-      <w:r>
-        <w:rPr>
-          <w:rFonts w:ascii="Courier New" w:hAnsi="Courier New" w:eastAsia="Courier New"/>
-          <w:b w:val="0"/>
-          <w:sz w:val="18"/>
-        </w:rPr>
-        <w:t xml:space="preserve">            &lt;/a&gt;</w:t>
-      </w:r>
-    </w:p>
-    <w:p>
-      <w:pPr>
-        <w:spacing w:after="0" w:before="0" w:line="240" w:lineRule="auto"/>
-        <w:jc w:val="left"/>
-      </w:pPr>
-      <w:r>
-        <w:rPr>
-          <w:rFonts w:ascii="Courier New" w:hAnsi="Courier New" w:eastAsia="Courier New"/>
-          <w:b w:val="0"/>
-          <w:sz w:val="18"/>
-        </w:rPr>
-        <w:t xml:space="preserve">        &lt;/section&gt;</w:t>
-      </w:r>
-    </w:p>
-    <w:p>
-      <w:pPr>
-        <w:spacing w:after="0" w:before="0" w:line="240" w:lineRule="auto"/>
-        <w:jc w:val="left"/>
-      </w:pPr>
-      <w:r>
-        <w:rPr>
-          <w:rFonts w:ascii="Courier New" w:hAnsi="Courier New" w:eastAsia="Courier New"/>
-          <w:b w:val="0"/>
-          <w:sz w:val="18"/>
-        </w:rPr>
-        <w:t xml:space="preserve"> </w:t>
-      </w:r>
-    </w:p>
-    <w:p>
-      <w:pPr>
-        <w:spacing w:after="0" w:before="0" w:line="240" w:lineRule="auto"/>
-        <w:jc w:val="left"/>
-      </w:pPr>
-      <w:r>
-        <w:rPr>
-          <w:rFonts w:ascii="Courier New" w:hAnsi="Courier New" w:eastAsia="Courier New"/>
-          <w:b w:val="0"/>
-          <w:sz w:val="18"/>
-        </w:rPr>
-        <w:t xml:space="preserve">        &lt;section class="poet" id="mayakovsky"&gt;</w:t>
-      </w:r>
-    </w:p>
-    <w:p>
-      <w:pPr>
-        <w:spacing w:after="0" w:before="0" w:line="240" w:lineRule="auto"/>
-        <w:jc w:val="left"/>
-      </w:pPr>
-      <w:r>
-        <w:rPr>
-          <w:rFonts w:ascii="Courier New" w:hAnsi="Courier New" w:eastAsia="Courier New"/>
-          <w:b w:val="0"/>
-          <w:sz w:val="18"/>
-        </w:rPr>
-        <w:t xml:space="preserve">            &lt;h1&gt;Владимир Маяковский&lt;/h1&gt;</w:t>
-      </w:r>
-    </w:p>
-    <w:p>
-      <w:pPr>
-        <w:spacing w:after="0" w:before="0" w:line="240" w:lineRule="auto"/>
-        <w:jc w:val="left"/>
-      </w:pPr>
-      <w:r>
-        <w:rPr>
-          <w:rFonts w:ascii="Courier New" w:hAnsi="Courier New" w:eastAsia="Courier New"/>
-          <w:b w:val="0"/>
-          <w:sz w:val="18"/>
-        </w:rPr>
-        <w:t xml:space="preserve">            &lt;h2&gt;Стихи о советском паспорте&lt;/h2&gt;</w:t>
-      </w:r>
-    </w:p>
-    <w:p>
-      <w:pPr>
-        <w:spacing w:after="0" w:before="0" w:line="240" w:lineRule="auto"/>
-        <w:jc w:val="left"/>
-      </w:pPr>
-      <w:r>
-        <w:rPr>
-          <w:rFonts w:ascii="Courier New" w:hAnsi="Courier New" w:eastAsia="Courier New"/>
-          <w:b w:val="0"/>
-          <w:sz w:val="18"/>
-        </w:rPr>
-        <w:t xml:space="preserve">            &lt;img src="src/mayakovsky.jpg" alt="Владимир Маяковский"&gt;</w:t>
-      </w:r>
-    </w:p>
-    <w:p>
-      <w:pPr>
-        <w:spacing w:after="0" w:before="0" w:line="240" w:lineRule="auto"/>
-        <w:jc w:val="left"/>
-      </w:pPr>
-      <w:r>
-        <w:rPr>
-          <w:rFonts w:ascii="Courier New" w:hAnsi="Courier New" w:eastAsia="Courier New"/>
-          <w:b w:val="0"/>
-          <w:sz w:val="18"/>
-        </w:rPr>
-        <w:t xml:space="preserve">            &lt;p&gt;</w:t>
-      </w:r>
-    </w:p>
-    <w:p>
-      <w:pPr>
-        <w:spacing w:after="0" w:before="0" w:line="240" w:lineRule="auto"/>
-        <w:jc w:val="left"/>
-      </w:pPr>
-      <w:r>
-        <w:rPr>
-          <w:rFonts w:ascii="Courier New" w:hAnsi="Courier New" w:eastAsia="Courier New"/>
-          <w:b w:val="0"/>
-          <w:sz w:val="18"/>
-        </w:rPr>
-        <w:t xml:space="preserve">                Я волком бы выгрыз&amp;nbsp;&amp;nbsp;&amp;nbsp;&amp;nbsp;&amp;nbsp;&amp;nbsp;&amp;nbsp;&amp;nbsp;бюрократизм.&lt;br&gt;</w:t>
-      </w:r>
-    </w:p>
-    <w:p>
-      <w:pPr>
-        <w:spacing w:after="0" w:before="0" w:line="240" w:lineRule="auto"/>
-        <w:jc w:val="left"/>
-      </w:pPr>
-      <w:r>
-        <w:rPr>
-          <w:rFonts w:ascii="Courier New" w:hAnsi="Courier New" w:eastAsia="Courier New"/>
-          <w:b w:val="0"/>
-          <w:sz w:val="18"/>
-        </w:rPr>
-        <w:t xml:space="preserve">                К мандатам&amp;nbsp;&amp;nbsp;&amp;nbsp;&amp;nbsp;&amp;nbsp;&amp;nbsp;&amp;nbsp;&amp;nbsp;&amp;nbsp;&amp;nbsp;почтения нету.</w:t>
-      </w:r>
-    </w:p>
-    <w:p>
-      <w:pPr>
-        <w:spacing w:after="0" w:before="0" w:line="240" w:lineRule="auto"/>
-        <w:jc w:val="left"/>
-      </w:pPr>
-      <w:r>
-        <w:rPr>
-          <w:rFonts w:ascii="Courier New" w:hAnsi="Courier New" w:eastAsia="Courier New"/>
-          <w:b w:val="0"/>
-          <w:sz w:val="18"/>
-        </w:rPr>
-        <w:t xml:space="preserve">            &lt;/p&gt;</w:t>
-      </w:r>
-    </w:p>
-    <w:p>
-      <w:pPr>
-        <w:spacing w:after="0" w:before="0" w:line="240" w:lineRule="auto"/>
-        <w:jc w:val="left"/>
-      </w:pPr>
-      <w:r>
-        <w:rPr>
-          <w:rFonts w:ascii="Courier New" w:hAnsi="Courier New" w:eastAsia="Courier New"/>
-          <w:b w:val="0"/>
-          <w:sz w:val="18"/>
-        </w:rPr>
-        <w:t xml:space="preserve">            &lt;a href="https://ru.wikipedia.org/wiki/Маяковский,_Владимир_Владимирович" target="_blank"&gt;</w:t>
-      </w:r>
-    </w:p>
-    <w:p>
-      <w:pPr>
-        <w:spacing w:after="0" w:before="0" w:line="240" w:lineRule="auto"/>
-        <w:jc w:val="left"/>
-      </w:pPr>
-      <w:r>
-        <w:rPr>
-          <w:rFonts w:ascii="Courier New" w:hAnsi="Courier New" w:eastAsia="Courier New"/>
-          <w:b w:val="0"/>
-          <w:sz w:val="18"/>
-        </w:rPr>
-        <w:t xml:space="preserve">                Ссылка на страницу википедии</w:t>
-      </w:r>
-    </w:p>
-    <w:p>
-      <w:pPr>
-        <w:spacing w:after="0" w:before="0" w:line="240" w:lineRule="auto"/>
-        <w:jc w:val="left"/>
-      </w:pPr>
-      <w:r>
-        <w:rPr>
-          <w:rFonts w:ascii="Courier New" w:hAnsi="Courier New" w:eastAsia="Courier New"/>
-          <w:b w:val="0"/>
-          <w:sz w:val="18"/>
-        </w:rPr>
-        <w:t xml:space="preserve">            &lt;/a&gt;</w:t>
-      </w:r>
-    </w:p>
-    <w:p>
-      <w:pPr>
-        <w:spacing w:after="0" w:before="0" w:line="240" w:lineRule="auto"/>
-        <w:jc w:val="left"/>
-      </w:pPr>
-      <w:r>
-        <w:rPr>
-          <w:rFonts w:ascii="Courier New" w:hAnsi="Courier New" w:eastAsia="Courier New"/>
-          <w:b w:val="0"/>
-          <w:sz w:val="18"/>
-        </w:rPr>
-        <w:t xml:space="preserve">        &lt;/section&gt;</w:t>
-      </w:r>
-    </w:p>
-    <w:p>
-      <w:pPr>
-        <w:spacing w:after="0" w:before="0" w:line="240" w:lineRule="auto"/>
-        <w:jc w:val="left"/>
-      </w:pPr>
-      <w:r>
-        <w:rPr>
-          <w:rFonts w:ascii="Courier New" w:hAnsi="Courier New" w:eastAsia="Courier New"/>
-          <w:b w:val="0"/>
-          <w:sz w:val="18"/>
-        </w:rPr>
-        <w:t xml:space="preserve"> </w:t>
-      </w:r>
-    </w:p>
-    <w:p>
-      <w:pPr>
-        <w:spacing w:after="0" w:before="0" w:line="240" w:lineRule="auto"/>
-        <w:jc w:val="left"/>
-      </w:pPr>
-      <w:r>
-        <w:rPr>
-          <w:rFonts w:ascii="Courier New" w:hAnsi="Courier New" w:eastAsia="Courier New"/>
-          <w:b w:val="0"/>
-          <w:sz w:val="18"/>
-        </w:rPr>
-        <w:t xml:space="preserve">        &lt;section class="poet" id="lermontov"&gt;</w:t>
-      </w:r>
-    </w:p>
-    <w:p>
-      <w:pPr>
-        <w:spacing w:after="0" w:before="0" w:line="240" w:lineRule="auto"/>
-        <w:jc w:val="left"/>
-      </w:pPr>
-      <w:r>
-        <w:rPr>
-          <w:rFonts w:ascii="Courier New" w:hAnsi="Courier New" w:eastAsia="Courier New"/>
-          <w:b w:val="0"/>
-          <w:sz w:val="18"/>
-        </w:rPr>
-        <w:t xml:space="preserve">            &lt;h1&gt;Михаил Лермонтов&lt;/h1&gt;</w:t>
-      </w:r>
-    </w:p>
-    <w:p>
-      <w:pPr>
-        <w:spacing w:after="0" w:before="0" w:line="240" w:lineRule="auto"/>
-        <w:jc w:val="left"/>
-      </w:pPr>
-      <w:r>
-        <w:rPr>
-          <w:rFonts w:ascii="Courier New" w:hAnsi="Courier New" w:eastAsia="Courier New"/>
-          <w:b w:val="0"/>
-          <w:sz w:val="18"/>
-        </w:rPr>
-        <w:t xml:space="preserve">            &lt;h2&gt;Тучки&lt;/h2&gt;</w:t>
-      </w:r>
-    </w:p>
-    <w:p>
-      <w:pPr>
-        <w:spacing w:after="0" w:before="0" w:line="240" w:lineRule="auto"/>
-        <w:jc w:val="left"/>
-      </w:pPr>
-      <w:r>
-        <w:rPr>
-          <w:rFonts w:ascii="Courier New" w:hAnsi="Courier New" w:eastAsia="Courier New"/>
-          <w:b w:val="0"/>
-          <w:sz w:val="18"/>
-        </w:rPr>
-        <w:t xml:space="preserve">            &lt;img src="src/lermontov.jpg" alt="Михаил Лермонтов"&gt;</w:t>
-      </w:r>
-    </w:p>
-    <w:p>
-      <w:pPr>
-        <w:spacing w:after="0" w:before="0" w:line="240" w:lineRule="auto"/>
-        <w:jc w:val="left"/>
-      </w:pPr>
-      <w:r>
-        <w:rPr>
-          <w:rFonts w:ascii="Courier New" w:hAnsi="Courier New" w:eastAsia="Courier New"/>
-          <w:b w:val="0"/>
-          <w:sz w:val="18"/>
-        </w:rPr>
-        <w:t xml:space="preserve">            &lt;p&gt;</w:t>
-      </w:r>
-    </w:p>
-    <w:p>
-      <w:pPr>
-        <w:spacing w:after="0" w:before="0" w:line="240" w:lineRule="auto"/>
-        <w:jc w:val="left"/>
-      </w:pPr>
-      <w:r>
-        <w:rPr>
-          <w:rFonts w:ascii="Courier New" w:hAnsi="Courier New" w:eastAsia="Courier New"/>
-          <w:b w:val="0"/>
-          <w:sz w:val="18"/>
-        </w:rPr>
-        <w:t xml:space="preserve">                Тучки небесные, вечные странники!&lt;br&gt;</w:t>
-      </w:r>
-    </w:p>
-    <w:p>
-      <w:pPr>
-        <w:spacing w:after="0" w:before="0" w:line="240" w:lineRule="auto"/>
-        <w:jc w:val="left"/>
-      </w:pPr>
-      <w:r>
-        <w:rPr>
-          <w:rFonts w:ascii="Courier New" w:hAnsi="Courier New" w:eastAsia="Courier New"/>
-          <w:b w:val="0"/>
-          <w:sz w:val="18"/>
-        </w:rPr>
-        <w:t xml:space="preserve">                Степью лазурною, цепью жемчужною&lt;br&gt;</w:t>
-      </w:r>
-    </w:p>
-    <w:p>
-      <w:pPr>
-        <w:spacing w:after="0" w:before="0" w:line="240" w:lineRule="auto"/>
-        <w:jc w:val="left"/>
-      </w:pPr>
-      <w:r>
-        <w:rPr>
-          <w:rFonts w:ascii="Courier New" w:hAnsi="Courier New" w:eastAsia="Courier New"/>
-          <w:b w:val="0"/>
-          <w:sz w:val="18"/>
-        </w:rPr>
-        <w:t xml:space="preserve">                Мчитесь вы, будто как я же, изгнанники&lt;br&gt;</w:t>
-      </w:r>
-    </w:p>
-    <w:p>
-      <w:pPr>
-        <w:spacing w:after="0" w:before="0" w:line="240" w:lineRule="auto"/>
-        <w:jc w:val="left"/>
-      </w:pPr>
-      <w:r>
-        <w:rPr>
-          <w:rFonts w:ascii="Courier New" w:hAnsi="Courier New" w:eastAsia="Courier New"/>
-          <w:b w:val="0"/>
-          <w:sz w:val="18"/>
-        </w:rPr>
-        <w:t xml:space="preserve">                С милого севера в сторону южную.</w:t>
-      </w:r>
-    </w:p>
-    <w:p>
-      <w:pPr>
-        <w:spacing w:after="0" w:before="0" w:line="240" w:lineRule="auto"/>
-        <w:jc w:val="left"/>
-      </w:pPr>
-      <w:r>
-        <w:rPr>
-          <w:rFonts w:ascii="Courier New" w:hAnsi="Courier New" w:eastAsia="Courier New"/>
-          <w:b w:val="0"/>
-          <w:sz w:val="18"/>
-        </w:rPr>
-        <w:t xml:space="preserve">            &lt;/p&gt;</w:t>
-      </w:r>
-    </w:p>
-    <w:p>
-      <w:pPr>
-        <w:spacing w:after="0" w:before="0" w:line="240" w:lineRule="auto"/>
-        <w:jc w:val="left"/>
-      </w:pPr>
-      <w:r>
-        <w:rPr>
-          <w:rFonts w:ascii="Courier New" w:hAnsi="Courier New" w:eastAsia="Courier New"/>
-          <w:b w:val="0"/>
-          <w:sz w:val="18"/>
-        </w:rPr>
-        <w:t xml:space="preserve">            &lt;a href="https://ru.wikipedia.org/wiki/Лермонтов,_Михаил_Юрьевич" target="_blank"&gt;</w:t>
-      </w:r>
-    </w:p>
-    <w:p>
-      <w:pPr>
-        <w:spacing w:after="0" w:before="0" w:line="240" w:lineRule="auto"/>
-        <w:jc w:val="left"/>
-      </w:pPr>
-      <w:r>
-        <w:rPr>
-          <w:rFonts w:ascii="Courier New" w:hAnsi="Courier New" w:eastAsia="Courier New"/>
-          <w:b w:val="0"/>
-          <w:sz w:val="18"/>
-        </w:rPr>
-        <w:t xml:space="preserve">                Ссылка на страницу википедии</w:t>
-      </w:r>
-    </w:p>
-    <w:p>
-      <w:pPr>
-        <w:spacing w:after="0" w:before="0" w:line="240" w:lineRule="auto"/>
-        <w:jc w:val="left"/>
-      </w:pPr>
-      <w:r>
-        <w:rPr>
-          <w:rFonts w:ascii="Courier New" w:hAnsi="Courier New" w:eastAsia="Courier New"/>
-          <w:b w:val="0"/>
-          <w:sz w:val="18"/>
-        </w:rPr>
-        <w:t xml:space="preserve">            &lt;/a&gt;</w:t>
-      </w:r>
-    </w:p>
-    <w:p>
-      <w:pPr>
-        <w:spacing w:after="0" w:before="0" w:line="240" w:lineRule="auto"/>
-        <w:jc w:val="left"/>
-      </w:pPr>
-      <w:r>
-        <w:rPr>
-          <w:rFonts w:ascii="Courier New" w:hAnsi="Courier New" w:eastAsia="Courier New"/>
-          <w:b w:val="0"/>
-          <w:sz w:val="18"/>
-        </w:rPr>
-        <w:t xml:space="preserve">        &lt;/section&gt;</w:t>
-      </w:r>
-    </w:p>
-    <w:p>
-      <w:pPr>
-        <w:spacing w:after="0" w:before="0" w:line="240" w:lineRule="auto"/>
-        <w:jc w:val="left"/>
-      </w:pPr>
-      <w:r>
-        <w:rPr>
-          <w:rFonts w:ascii="Courier New" w:hAnsi="Courier New" w:eastAsia="Courier New"/>
-          <w:b w:val="0"/>
-          <w:sz w:val="18"/>
-        </w:rPr>
-        <w:t xml:space="preserve">    &lt;/main&gt;</w:t>
-      </w:r>
-    </w:p>
-    <w:p>
-      <w:pPr>
-        <w:spacing w:after="0" w:before="0" w:line="240" w:lineRule="auto"/>
-        <w:jc w:val="left"/>
-      </w:pPr>
-      <w:r>
-        <w:rPr>
-          <w:rFonts w:ascii="Courier New" w:hAnsi="Courier New" w:eastAsia="Courier New"/>
-          <w:b w:val="0"/>
-          <w:sz w:val="18"/>
-        </w:rPr>
-        <w:t xml:space="preserve"> </w:t>
-      </w:r>
-    </w:p>
-    <w:p>
-      <w:pPr>
-        <w:spacing w:after="0" w:before="0" w:line="240" w:lineRule="auto"/>
-        <w:jc w:val="left"/>
-      </w:pPr>
-      <w:r>
-        <w:rPr>
-          <w:rFonts w:ascii="Courier New" w:hAnsi="Courier New" w:eastAsia="Courier New"/>
-          <w:b w:val="0"/>
-          <w:sz w:val="18"/>
-        </w:rPr>
-        <w:t xml:space="preserve">    &lt;footer&gt;</w:t>
-      </w:r>
-    </w:p>
-    <w:p>
-      <w:pPr>
-        <w:spacing w:after="0" w:before="0" w:line="240" w:lineRule="auto"/>
-        <w:jc w:val="left"/>
-      </w:pPr>
-      <w:r>
-        <w:rPr>
-          <w:rFonts w:ascii="Courier New" w:hAnsi="Courier New" w:eastAsia="Courier New"/>
-          <w:b w:val="0"/>
-          <w:sz w:val="18"/>
-        </w:rPr>
-        <w:t xml:space="preserve">        &lt;div class="container"&gt;</w:t>
-      </w:r>
-    </w:p>
-    <w:p>
-      <w:pPr>
-        <w:spacing w:after="0" w:before="0" w:line="240" w:lineRule="auto"/>
-        <w:jc w:val="left"/>
-      </w:pPr>
-      <w:r>
-        <w:rPr>
-          <w:rFonts w:ascii="Courier New" w:hAnsi="Courier New" w:eastAsia="Courier New"/>
-          <w:b w:val="0"/>
-          <w:sz w:val="18"/>
-        </w:rPr>
-        <w:t xml:space="preserve">            &lt;div class="bloc-img"&gt;</w:t>
-      </w:r>
-    </w:p>
-    <w:p>
-      <w:pPr>
-        <w:spacing w:after="0" w:before="0" w:line="240" w:lineRule="auto"/>
-        <w:jc w:val="left"/>
-      </w:pPr>
-      <w:r>
-        <w:rPr>
-          <w:rFonts w:ascii="Courier New" w:hAnsi="Courier New" w:eastAsia="Courier New"/>
-          <w:b w:val="0"/>
-          <w:sz w:val="18"/>
-        </w:rPr>
-        <w:t xml:space="preserve">                &lt;img src="src/2026-09-07_22-39-20.png" alt="logo"&gt;</w:t>
-      </w:r>
-    </w:p>
-    <w:p>
-      <w:pPr>
-        <w:spacing w:after="0" w:before="0" w:line="240" w:lineRule="auto"/>
-        <w:jc w:val="left"/>
-      </w:pPr>
-      <w:r>
-        <w:rPr>
-          <w:rFonts w:ascii="Courier New" w:hAnsi="Courier New" w:eastAsia="Courier New"/>
-          <w:b w:val="0"/>
-          <w:sz w:val="18"/>
-        </w:rPr>
-        <w:t xml:space="preserve">                &lt;h2 class="logo"&gt;Легенды русской&lt;br&gt;поэзии&lt;/h2&gt;</w:t>
-      </w:r>
-    </w:p>
-    <w:p>
-      <w:pPr>
-        <w:spacing w:after="0" w:before="0" w:line="240" w:lineRule="auto"/>
-        <w:jc w:val="left"/>
-      </w:pPr>
-      <w:r>
-        <w:rPr>
-          <w:rFonts w:ascii="Courier New" w:hAnsi="Courier New" w:eastAsia="Courier New"/>
-          <w:b w:val="0"/>
-          <w:sz w:val="18"/>
-        </w:rPr>
-        <w:t xml:space="preserve">            &lt;/div&gt;</w:t>
-      </w:r>
-    </w:p>
-    <w:p>
-      <w:pPr>
-        <w:spacing w:after="0" w:before="0" w:line="240" w:lineRule="auto"/>
-        <w:jc w:val="left"/>
-      </w:pPr>
-      <w:r>
-        <w:rPr>
-          <w:rFonts w:ascii="Courier New" w:hAnsi="Courier New" w:eastAsia="Courier New"/>
-          <w:b w:val="0"/>
-          <w:sz w:val="18"/>
-        </w:rPr>
-        <w:t xml:space="preserve">            &lt;nav class="nav"&gt;</w:t>
-      </w:r>
-    </w:p>
-    <w:p>
-      <w:pPr>
-        <w:spacing w:after="0" w:before="0" w:line="240" w:lineRule="auto"/>
-        <w:jc w:val="left"/>
-      </w:pPr>
-      <w:r>
-        <w:rPr>
-          <w:rFonts w:ascii="Courier New" w:hAnsi="Courier New" w:eastAsia="Courier New"/>
-          <w:b w:val="0"/>
-          <w:sz w:val="18"/>
-        </w:rPr>
-        <w:t xml:space="preserve">                &lt;ul class="nav-list"&gt;</w:t>
-      </w:r>
-    </w:p>
-    <w:p>
-      <w:pPr>
-        <w:spacing w:after="0" w:before="0" w:line="240" w:lineRule="auto"/>
-        <w:jc w:val="left"/>
-      </w:pPr>
-      <w:r>
-        <w:rPr>
-          <w:rFonts w:ascii="Courier New" w:hAnsi="Courier New" w:eastAsia="Courier New"/>
-          <w:b w:val="0"/>
-          <w:sz w:val="18"/>
-        </w:rPr>
-        <w:t xml:space="preserve">                    &lt;li class="nav-item"&gt;&lt;a href="#esenin" class="nav-link"&gt;Есенин&lt;/a&gt;&lt;/li&gt;</w:t>
-      </w:r>
-    </w:p>
-    <w:p>
-      <w:pPr>
-        <w:spacing w:after="0" w:before="0" w:line="240" w:lineRule="auto"/>
-        <w:jc w:val="left"/>
-      </w:pPr>
-      <w:r>
-        <w:rPr>
-          <w:rFonts w:ascii="Courier New" w:hAnsi="Courier New" w:eastAsia="Courier New"/>
-          <w:b w:val="0"/>
-          <w:sz w:val="18"/>
-        </w:rPr>
-        <w:t xml:space="preserve">                    &lt;li class="nav-item"&gt;&lt;a href="#pushkin" class="nav-link"&gt;Пушкин&lt;/a&gt;&lt;/li&gt;</w:t>
-      </w:r>
-    </w:p>
-    <w:p>
-      <w:pPr>
-        <w:spacing w:after="0" w:before="0" w:line="240" w:lineRule="auto"/>
-        <w:jc w:val="left"/>
-      </w:pPr>
-      <w:r>
-        <w:rPr>
-          <w:rFonts w:ascii="Courier New" w:hAnsi="Courier New" w:eastAsia="Courier New"/>
-          <w:b w:val="0"/>
-          <w:sz w:val="18"/>
-        </w:rPr>
-        <w:t xml:space="preserve">                    &lt;li class="nav-item"&gt;&lt;a href="#mayakovsky" class="nav-link"&gt;Маяковский&lt;/a&gt;&lt;/li&gt;</w:t>
-      </w:r>
-    </w:p>
-    <w:p>
-      <w:pPr>
-        <w:spacing w:after="0" w:before="0" w:line="240" w:lineRule="auto"/>
-        <w:jc w:val="left"/>
-      </w:pPr>
-      <w:r>
-        <w:rPr>
-          <w:rFonts w:ascii="Courier New" w:hAnsi="Courier New" w:eastAsia="Courier New"/>
-          <w:b w:val="0"/>
-          <w:sz w:val="18"/>
-        </w:rPr>
-        <w:t xml:space="preserve">                    &lt;li class="nav-item"&gt;&lt;a href="#lermontov" class="nav-link"&gt;Лермонтов&lt;/a&gt;&lt;/li&gt;</w:t>
-      </w:r>
-    </w:p>
-    <w:p>
-      <w:pPr>
-        <w:spacing w:after="0" w:before="0" w:line="240" w:lineRule="auto"/>
-        <w:jc w:val="left"/>
-      </w:pPr>
-      <w:r>
-        <w:rPr>
-          <w:rFonts w:ascii="Courier New" w:hAnsi="Courier New" w:eastAsia="Courier New"/>
-          <w:b w:val="0"/>
-          <w:sz w:val="18"/>
-        </w:rPr>
-        <w:t xml:space="preserve">                &lt;/ul&gt;</w:t>
-      </w:r>
-    </w:p>
-    <w:p>
-      <w:pPr>
-        <w:spacing w:after="0" w:before="0" w:line="240" w:lineRule="auto"/>
-        <w:jc w:val="left"/>
-      </w:pPr>
-      <w:r>
-        <w:rPr>
-          <w:rFonts w:ascii="Courier New" w:hAnsi="Courier New" w:eastAsia="Courier New"/>
-          <w:b w:val="0"/>
-          <w:sz w:val="18"/>
-        </w:rPr>
-        <w:t xml:space="preserve">            &lt;/nav&gt;</w:t>
-      </w:r>
-    </w:p>
-    <w:p>
-      <w:pPr>
-        <w:spacing w:after="0" w:before="0" w:line="240" w:lineRule="auto"/>
-        <w:jc w:val="left"/>
-      </w:pPr>
-      <w:r>
-        <w:rPr>
-          <w:rFonts w:ascii="Courier New" w:hAnsi="Courier New" w:eastAsia="Courier New"/>
-          <w:b w:val="0"/>
-          <w:sz w:val="18"/>
-        </w:rPr>
-        <w:t xml:space="preserve">        &lt;/div&gt;</w:t>
-      </w:r>
-    </w:p>
-    <w:p>
-      <w:pPr>
-        <w:spacing w:after="0" w:before="0" w:line="240" w:lineRule="auto"/>
-        <w:jc w:val="left"/>
-      </w:pPr>
-      <w:r>
-        <w:rPr>
-          <w:rFonts w:ascii="Courier New" w:hAnsi="Courier New" w:eastAsia="Courier New"/>
-          <w:b w:val="0"/>
-          <w:sz w:val="18"/>
-        </w:rPr>
-        <w:t xml:space="preserve">    &lt;/footer&gt;</w:t>
-      </w:r>
-    </w:p>
-    <w:p>
-      <w:pPr>
-        <w:spacing w:after="0" w:before="0" w:line="240" w:lineRule="auto"/>
-        <w:jc w:val="left"/>
-      </w:pPr>
-      <w:r>
-        <w:rPr>
-          <w:rFonts w:ascii="Courier New" w:hAnsi="Courier New" w:eastAsia="Courier New"/>
-          <w:b w:val="0"/>
-          <w:sz w:val="18"/>
-        </w:rPr>
-        <w:t>&lt;/body&gt;</w:t>
-      </w:r>
-    </w:p>
-    <w:p>
-      <w:pPr>
-        <w:spacing w:after="0" w:before="0" w:line="240" w:lineRule="auto"/>
-        <w:jc w:val="left"/>
-      </w:pPr>
-      <w:r>
-        <w:rPr>
-          <w:rFonts w:ascii="Courier New" w:hAnsi="Courier New" w:eastAsia="Courier New"/>
-          <w:b w:val="0"/>
-          <w:sz w:val="18"/>
-        </w:rPr>
-        <w:t>&lt;/html&gt;</w:t>
+        <w:t>Большое внимание уделено созданию сайтов, применению языков разметки и стилей, а также разработке учебных веб-страниц с использованием HTML и CSS. Каждая лабораторная работа содержит теоретический материал, практическое задание и контрольные вопросы.</w:t>
       </w:r>
     </w:p>
     <w:p>
@@ -2581,1500 +497,399 @@
     </w:p>
     <w:p>
       <w:pPr>
-        <w:spacing w:after="240" w:before="240" w:line="360" w:lineRule="auto"/>
+        <w:spacing w:after="80" w:before="0" w:line="276" w:lineRule="auto"/>
         <w:jc w:val="center"/>
       </w:pPr>
       <w:r>
         <w:rPr>
           <w:rFonts w:ascii="Times New Roman" w:hAnsi="Times New Roman" w:eastAsia="Times New Roman"/>
           <w:b/>
+          <w:i w:val="0"/>
           <w:sz w:val="28"/>
         </w:rPr>
-        <w:t>Приложение Б. Исходный код CSS (style/style.css)</w:t>
+        <w:t>Лабораторная работа №1. Основы верстки</w:t>
       </w:r>
     </w:p>
     <w:p>
       <w:pPr>
-        <w:spacing w:after="120" w:before="0" w:line="360" w:lineRule="auto"/>
+        <w:spacing w:after="120" w:before="0" w:line="276" w:lineRule="auto"/>
+        <w:ind w:firstLine="709"/>
+        <w:jc w:val="both"/>
+      </w:pPr>
+      <w:r>
+        <w:rPr>
+          <w:rFonts w:ascii="Times New Roman" w:hAnsi="Times New Roman" w:eastAsia="Times New Roman"/>
+          <w:b w:val="0"/>
+          <w:i w:val="0"/>
+          <w:sz w:val="28"/>
+        </w:rPr>
+        <w:t>Цель: научиться основам вёрстки web-страницы с применением языка гипертекстовой разметки HTML и каскадных таблиц стилей CSS.</w:t>
+      </w:r>
+    </w:p>
+    <w:p>
+      <w:pPr>
+        <w:spacing w:after="80" w:before="0" w:line="276" w:lineRule="auto"/>
+        <w:jc w:val="both"/>
+      </w:pPr>
+      <w:r>
+        <w:rPr>
+          <w:rFonts w:ascii="Times New Roman" w:hAnsi="Times New Roman" w:eastAsia="Times New Roman"/>
+          <w:b w:val="0"/>
+          <w:i w:val="0"/>
+          <w:sz w:val="28"/>
+        </w:rPr>
+      </w:r>
+    </w:p>
+    <w:p>
+      <w:pPr>
+        <w:spacing w:after="120" w:before="0" w:line="276" w:lineRule="auto"/>
+        <w:jc w:val="left"/>
+      </w:pPr>
+      <w:r>
+        <w:rPr>
+          <w:rFonts w:ascii="Times New Roman" w:hAnsi="Times New Roman" w:eastAsia="Times New Roman"/>
+          <w:b/>
+          <w:i w:val="0"/>
+          <w:sz w:val="28"/>
+        </w:rPr>
+        <w:t>1. Задание</w:t>
+      </w:r>
+    </w:p>
+    <w:p>
+      <w:pPr>
+        <w:spacing w:after="120" w:before="0" w:line="276" w:lineRule="auto"/>
+        <w:ind w:firstLine="709"/>
+        <w:jc w:val="both"/>
+      </w:pPr>
+      <w:r>
+        <w:rPr>
+          <w:rFonts w:ascii="Times New Roman" w:hAnsi="Times New Roman" w:eastAsia="Times New Roman"/>
+          <w:b w:val="0"/>
+          <w:i w:val="0"/>
+          <w:sz w:val="28"/>
+        </w:rPr>
+        <w:t>Создать одностраничный учебный сайт с применением HTML5 и CSS3: шапка и подвал, навигация по якорям, смысловые блоки с текстом и изображениями.</w:t>
+      </w:r>
+    </w:p>
+    <w:p>
+      <w:pPr>
+        <w:spacing w:after="120" w:before="0" w:line="276" w:lineRule="auto"/>
+        <w:jc w:val="left"/>
+      </w:pPr>
+      <w:r>
+        <w:rPr>
+          <w:rFonts w:ascii="Times New Roman" w:hAnsi="Times New Roman" w:eastAsia="Times New Roman"/>
+          <w:b/>
+          <w:i w:val="0"/>
+          <w:sz w:val="28"/>
+        </w:rPr>
+        <w:t>2. Готовый проект сайта</w:t>
+      </w:r>
+    </w:p>
+    <w:p>
+      <w:pPr>
+        <w:spacing w:after="120" w:before="0" w:line="276" w:lineRule="auto"/>
+        <w:ind w:firstLine="709"/>
+        <w:jc w:val="both"/>
+      </w:pPr>
+      <w:r>
+        <w:rPr>
+          <w:rFonts w:ascii="Times New Roman" w:hAnsi="Times New Roman" w:eastAsia="Times New Roman"/>
+          <w:b w:val="0"/>
+          <w:i w:val="0"/>
+          <w:sz w:val="28"/>
+        </w:rPr>
+        <w:t>Сайт «Легенды русской поэзии» — одностраничный ресурс о четырёх поэтах: С. Есенин, А. Пушкин, В. Маяковский, М. Лермонтов. У каждого блока: портрет, фрагмент стихотворения и ссылка на Википедию.</w:t>
+      </w:r>
+    </w:p>
+    <w:p>
+      <w:pPr>
+        <w:spacing w:after="120" w:before="0" w:line="276" w:lineRule="auto"/>
+        <w:jc w:val="left"/>
+      </w:pPr>
+      <w:r>
+        <w:rPr>
+          <w:rFonts w:ascii="Times New Roman" w:hAnsi="Times New Roman" w:eastAsia="Times New Roman"/>
+          <w:b/>
+          <w:i w:val="0"/>
+          <w:sz w:val="28"/>
+        </w:rPr>
+        <w:t>3. Технологии и структура</w:t>
+      </w:r>
+    </w:p>
+    <w:p>
+      <w:pPr>
+        <w:spacing w:after="120" w:before="0" w:line="276" w:lineRule="auto"/>
+        <w:ind w:firstLine="709"/>
+        <w:jc w:val="both"/>
+      </w:pPr>
+      <w:r>
+        <w:rPr>
+          <w:rFonts w:ascii="Times New Roman" w:hAnsi="Times New Roman" w:eastAsia="Times New Roman"/>
+          <w:b w:val="0"/>
+          <w:i w:val="0"/>
+          <w:sz w:val="28"/>
+        </w:rPr>
+        <w:t>HTML5 (index.html), CSS3 (style/style.css), шрифт Times New Roman, без JavaScript. Структура: шапка/подвал с логотипом и якорным меню (#esenin, #pushkin, #mayakovsky, #lermontov); основная часть — четыре секции .poet.</w:t>
+      </w:r>
+    </w:p>
+    <w:p>
+      <w:pPr>
+        <w:spacing w:after="120" w:before="0" w:line="276" w:lineRule="auto"/>
+        <w:jc w:val="left"/>
+      </w:pPr>
+      <w:r>
+        <w:rPr>
+          <w:rFonts w:ascii="Times New Roman" w:hAnsi="Times New Roman" w:eastAsia="Times New Roman"/>
+          <w:b/>
+          <w:i w:val="0"/>
+          <w:sz w:val="28"/>
+        </w:rPr>
+        <w:t>4. Результаты выполнения (код сайта)</w:t>
+      </w:r>
+    </w:p>
+    <w:p>
+      <w:pPr>
+        <w:spacing w:after="120" w:before="0" w:line="276" w:lineRule="auto"/>
+        <w:ind w:firstLine="709"/>
+        <w:jc w:val="both"/>
+      </w:pPr>
+      <w:r>
+        <w:rPr>
+          <w:rFonts w:ascii="Times New Roman" w:hAnsi="Times New Roman" w:eastAsia="Times New Roman"/>
+          <w:b w:val="0"/>
+          <w:i w:val="0"/>
+          <w:sz w:val="28"/>
+        </w:rPr>
+        <w:t>Исходный код размещён в репозитории Web-Design, каталог lab1/ (файлы index.html, style/style.css, изображения в src/).</w:t>
+      </w:r>
+    </w:p>
+    <w:p>
+      <w:pPr>
+        <w:spacing w:after="120" w:before="0" w:line="276" w:lineRule="auto"/>
+        <w:jc w:val="left"/>
+      </w:pPr>
+      <w:r>
+        <w:rPr>
+          <w:rFonts w:ascii="Times New Roman" w:hAnsi="Times New Roman" w:eastAsia="Times New Roman"/>
+          <w:b/>
+          <w:i w:val="0"/>
+          <w:sz w:val="28"/>
+        </w:rPr>
+        <w:t>5. Результат работы сайта</w:t>
+      </w:r>
+    </w:p>
+    <w:p>
+      <w:pPr>
+        <w:spacing w:after="120" w:before="0" w:line="276" w:lineRule="auto"/>
+        <w:ind w:firstLine="709"/>
+        <w:jc w:val="both"/>
+      </w:pPr>
+      <w:r>
+        <w:rPr>
+          <w:rFonts w:ascii="Times New Roman" w:hAnsi="Times New Roman" w:eastAsia="Times New Roman"/>
+          <w:b w:val="0"/>
+          <w:i w:val="0"/>
+          <w:sz w:val="28"/>
+        </w:rPr>
+        <w:t>Страница корректно отображается в браузере; якорная навигация переходит к нужным секциям; стили шапки и подвала согласованы; сайт доступен локально и на GitHub Pages: https://furfantom1331fur.github.io/Web-Design/lab1/</w:t>
+      </w:r>
+    </w:p>
+    <w:p>
+      <w:pPr>
+        <w:spacing w:after="80" w:before="0" w:line="276" w:lineRule="auto"/>
+        <w:jc w:val="both"/>
+      </w:pPr>
+      <w:r>
+        <w:rPr>
+          <w:rFonts w:ascii="Times New Roman" w:hAnsi="Times New Roman" w:eastAsia="Times New Roman"/>
+          <w:b w:val="0"/>
+          <w:i w:val="0"/>
+          <w:sz w:val="28"/>
+        </w:rPr>
+      </w:r>
+    </w:p>
+    <w:p>
+      <w:pPr>
+        <w:spacing w:after="120" w:before="0" w:line="276" w:lineRule="auto"/>
+        <w:jc w:val="left"/>
+      </w:pPr>
+      <w:r>
+        <w:rPr>
+          <w:rFonts w:ascii="Times New Roman" w:hAnsi="Times New Roman" w:eastAsia="Times New Roman"/>
+          <w:b/>
+          <w:i w:val="0"/>
+          <w:sz w:val="28"/>
+        </w:rPr>
+        <w:t>Контрольные вопросы</w:t>
+      </w:r>
+    </w:p>
+    <w:p>
+      <w:pPr>
+        <w:spacing w:after="120" w:before="0" w:line="276" w:lineRule="auto"/>
+        <w:ind w:firstLine="425"/>
         <w:jc w:val="left"/>
       </w:pPr>
       <w:r>
         <w:rPr>
           <w:rFonts w:ascii="Times New Roman" w:hAnsi="Times New Roman" w:eastAsia="Times New Roman"/>
           <w:b w:val="0"/>
-          <w:sz w:val="24"/>
+          <w:i w:val="0"/>
+          <w:sz w:val="28"/>
         </w:rPr>
-        <w:t>Листинг таблицы стилей (шрифт 9 пт):</w:t>
+        <w:t>1. Какие обязательные теги входят в базовую структуру HTML5-документа?</w:t>
       </w:r>
     </w:p>
     <w:p>
       <w:pPr>
-        <w:spacing w:after="0" w:before="0" w:line="240" w:lineRule="auto"/>
+        <w:spacing w:after="120" w:before="0" w:line="276" w:lineRule="auto"/>
+        <w:ind w:firstLine="425"/>
         <w:jc w:val="left"/>
       </w:pPr>
       <w:r>
         <w:rPr>
-          <w:rFonts w:ascii="Courier New" w:hAnsi="Courier New" w:eastAsia="Courier New"/>
+          <w:rFonts w:ascii="Times New Roman" w:hAnsi="Times New Roman" w:eastAsia="Times New Roman"/>
           <w:b w:val="0"/>
-          <w:sz w:val="18"/>
+          <w:i w:val="0"/>
+          <w:sz w:val="28"/>
         </w:rPr>
-        <w:t>* {</w:t>
+        <w:t>2. Для чего нужны элементы &lt;head&gt; и &lt;body&gt;?</w:t>
       </w:r>
     </w:p>
     <w:p>
       <w:pPr>
-        <w:spacing w:after="0" w:before="0" w:line="240" w:lineRule="auto"/>
+        <w:spacing w:after="120" w:before="0" w:line="276" w:lineRule="auto"/>
+        <w:ind w:firstLine="425"/>
         <w:jc w:val="left"/>
       </w:pPr>
       <w:r>
         <w:rPr>
-          <w:rFonts w:ascii="Courier New" w:hAnsi="Courier New" w:eastAsia="Courier New"/>
+          <w:rFonts w:ascii="Times New Roman" w:hAnsi="Times New Roman" w:eastAsia="Times New Roman"/>
           <w:b w:val="0"/>
-          <w:sz w:val="18"/>
+          <w:i w:val="0"/>
+          <w:sz w:val="28"/>
         </w:rPr>
-        <w:t xml:space="preserve">    margin: 0;</w:t>
+        <w:t>3. Как подключить внешний файл стилей CSS?</w:t>
       </w:r>
     </w:p>
     <w:p>
       <w:pPr>
-        <w:spacing w:after="0" w:before="0" w:line="240" w:lineRule="auto"/>
+        <w:spacing w:after="120" w:before="0" w:line="276" w:lineRule="auto"/>
+        <w:ind w:firstLine="425"/>
         <w:jc w:val="left"/>
       </w:pPr>
       <w:r>
         <w:rPr>
-          <w:rFonts w:ascii="Courier New" w:hAnsi="Courier New" w:eastAsia="Courier New"/>
+          <w:rFonts w:ascii="Times New Roman" w:hAnsi="Times New Roman" w:eastAsia="Times New Roman"/>
           <w:b w:val="0"/>
-          <w:sz w:val="18"/>
+          <w:i w:val="0"/>
+          <w:sz w:val="28"/>
         </w:rPr>
-        <w:t xml:space="preserve">    padding: 0;</w:t>
+        <w:t>4. Чем отличается блочный элемент от строчного?</w:t>
       </w:r>
     </w:p>
     <w:p>
       <w:pPr>
-        <w:spacing w:after="0" w:before="0" w:line="240" w:lineRule="auto"/>
+        <w:spacing w:after="120" w:before="0" w:line="276" w:lineRule="auto"/>
+        <w:ind w:firstLine="425"/>
         <w:jc w:val="left"/>
       </w:pPr>
       <w:r>
         <w:rPr>
-          <w:rFonts w:ascii="Courier New" w:hAnsi="Courier New" w:eastAsia="Courier New"/>
+          <w:rFonts w:ascii="Times New Roman" w:hAnsi="Times New Roman" w:eastAsia="Times New Roman"/>
           <w:b w:val="0"/>
-          <w:sz w:val="18"/>
+          <w:i w:val="0"/>
+          <w:sz w:val="28"/>
         </w:rPr>
-        <w:t xml:space="preserve">    box-sizing: border-box;</w:t>
+        <w:t>5. Как организовать навигацию по разделам одной страницы с помощью якорей?</w:t>
+      </w:r>
+    </w:p>
+    <w:p>
+      <w:r>
+        <w:br w:type="page"/>
       </w:r>
     </w:p>
     <w:p>
       <w:pPr>
-        <w:spacing w:after="0" w:before="0" w:line="240" w:lineRule="auto"/>
+        <w:spacing w:after="80" w:before="0" w:line="276" w:lineRule="auto"/>
+        <w:jc w:val="center"/>
+      </w:pPr>
+      <w:r>
+        <w:rPr>
+          <w:rFonts w:ascii="Times New Roman" w:hAnsi="Times New Roman" w:eastAsia="Times New Roman"/>
+          <w:b/>
+          <w:i w:val="0"/>
+          <w:sz w:val="28"/>
+        </w:rPr>
+        <w:t>ЗАКЛЮЧЕНИЕ</w:t>
+      </w:r>
+    </w:p>
+    <w:p>
+      <w:pPr>
+        <w:spacing w:after="120" w:before="0" w:line="276" w:lineRule="auto"/>
+        <w:ind w:firstLine="709"/>
+        <w:jc w:val="both"/>
+      </w:pPr>
+      <w:r>
+        <w:rPr>
+          <w:rFonts w:ascii="Times New Roman" w:hAnsi="Times New Roman" w:eastAsia="Times New Roman"/>
+          <w:b w:val="0"/>
+          <w:i w:val="0"/>
+          <w:sz w:val="28"/>
+        </w:rPr>
+        <w:t>В ходе выполнения лабораторной работы № 1 разработан одностраничный сайт «Легенды русской поэзии» на чистом HTML и CSS. Получен практический опыт разметки секций, оформления шапки/подвала и якорной навигации. Поставленная цель — освоить основы вёрстки с применением HTML и CSS — достигнута.</w:t>
+      </w:r>
+    </w:p>
+    <w:p>
+      <w:r>
+        <w:br w:type="page"/>
+      </w:r>
+    </w:p>
+    <w:p>
+      <w:pPr>
+        <w:spacing w:after="80" w:before="0" w:line="276" w:lineRule="auto"/>
+        <w:jc w:val="center"/>
+      </w:pPr>
+      <w:r>
+        <w:rPr>
+          <w:rFonts w:ascii="Times New Roman" w:hAnsi="Times New Roman" w:eastAsia="Times New Roman"/>
+          <w:b/>
+          <w:i w:val="0"/>
+          <w:sz w:val="28"/>
+        </w:rPr>
+        <w:t>СПИСОК ИСПОЛЬЗУЕМЫХ ИСТОЧНИКОВ</w:t>
+      </w:r>
+    </w:p>
+    <w:p>
+      <w:pPr>
+        <w:spacing w:after="120" w:before="0" w:line="276" w:lineRule="auto"/>
+        <w:ind w:firstLine="0"/>
         <w:jc w:val="left"/>
       </w:pPr>
       <w:r>
         <w:rPr>
-          <w:rFonts w:ascii="Courier New" w:hAnsi="Courier New" w:eastAsia="Courier New"/>
+          <w:rFonts w:ascii="Times New Roman" w:hAnsi="Times New Roman" w:eastAsia="Times New Roman"/>
           <w:b w:val="0"/>
-          <w:sz w:val="18"/>
+          <w:i w:val="0"/>
+          <w:sz w:val="28"/>
         </w:rPr>
-        <w:t>}</w:t>
+        <w:t>1. Web-разработка [Электронный ресурс]: лабораторный практикум / А.А. Андрюшин, А.С. Ягодкин; М-во науки и высшего образования РФ, ФГБОУ ВО «ВГЛТУ им. Г.Ф. Морозова». – Воронеж, 2024. – 133 с.</w:t>
       </w:r>
     </w:p>
     <w:p>
       <w:pPr>
-        <w:spacing w:after="0" w:before="0" w:line="240" w:lineRule="auto"/>
+        <w:spacing w:after="120" w:before="0" w:line="276" w:lineRule="auto"/>
+        <w:ind w:firstLine="0"/>
         <w:jc w:val="left"/>
       </w:pPr>
       <w:r>
         <w:rPr>
-          <w:rFonts w:ascii="Courier New" w:hAnsi="Courier New" w:eastAsia="Courier New"/>
+          <w:rFonts w:ascii="Times New Roman" w:hAnsi="Times New Roman" w:eastAsia="Times New Roman"/>
           <w:b w:val="0"/>
-          <w:sz w:val="18"/>
+          <w:i w:val="0"/>
+          <w:sz w:val="28"/>
         </w:rPr>
-        <w:t xml:space="preserve"> </w:t>
-      </w:r>
-    </w:p>
-    <w:p>
-      <w:pPr>
-        <w:spacing w:after="0" w:before="0" w:line="240" w:lineRule="auto"/>
-        <w:jc w:val="left"/>
-      </w:pPr>
-      <w:r>
-        <w:rPr>
-          <w:rFonts w:ascii="Courier New" w:hAnsi="Courier New" w:eastAsia="Courier New"/>
-          <w:b w:val="0"/>
-          <w:sz w:val="18"/>
-        </w:rPr>
-        <w:t>body {</w:t>
-      </w:r>
-    </w:p>
-    <w:p>
-      <w:pPr>
-        <w:spacing w:after="0" w:before="0" w:line="240" w:lineRule="auto"/>
-        <w:jc w:val="left"/>
-      </w:pPr>
-      <w:r>
-        <w:rPr>
-          <w:rFonts w:ascii="Courier New" w:hAnsi="Courier New" w:eastAsia="Courier New"/>
-          <w:b w:val="0"/>
-          <w:sz w:val="18"/>
-        </w:rPr>
-        <w:t xml:space="preserve">    font-family: "Times New Roman", Times, serif;</w:t>
-      </w:r>
-    </w:p>
-    <w:p>
-      <w:pPr>
-        <w:spacing w:after="0" w:before="0" w:line="240" w:lineRule="auto"/>
-        <w:jc w:val="left"/>
-      </w:pPr>
-      <w:r>
-        <w:rPr>
-          <w:rFonts w:ascii="Courier New" w:hAnsi="Courier New" w:eastAsia="Courier New"/>
-          <w:b w:val="0"/>
-          <w:sz w:val="18"/>
-        </w:rPr>
-        <w:t>}</w:t>
-      </w:r>
-    </w:p>
-    <w:p>
-      <w:pPr>
-        <w:spacing w:after="0" w:before="0" w:line="240" w:lineRule="auto"/>
-        <w:jc w:val="left"/>
-      </w:pPr>
-      <w:r>
-        <w:rPr>
-          <w:rFonts w:ascii="Courier New" w:hAnsi="Courier New" w:eastAsia="Courier New"/>
-          <w:b w:val="0"/>
-          <w:sz w:val="18"/>
-        </w:rPr>
-        <w:t xml:space="preserve"> </w:t>
-      </w:r>
-    </w:p>
-    <w:p>
-      <w:pPr>
-        <w:spacing w:after="0" w:before="0" w:line="240" w:lineRule="auto"/>
-        <w:jc w:val="left"/>
-      </w:pPr>
-      <w:r>
-        <w:rPr>
-          <w:rFonts w:ascii="Courier New" w:hAnsi="Courier New" w:eastAsia="Courier New"/>
-          <w:b w:val="0"/>
-          <w:sz w:val="18"/>
-        </w:rPr>
-        <w:t>header,</w:t>
-      </w:r>
-    </w:p>
-    <w:p>
-      <w:pPr>
-        <w:spacing w:after="0" w:before="0" w:line="240" w:lineRule="auto"/>
-        <w:jc w:val="left"/>
-      </w:pPr>
-      <w:r>
-        <w:rPr>
-          <w:rFonts w:ascii="Courier New" w:hAnsi="Courier New" w:eastAsia="Courier New"/>
-          <w:b w:val="0"/>
-          <w:sz w:val="18"/>
-        </w:rPr>
-        <w:t>footer {</w:t>
-      </w:r>
-    </w:p>
-    <w:p>
-      <w:pPr>
-        <w:spacing w:after="0" w:before="0" w:line="240" w:lineRule="auto"/>
-        <w:jc w:val="left"/>
-      </w:pPr>
-      <w:r>
-        <w:rPr>
-          <w:rFonts w:ascii="Courier New" w:hAnsi="Courier New" w:eastAsia="Courier New"/>
-          <w:b w:val="0"/>
-          <w:sz w:val="18"/>
-        </w:rPr>
-        <w:t xml:space="preserve">    background-color: cyan;</w:t>
-      </w:r>
-    </w:p>
-    <w:p>
-      <w:pPr>
-        <w:spacing w:after="0" w:before="0" w:line="240" w:lineRule="auto"/>
-        <w:jc w:val="left"/>
-      </w:pPr>
-      <w:r>
-        <w:rPr>
-          <w:rFonts w:ascii="Courier New" w:hAnsi="Courier New" w:eastAsia="Courier New"/>
-          <w:b w:val="0"/>
-          <w:sz w:val="18"/>
-        </w:rPr>
-        <w:t>}</w:t>
-      </w:r>
-    </w:p>
-    <w:p>
-      <w:pPr>
-        <w:spacing w:after="0" w:before="0" w:line="240" w:lineRule="auto"/>
-        <w:jc w:val="left"/>
-      </w:pPr>
-      <w:r>
-        <w:rPr>
-          <w:rFonts w:ascii="Courier New" w:hAnsi="Courier New" w:eastAsia="Courier New"/>
-          <w:b w:val="0"/>
-          <w:sz w:val="18"/>
-        </w:rPr>
-        <w:t xml:space="preserve"> </w:t>
-      </w:r>
-    </w:p>
-    <w:p>
-      <w:pPr>
-        <w:spacing w:after="0" w:before="0" w:line="240" w:lineRule="auto"/>
-        <w:jc w:val="left"/>
-      </w:pPr>
-      <w:r>
-        <w:rPr>
-          <w:rFonts w:ascii="Courier New" w:hAnsi="Courier New" w:eastAsia="Courier New"/>
-          <w:b w:val="0"/>
-          <w:sz w:val="18"/>
-        </w:rPr>
-        <w:t>.container {</w:t>
-      </w:r>
-    </w:p>
-    <w:p>
-      <w:pPr>
-        <w:spacing w:after="0" w:before="0" w:line="240" w:lineRule="auto"/>
-        <w:jc w:val="left"/>
-      </w:pPr>
-      <w:r>
-        <w:rPr>
-          <w:rFonts w:ascii="Courier New" w:hAnsi="Courier New" w:eastAsia="Courier New"/>
-          <w:b w:val="0"/>
-          <w:sz w:val="18"/>
-        </w:rPr>
-        <w:t xml:space="preserve">    display: flex;</w:t>
-      </w:r>
-    </w:p>
-    <w:p>
-      <w:pPr>
-        <w:spacing w:after="0" w:before="0" w:line="240" w:lineRule="auto"/>
-        <w:jc w:val="left"/>
-      </w:pPr>
-      <w:r>
-        <w:rPr>
-          <w:rFonts w:ascii="Courier New" w:hAnsi="Courier New" w:eastAsia="Courier New"/>
-          <w:b w:val="0"/>
-          <w:sz w:val="18"/>
-        </w:rPr>
-        <w:t xml:space="preserve">    justify-content: space-between; /* логотип слева, меню справа */</w:t>
-      </w:r>
-    </w:p>
-    <w:p>
-      <w:pPr>
-        <w:spacing w:after="0" w:before="0" w:line="240" w:lineRule="auto"/>
-        <w:jc w:val="left"/>
-      </w:pPr>
-      <w:r>
-        <w:rPr>
-          <w:rFonts w:ascii="Courier New" w:hAnsi="Courier New" w:eastAsia="Courier New"/>
-          <w:b w:val="0"/>
-          <w:sz w:val="18"/>
-        </w:rPr>
-        <w:t xml:space="preserve">    align-items: center;</w:t>
-      </w:r>
-    </w:p>
-    <w:p>
-      <w:pPr>
-        <w:spacing w:after="0" w:before="0" w:line="240" w:lineRule="auto"/>
-        <w:jc w:val="left"/>
-      </w:pPr>
-      <w:r>
-        <w:rPr>
-          <w:rFonts w:ascii="Courier New" w:hAnsi="Courier New" w:eastAsia="Courier New"/>
-          <w:b w:val="0"/>
-          <w:sz w:val="18"/>
-        </w:rPr>
-        <w:t xml:space="preserve">    padding: 16px 40px;</w:t>
-      </w:r>
-    </w:p>
-    <w:p>
-      <w:pPr>
-        <w:spacing w:after="0" w:before="0" w:line="240" w:lineRule="auto"/>
-        <w:jc w:val="left"/>
-      </w:pPr>
-      <w:r>
-        <w:rPr>
-          <w:rFonts w:ascii="Courier New" w:hAnsi="Courier New" w:eastAsia="Courier New"/>
-          <w:b w:val="0"/>
-          <w:sz w:val="18"/>
-        </w:rPr>
-        <w:t>}</w:t>
-      </w:r>
-    </w:p>
-    <w:p>
-      <w:pPr>
-        <w:spacing w:after="0" w:before="0" w:line="240" w:lineRule="auto"/>
-        <w:jc w:val="left"/>
-      </w:pPr>
-      <w:r>
-        <w:rPr>
-          <w:rFonts w:ascii="Courier New" w:hAnsi="Courier New" w:eastAsia="Courier New"/>
-          <w:b w:val="0"/>
-          <w:sz w:val="18"/>
-        </w:rPr>
-        <w:t xml:space="preserve"> </w:t>
-      </w:r>
-    </w:p>
-    <w:p>
-      <w:pPr>
-        <w:spacing w:after="0" w:before="0" w:line="240" w:lineRule="auto"/>
-        <w:jc w:val="left"/>
-      </w:pPr>
-      <w:r>
-        <w:rPr>
-          <w:rFonts w:ascii="Courier New" w:hAnsi="Courier New" w:eastAsia="Courier New"/>
-          <w:b w:val="0"/>
-          <w:sz w:val="18"/>
-        </w:rPr>
-        <w:t>/* левый блок: картинка + название */</w:t>
-      </w:r>
-    </w:p>
-    <w:p>
-      <w:pPr>
-        <w:spacing w:after="0" w:before="0" w:line="240" w:lineRule="auto"/>
-        <w:jc w:val="left"/>
-      </w:pPr>
-      <w:r>
-        <w:rPr>
-          <w:rFonts w:ascii="Courier New" w:hAnsi="Courier New" w:eastAsia="Courier New"/>
-          <w:b w:val="0"/>
-          <w:sz w:val="18"/>
-        </w:rPr>
-        <w:t>.bloc-img {</w:t>
-      </w:r>
-    </w:p>
-    <w:p>
-      <w:pPr>
-        <w:spacing w:after="0" w:before="0" w:line="240" w:lineRule="auto"/>
-        <w:jc w:val="left"/>
-      </w:pPr>
-      <w:r>
-        <w:rPr>
-          <w:rFonts w:ascii="Courier New" w:hAnsi="Courier New" w:eastAsia="Courier New"/>
-          <w:b w:val="0"/>
-          <w:sz w:val="18"/>
-        </w:rPr>
-        <w:t xml:space="preserve">    display: flex;</w:t>
-      </w:r>
-    </w:p>
-    <w:p>
-      <w:pPr>
-        <w:spacing w:after="0" w:before="0" w:line="240" w:lineRule="auto"/>
-        <w:jc w:val="left"/>
-      </w:pPr>
-      <w:r>
-        <w:rPr>
-          <w:rFonts w:ascii="Courier New" w:hAnsi="Courier New" w:eastAsia="Courier New"/>
-          <w:b w:val="0"/>
-          <w:sz w:val="18"/>
-        </w:rPr>
-        <w:t xml:space="preserve">    align-items: center;</w:t>
-      </w:r>
-    </w:p>
-    <w:p>
-      <w:pPr>
-        <w:spacing w:after="0" w:before="0" w:line="240" w:lineRule="auto"/>
-        <w:jc w:val="left"/>
-      </w:pPr>
-      <w:r>
-        <w:rPr>
-          <w:rFonts w:ascii="Courier New" w:hAnsi="Courier New" w:eastAsia="Courier New"/>
-          <w:b w:val="0"/>
-          <w:sz w:val="18"/>
-        </w:rPr>
-        <w:t xml:space="preserve">    gap: 16px;</w:t>
-      </w:r>
-    </w:p>
-    <w:p>
-      <w:pPr>
-        <w:spacing w:after="0" w:before="0" w:line="240" w:lineRule="auto"/>
-        <w:jc w:val="left"/>
-      </w:pPr>
-      <w:r>
-        <w:rPr>
-          <w:rFonts w:ascii="Courier New" w:hAnsi="Courier New" w:eastAsia="Courier New"/>
-          <w:b w:val="0"/>
-          <w:sz w:val="18"/>
-        </w:rPr>
-        <w:t>}</w:t>
-      </w:r>
-    </w:p>
-    <w:p>
-      <w:pPr>
-        <w:spacing w:after="0" w:before="0" w:line="240" w:lineRule="auto"/>
-        <w:jc w:val="left"/>
-      </w:pPr>
-      <w:r>
-        <w:rPr>
-          <w:rFonts w:ascii="Courier New" w:hAnsi="Courier New" w:eastAsia="Courier New"/>
-          <w:b w:val="0"/>
-          <w:sz w:val="18"/>
-        </w:rPr>
-        <w:t xml:space="preserve"> </w:t>
-      </w:r>
-    </w:p>
-    <w:p>
-      <w:pPr>
-        <w:spacing w:after="0" w:before="0" w:line="240" w:lineRule="auto"/>
-        <w:jc w:val="left"/>
-      </w:pPr>
-      <w:r>
-        <w:rPr>
-          <w:rFonts w:ascii="Courier New" w:hAnsi="Courier New" w:eastAsia="Courier New"/>
-          <w:b w:val="0"/>
-          <w:sz w:val="18"/>
-        </w:rPr>
-        <w:t>.bloc-img img {</w:t>
-      </w:r>
-    </w:p>
-    <w:p>
-      <w:pPr>
-        <w:spacing w:after="0" w:before="0" w:line="240" w:lineRule="auto"/>
-        <w:jc w:val="left"/>
-      </w:pPr>
-      <w:r>
-        <w:rPr>
-          <w:rFonts w:ascii="Courier New" w:hAnsi="Courier New" w:eastAsia="Courier New"/>
-          <w:b w:val="0"/>
-          <w:sz w:val="18"/>
-        </w:rPr>
-        <w:t xml:space="preserve">    width: 60px;</w:t>
-      </w:r>
-    </w:p>
-    <w:p>
-      <w:pPr>
-        <w:spacing w:after="0" w:before="0" w:line="240" w:lineRule="auto"/>
-        <w:jc w:val="left"/>
-      </w:pPr>
-      <w:r>
-        <w:rPr>
-          <w:rFonts w:ascii="Courier New" w:hAnsi="Courier New" w:eastAsia="Courier New"/>
-          <w:b w:val="0"/>
-          <w:sz w:val="18"/>
-        </w:rPr>
-        <w:t xml:space="preserve">    height: auto;</w:t>
-      </w:r>
-    </w:p>
-    <w:p>
-      <w:pPr>
-        <w:spacing w:after="0" w:before="0" w:line="240" w:lineRule="auto"/>
-        <w:jc w:val="left"/>
-      </w:pPr>
-      <w:r>
-        <w:rPr>
-          <w:rFonts w:ascii="Courier New" w:hAnsi="Courier New" w:eastAsia="Courier New"/>
-          <w:b w:val="0"/>
-          <w:sz w:val="18"/>
-        </w:rPr>
-        <w:t>}</w:t>
-      </w:r>
-    </w:p>
-    <w:p>
-      <w:pPr>
-        <w:spacing w:after="0" w:before="0" w:line="240" w:lineRule="auto"/>
-        <w:jc w:val="left"/>
-      </w:pPr>
-      <w:r>
-        <w:rPr>
-          <w:rFonts w:ascii="Courier New" w:hAnsi="Courier New" w:eastAsia="Courier New"/>
-          <w:b w:val="0"/>
-          <w:sz w:val="18"/>
-        </w:rPr>
-        <w:t xml:space="preserve"> </w:t>
-      </w:r>
-    </w:p>
-    <w:p>
-      <w:pPr>
-        <w:spacing w:after="0" w:before="0" w:line="240" w:lineRule="auto"/>
-        <w:jc w:val="left"/>
-      </w:pPr>
-      <w:r>
-        <w:rPr>
-          <w:rFonts w:ascii="Courier New" w:hAnsi="Courier New" w:eastAsia="Courier New"/>
-          <w:b w:val="0"/>
-          <w:sz w:val="18"/>
-        </w:rPr>
-        <w:t>header .bloc-img img {</w:t>
-      </w:r>
-    </w:p>
-    <w:p>
-      <w:pPr>
-        <w:spacing w:after="0" w:before="0" w:line="240" w:lineRule="auto"/>
-        <w:jc w:val="left"/>
-      </w:pPr>
-      <w:r>
-        <w:rPr>
-          <w:rFonts w:ascii="Courier New" w:hAnsi="Courier New" w:eastAsia="Courier New"/>
-          <w:b w:val="0"/>
-          <w:sz w:val="18"/>
-        </w:rPr>
-        <w:t xml:space="preserve">    margin-top: -50px;</w:t>
-      </w:r>
-    </w:p>
-    <w:p>
-      <w:pPr>
-        <w:spacing w:after="0" w:before="0" w:line="240" w:lineRule="auto"/>
-        <w:jc w:val="left"/>
-      </w:pPr>
-      <w:r>
-        <w:rPr>
-          <w:rFonts w:ascii="Courier New" w:hAnsi="Courier New" w:eastAsia="Courier New"/>
-          <w:b w:val="0"/>
-          <w:sz w:val="18"/>
-        </w:rPr>
-        <w:t>}</w:t>
-      </w:r>
-    </w:p>
-    <w:p>
-      <w:pPr>
-        <w:spacing w:after="0" w:before="0" w:line="240" w:lineRule="auto"/>
-        <w:jc w:val="left"/>
-      </w:pPr>
-      <w:r>
-        <w:rPr>
-          <w:rFonts w:ascii="Courier New" w:hAnsi="Courier New" w:eastAsia="Courier New"/>
-          <w:b w:val="0"/>
-          <w:sz w:val="18"/>
-        </w:rPr>
-        <w:t xml:space="preserve"> </w:t>
-      </w:r>
-    </w:p>
-    <w:p>
-      <w:pPr>
-        <w:spacing w:after="0" w:before="0" w:line="240" w:lineRule="auto"/>
-        <w:jc w:val="left"/>
-      </w:pPr>
-      <w:r>
-        <w:rPr>
-          <w:rFonts w:ascii="Courier New" w:hAnsi="Courier New" w:eastAsia="Courier New"/>
-          <w:b w:val="0"/>
-          <w:sz w:val="18"/>
-        </w:rPr>
-        <w:t>.logo {</w:t>
-      </w:r>
-    </w:p>
-    <w:p>
-      <w:pPr>
-        <w:spacing w:after="0" w:before="0" w:line="240" w:lineRule="auto"/>
-        <w:jc w:val="left"/>
-      </w:pPr>
-      <w:r>
-        <w:rPr>
-          <w:rFonts w:ascii="Courier New" w:hAnsi="Courier New" w:eastAsia="Courier New"/>
-          <w:b w:val="0"/>
-          <w:sz w:val="18"/>
-        </w:rPr>
-        <w:t xml:space="preserve">    font-size: 28px;</w:t>
-      </w:r>
-    </w:p>
-    <w:p>
-      <w:pPr>
-        <w:spacing w:after="0" w:before="0" w:line="240" w:lineRule="auto"/>
-        <w:jc w:val="left"/>
-      </w:pPr>
-      <w:r>
-        <w:rPr>
-          <w:rFonts w:ascii="Courier New" w:hAnsi="Courier New" w:eastAsia="Courier New"/>
-          <w:b w:val="0"/>
-          <w:sz w:val="18"/>
-        </w:rPr>
-        <w:t xml:space="preserve">    font-weight: bold;</w:t>
-      </w:r>
-    </w:p>
-    <w:p>
-      <w:pPr>
-        <w:spacing w:after="0" w:before="0" w:line="240" w:lineRule="auto"/>
-        <w:jc w:val="left"/>
-      </w:pPr>
-      <w:r>
-        <w:rPr>
-          <w:rFonts w:ascii="Courier New" w:hAnsi="Courier New" w:eastAsia="Courier New"/>
-          <w:b w:val="0"/>
-          <w:sz w:val="18"/>
-        </w:rPr>
-        <w:t xml:space="preserve">    text-align: center;</w:t>
-      </w:r>
-    </w:p>
-    <w:p>
-      <w:pPr>
-        <w:spacing w:after="0" w:before="0" w:line="240" w:lineRule="auto"/>
-        <w:jc w:val="left"/>
-      </w:pPr>
-      <w:r>
-        <w:rPr>
-          <w:rFonts w:ascii="Courier New" w:hAnsi="Courier New" w:eastAsia="Courier New"/>
-          <w:b w:val="0"/>
-          <w:sz w:val="18"/>
-        </w:rPr>
-        <w:t xml:space="preserve">    line-height: 1.15;</w:t>
-      </w:r>
-    </w:p>
-    <w:p>
-      <w:pPr>
-        <w:spacing w:after="0" w:before="0" w:line="240" w:lineRule="auto"/>
-        <w:jc w:val="left"/>
-      </w:pPr>
-      <w:r>
-        <w:rPr>
-          <w:rFonts w:ascii="Courier New" w:hAnsi="Courier New" w:eastAsia="Courier New"/>
-          <w:b w:val="0"/>
-          <w:sz w:val="18"/>
-        </w:rPr>
-        <w:t xml:space="preserve">    color: #000;</w:t>
-      </w:r>
-    </w:p>
-    <w:p>
-      <w:pPr>
-        <w:spacing w:after="0" w:before="0" w:line="240" w:lineRule="auto"/>
-        <w:jc w:val="left"/>
-      </w:pPr>
-      <w:r>
-        <w:rPr>
-          <w:rFonts w:ascii="Courier New" w:hAnsi="Courier New" w:eastAsia="Courier New"/>
-          <w:b w:val="0"/>
-          <w:sz w:val="18"/>
-        </w:rPr>
-        <w:t>}</w:t>
-      </w:r>
-    </w:p>
-    <w:p>
-      <w:pPr>
-        <w:spacing w:after="0" w:before="0" w:line="240" w:lineRule="auto"/>
-        <w:jc w:val="left"/>
-      </w:pPr>
-      <w:r>
-        <w:rPr>
-          <w:rFonts w:ascii="Courier New" w:hAnsi="Courier New" w:eastAsia="Courier New"/>
-          <w:b w:val="0"/>
-          <w:sz w:val="18"/>
-        </w:rPr>
-        <w:t xml:space="preserve"> </w:t>
-      </w:r>
-    </w:p>
-    <w:p>
-      <w:pPr>
-        <w:spacing w:after="0" w:before="0" w:line="240" w:lineRule="auto"/>
-        <w:jc w:val="left"/>
-      </w:pPr>
-      <w:r>
-        <w:rPr>
-          <w:rFonts w:ascii="Courier New" w:hAnsi="Courier New" w:eastAsia="Courier New"/>
-          <w:b w:val="0"/>
-          <w:sz w:val="18"/>
-        </w:rPr>
-        <w:t>/* правое меню */</w:t>
-      </w:r>
-    </w:p>
-    <w:p>
-      <w:pPr>
-        <w:spacing w:after="0" w:before="0" w:line="240" w:lineRule="auto"/>
-        <w:jc w:val="left"/>
-      </w:pPr>
-      <w:r>
-        <w:rPr>
-          <w:rFonts w:ascii="Courier New" w:hAnsi="Courier New" w:eastAsia="Courier New"/>
-          <w:b w:val="0"/>
-          <w:sz w:val="18"/>
-        </w:rPr>
-        <w:t>.nav-list {</w:t>
-      </w:r>
-    </w:p>
-    <w:p>
-      <w:pPr>
-        <w:spacing w:after="0" w:before="0" w:line="240" w:lineRule="auto"/>
-        <w:jc w:val="left"/>
-      </w:pPr>
-      <w:r>
-        <w:rPr>
-          <w:rFonts w:ascii="Courier New" w:hAnsi="Courier New" w:eastAsia="Courier New"/>
-          <w:b w:val="0"/>
-          <w:sz w:val="18"/>
-        </w:rPr>
-        <w:t xml:space="preserve">    list-style: none;</w:t>
-      </w:r>
-    </w:p>
-    <w:p>
-      <w:pPr>
-        <w:spacing w:after="0" w:before="0" w:line="240" w:lineRule="auto"/>
-        <w:jc w:val="left"/>
-      </w:pPr>
-      <w:r>
-        <w:rPr>
-          <w:rFonts w:ascii="Courier New" w:hAnsi="Courier New" w:eastAsia="Courier New"/>
-          <w:b w:val="0"/>
-          <w:sz w:val="18"/>
-        </w:rPr>
-        <w:t xml:space="preserve">    text-align: right;</w:t>
-      </w:r>
-    </w:p>
-    <w:p>
-      <w:pPr>
-        <w:spacing w:after="0" w:before="0" w:line="240" w:lineRule="auto"/>
-        <w:jc w:val="left"/>
-      </w:pPr>
-      <w:r>
-        <w:rPr>
-          <w:rFonts w:ascii="Courier New" w:hAnsi="Courier New" w:eastAsia="Courier New"/>
-          <w:b w:val="0"/>
-          <w:sz w:val="18"/>
-        </w:rPr>
-        <w:t>}</w:t>
-      </w:r>
-    </w:p>
-    <w:p>
-      <w:pPr>
-        <w:spacing w:after="0" w:before="0" w:line="240" w:lineRule="auto"/>
-        <w:jc w:val="left"/>
-      </w:pPr>
-      <w:r>
-        <w:rPr>
-          <w:rFonts w:ascii="Courier New" w:hAnsi="Courier New" w:eastAsia="Courier New"/>
-          <w:b w:val="0"/>
-          <w:sz w:val="18"/>
-        </w:rPr>
-        <w:t xml:space="preserve"> </w:t>
-      </w:r>
-    </w:p>
-    <w:p>
-      <w:pPr>
-        <w:spacing w:after="0" w:before="0" w:line="240" w:lineRule="auto"/>
-        <w:jc w:val="left"/>
-      </w:pPr>
-      <w:r>
-        <w:rPr>
-          <w:rFonts w:ascii="Courier New" w:hAnsi="Courier New" w:eastAsia="Courier New"/>
-          <w:b w:val="0"/>
-          <w:sz w:val="18"/>
-        </w:rPr>
-        <w:t>.nav-item {</w:t>
-      </w:r>
-    </w:p>
-    <w:p>
-      <w:pPr>
-        <w:spacing w:after="0" w:before="0" w:line="240" w:lineRule="auto"/>
-        <w:jc w:val="left"/>
-      </w:pPr>
-      <w:r>
-        <w:rPr>
-          <w:rFonts w:ascii="Courier New" w:hAnsi="Courier New" w:eastAsia="Courier New"/>
-          <w:b w:val="0"/>
-          <w:sz w:val="18"/>
-        </w:rPr>
-        <w:t xml:space="preserve">    margin-bottom: 2px;</w:t>
-      </w:r>
-    </w:p>
-    <w:p>
-      <w:pPr>
-        <w:spacing w:after="0" w:before="0" w:line="240" w:lineRule="auto"/>
-        <w:jc w:val="left"/>
-      </w:pPr>
-      <w:r>
-        <w:rPr>
-          <w:rFonts w:ascii="Courier New" w:hAnsi="Courier New" w:eastAsia="Courier New"/>
-          <w:b w:val="0"/>
-          <w:sz w:val="18"/>
-        </w:rPr>
-        <w:t>}</w:t>
-      </w:r>
-    </w:p>
-    <w:p>
-      <w:pPr>
-        <w:spacing w:after="0" w:before="0" w:line="240" w:lineRule="auto"/>
-        <w:jc w:val="left"/>
-      </w:pPr>
-      <w:r>
-        <w:rPr>
-          <w:rFonts w:ascii="Courier New" w:hAnsi="Courier New" w:eastAsia="Courier New"/>
-          <w:b w:val="0"/>
-          <w:sz w:val="18"/>
-        </w:rPr>
-        <w:t xml:space="preserve"> </w:t>
-      </w:r>
-    </w:p>
-    <w:p>
-      <w:pPr>
-        <w:spacing w:after="0" w:before="0" w:line="240" w:lineRule="auto"/>
-        <w:jc w:val="left"/>
-      </w:pPr>
-      <w:r>
-        <w:rPr>
-          <w:rFonts w:ascii="Courier New" w:hAnsi="Courier New" w:eastAsia="Courier New"/>
-          <w:b w:val="0"/>
-          <w:sz w:val="18"/>
-        </w:rPr>
-        <w:t>.nav-link {</w:t>
-      </w:r>
-    </w:p>
-    <w:p>
-      <w:pPr>
-        <w:spacing w:after="0" w:before="0" w:line="240" w:lineRule="auto"/>
-        <w:jc w:val="left"/>
-      </w:pPr>
-      <w:r>
-        <w:rPr>
-          <w:rFonts w:ascii="Courier New" w:hAnsi="Courier New" w:eastAsia="Courier New"/>
-          <w:b w:val="0"/>
-          <w:sz w:val="18"/>
-        </w:rPr>
-        <w:t xml:space="preserve">    color: #000;</w:t>
-      </w:r>
-    </w:p>
-    <w:p>
-      <w:pPr>
-        <w:spacing w:after="0" w:before="0" w:line="240" w:lineRule="auto"/>
-        <w:jc w:val="left"/>
-      </w:pPr>
-      <w:r>
-        <w:rPr>
-          <w:rFonts w:ascii="Courier New" w:hAnsi="Courier New" w:eastAsia="Courier New"/>
-          <w:b w:val="0"/>
-          <w:sz w:val="18"/>
-        </w:rPr>
-        <w:t xml:space="preserve">    text-decoration: none;</w:t>
-      </w:r>
-    </w:p>
-    <w:p>
-      <w:pPr>
-        <w:spacing w:after="0" w:before="0" w:line="240" w:lineRule="auto"/>
-        <w:jc w:val="left"/>
-      </w:pPr>
-      <w:r>
-        <w:rPr>
-          <w:rFonts w:ascii="Courier New" w:hAnsi="Courier New" w:eastAsia="Courier New"/>
-          <w:b w:val="0"/>
-          <w:sz w:val="18"/>
-        </w:rPr>
-        <w:t xml:space="preserve">    font-size: 20px;</w:t>
-      </w:r>
-    </w:p>
-    <w:p>
-      <w:pPr>
-        <w:spacing w:after="0" w:before="0" w:line="240" w:lineRule="auto"/>
-        <w:jc w:val="left"/>
-      </w:pPr>
-      <w:r>
-        <w:rPr>
-          <w:rFonts w:ascii="Courier New" w:hAnsi="Courier New" w:eastAsia="Courier New"/>
-          <w:b w:val="0"/>
-          <w:sz w:val="18"/>
-        </w:rPr>
-        <w:t>}</w:t>
-      </w:r>
-    </w:p>
-    <w:p>
-      <w:pPr>
-        <w:spacing w:after="0" w:before="0" w:line="240" w:lineRule="auto"/>
-        <w:jc w:val="left"/>
-      </w:pPr>
-      <w:r>
-        <w:rPr>
-          <w:rFonts w:ascii="Courier New" w:hAnsi="Courier New" w:eastAsia="Courier New"/>
-          <w:b w:val="0"/>
-          <w:sz w:val="18"/>
-        </w:rPr>
-        <w:t xml:space="preserve"> </w:t>
-      </w:r>
-    </w:p>
-    <w:p>
-      <w:pPr>
-        <w:spacing w:after="0" w:before="0" w:line="240" w:lineRule="auto"/>
-        <w:jc w:val="left"/>
-      </w:pPr>
-      <w:r>
-        <w:rPr>
-          <w:rFonts w:ascii="Courier New" w:hAnsi="Courier New" w:eastAsia="Courier New"/>
-          <w:b w:val="0"/>
-          <w:sz w:val="18"/>
-        </w:rPr>
-        <w:t>.main {</w:t>
-      </w:r>
-    </w:p>
-    <w:p>
-      <w:pPr>
-        <w:spacing w:after="0" w:before="0" w:line="240" w:lineRule="auto"/>
-        <w:jc w:val="left"/>
-      </w:pPr>
-      <w:r>
-        <w:rPr>
-          <w:rFonts w:ascii="Courier New" w:hAnsi="Courier New" w:eastAsia="Courier New"/>
-          <w:b w:val="0"/>
-          <w:sz w:val="18"/>
-        </w:rPr>
-        <w:t xml:space="preserve">    padding: 20px 40px;</w:t>
-      </w:r>
-    </w:p>
-    <w:p>
-      <w:pPr>
-        <w:spacing w:after="0" w:before="0" w:line="240" w:lineRule="auto"/>
-        <w:jc w:val="left"/>
-      </w:pPr>
-      <w:r>
-        <w:rPr>
-          <w:rFonts w:ascii="Courier New" w:hAnsi="Courier New" w:eastAsia="Courier New"/>
-          <w:b w:val="0"/>
-          <w:sz w:val="18"/>
-        </w:rPr>
-        <w:t>}</w:t>
-      </w:r>
-    </w:p>
-    <w:p>
-      <w:pPr>
-        <w:spacing w:after="0" w:before="0" w:line="240" w:lineRule="auto"/>
-        <w:jc w:val="left"/>
-      </w:pPr>
-      <w:r>
-        <w:rPr>
-          <w:rFonts w:ascii="Courier New" w:hAnsi="Courier New" w:eastAsia="Courier New"/>
-          <w:b w:val="0"/>
-          <w:sz w:val="18"/>
-        </w:rPr>
-        <w:t xml:space="preserve"> </w:t>
-      </w:r>
-    </w:p>
-    <w:p>
-      <w:pPr>
-        <w:spacing w:after="0" w:before="0" w:line="240" w:lineRule="auto"/>
-        <w:jc w:val="left"/>
-      </w:pPr>
-      <w:r>
-        <w:rPr>
-          <w:rFonts w:ascii="Courier New" w:hAnsi="Courier New" w:eastAsia="Courier New"/>
-          <w:b w:val="0"/>
-          <w:sz w:val="18"/>
-        </w:rPr>
-        <w:t>.poet {</w:t>
-      </w:r>
-    </w:p>
-    <w:p>
-      <w:pPr>
-        <w:spacing w:after="0" w:before="0" w:line="240" w:lineRule="auto"/>
-        <w:jc w:val="left"/>
-      </w:pPr>
-      <w:r>
-        <w:rPr>
-          <w:rFonts w:ascii="Courier New" w:hAnsi="Courier New" w:eastAsia="Courier New"/>
-          <w:b w:val="0"/>
-          <w:sz w:val="18"/>
-        </w:rPr>
-        <w:t xml:space="preserve">    margin-bottom: 40px;</w:t>
-      </w:r>
-    </w:p>
-    <w:p>
-      <w:pPr>
-        <w:spacing w:after="0" w:before="0" w:line="240" w:lineRule="auto"/>
-        <w:jc w:val="left"/>
-      </w:pPr>
-      <w:r>
-        <w:rPr>
-          <w:rFonts w:ascii="Courier New" w:hAnsi="Courier New" w:eastAsia="Courier New"/>
-          <w:b w:val="0"/>
-          <w:sz w:val="18"/>
-        </w:rPr>
-        <w:t>}</w:t>
-      </w:r>
-    </w:p>
-    <w:p>
-      <w:pPr>
-        <w:spacing w:after="0" w:before="0" w:line="240" w:lineRule="auto"/>
-        <w:jc w:val="left"/>
-      </w:pPr>
-      <w:r>
-        <w:rPr>
-          <w:rFonts w:ascii="Courier New" w:hAnsi="Courier New" w:eastAsia="Courier New"/>
-          <w:b w:val="0"/>
-          <w:sz w:val="18"/>
-        </w:rPr>
-        <w:t xml:space="preserve"> </w:t>
-      </w:r>
-    </w:p>
-    <w:p>
-      <w:pPr>
-        <w:spacing w:after="0" w:before="0" w:line="240" w:lineRule="auto"/>
-        <w:jc w:val="left"/>
-      </w:pPr>
-      <w:r>
-        <w:rPr>
-          <w:rFonts w:ascii="Courier New" w:hAnsi="Courier New" w:eastAsia="Courier New"/>
-          <w:b w:val="0"/>
-          <w:sz w:val="18"/>
-        </w:rPr>
-        <w:t>.poet h1 {</w:t>
-      </w:r>
-    </w:p>
-    <w:p>
-      <w:pPr>
-        <w:spacing w:after="0" w:before="0" w:line="240" w:lineRule="auto"/>
-        <w:jc w:val="left"/>
-      </w:pPr>
-      <w:r>
-        <w:rPr>
-          <w:rFonts w:ascii="Courier New" w:hAnsi="Courier New" w:eastAsia="Courier New"/>
-          <w:b w:val="0"/>
-          <w:sz w:val="18"/>
-        </w:rPr>
-        <w:t xml:space="preserve">    font-size: 32px;</w:t>
-      </w:r>
-    </w:p>
-    <w:p>
-      <w:pPr>
-        <w:spacing w:after="0" w:before="0" w:line="240" w:lineRule="auto"/>
-        <w:jc w:val="left"/>
-      </w:pPr>
-      <w:r>
-        <w:rPr>
-          <w:rFonts w:ascii="Courier New" w:hAnsi="Courier New" w:eastAsia="Courier New"/>
-          <w:b w:val="0"/>
-          <w:sz w:val="18"/>
-        </w:rPr>
-        <w:t xml:space="preserve">    margin-bottom: 8px;</w:t>
-      </w:r>
-    </w:p>
-    <w:p>
-      <w:pPr>
-        <w:spacing w:after="0" w:before="0" w:line="240" w:lineRule="auto"/>
-        <w:jc w:val="left"/>
-      </w:pPr>
-      <w:r>
-        <w:rPr>
-          <w:rFonts w:ascii="Courier New" w:hAnsi="Courier New" w:eastAsia="Courier New"/>
-          <w:b w:val="0"/>
-          <w:sz w:val="18"/>
-        </w:rPr>
-        <w:t>}</w:t>
-      </w:r>
-    </w:p>
-    <w:p>
-      <w:pPr>
-        <w:spacing w:after="0" w:before="0" w:line="240" w:lineRule="auto"/>
-        <w:jc w:val="left"/>
-      </w:pPr>
-      <w:r>
-        <w:rPr>
-          <w:rFonts w:ascii="Courier New" w:hAnsi="Courier New" w:eastAsia="Courier New"/>
-          <w:b w:val="0"/>
-          <w:sz w:val="18"/>
-        </w:rPr>
-        <w:t xml:space="preserve"> </w:t>
-      </w:r>
-    </w:p>
-    <w:p>
-      <w:pPr>
-        <w:spacing w:after="0" w:before="0" w:line="240" w:lineRule="auto"/>
-        <w:jc w:val="left"/>
-      </w:pPr>
-      <w:r>
-        <w:rPr>
-          <w:rFonts w:ascii="Courier New" w:hAnsi="Courier New" w:eastAsia="Courier New"/>
-          <w:b w:val="0"/>
-          <w:sz w:val="18"/>
-        </w:rPr>
-        <w:t>.poet h2 {</w:t>
-      </w:r>
-    </w:p>
-    <w:p>
-      <w:pPr>
-        <w:spacing w:after="0" w:before="0" w:line="240" w:lineRule="auto"/>
-        <w:jc w:val="left"/>
-      </w:pPr>
-      <w:r>
-        <w:rPr>
-          <w:rFonts w:ascii="Courier New" w:hAnsi="Courier New" w:eastAsia="Courier New"/>
-          <w:b w:val="0"/>
-          <w:sz w:val="18"/>
-        </w:rPr>
-        <w:t xml:space="preserve">    font-size: 24px;</w:t>
-      </w:r>
-    </w:p>
-    <w:p>
-      <w:pPr>
-        <w:spacing w:after="0" w:before="0" w:line="240" w:lineRule="auto"/>
-        <w:jc w:val="left"/>
-      </w:pPr>
-      <w:r>
-        <w:rPr>
-          <w:rFonts w:ascii="Courier New" w:hAnsi="Courier New" w:eastAsia="Courier New"/>
-          <w:b w:val="0"/>
-          <w:sz w:val="18"/>
-        </w:rPr>
-        <w:t xml:space="preserve">    margin-bottom: 12px;</w:t>
-      </w:r>
-    </w:p>
-    <w:p>
-      <w:pPr>
-        <w:spacing w:after="0" w:before="0" w:line="240" w:lineRule="auto"/>
-        <w:jc w:val="left"/>
-      </w:pPr>
-      <w:r>
-        <w:rPr>
-          <w:rFonts w:ascii="Courier New" w:hAnsi="Courier New" w:eastAsia="Courier New"/>
-          <w:b w:val="0"/>
-          <w:sz w:val="18"/>
-        </w:rPr>
-        <w:t>}</w:t>
-      </w:r>
-    </w:p>
-    <w:p>
-      <w:pPr>
-        <w:spacing w:after="0" w:before="0" w:line="240" w:lineRule="auto"/>
-        <w:jc w:val="left"/>
-      </w:pPr>
-      <w:r>
-        <w:rPr>
-          <w:rFonts w:ascii="Courier New" w:hAnsi="Courier New" w:eastAsia="Courier New"/>
-          <w:b w:val="0"/>
-          <w:sz w:val="18"/>
-        </w:rPr>
-        <w:t xml:space="preserve"> </w:t>
-      </w:r>
-    </w:p>
-    <w:p>
-      <w:pPr>
-        <w:spacing w:after="0" w:before="0" w:line="240" w:lineRule="auto"/>
-        <w:jc w:val="left"/>
-      </w:pPr>
-      <w:r>
-        <w:rPr>
-          <w:rFonts w:ascii="Courier New" w:hAnsi="Courier New" w:eastAsia="Courier New"/>
-          <w:b w:val="0"/>
-          <w:sz w:val="18"/>
-        </w:rPr>
-        <w:t>.poet img {</w:t>
-      </w:r>
-    </w:p>
-    <w:p>
-      <w:pPr>
-        <w:spacing w:after="0" w:before="0" w:line="240" w:lineRule="auto"/>
-        <w:jc w:val="left"/>
-      </w:pPr>
-      <w:r>
-        <w:rPr>
-          <w:rFonts w:ascii="Courier New" w:hAnsi="Courier New" w:eastAsia="Courier New"/>
-          <w:b w:val="0"/>
-          <w:sz w:val="18"/>
-        </w:rPr>
-        <w:t xml:space="preserve">    display: block;</w:t>
-      </w:r>
-    </w:p>
-    <w:p>
-      <w:pPr>
-        <w:spacing w:after="0" w:before="0" w:line="240" w:lineRule="auto"/>
-        <w:jc w:val="left"/>
-      </w:pPr>
-      <w:r>
-        <w:rPr>
-          <w:rFonts w:ascii="Courier New" w:hAnsi="Courier New" w:eastAsia="Courier New"/>
-          <w:b w:val="0"/>
-          <w:sz w:val="18"/>
-        </w:rPr>
-        <w:t xml:space="preserve">    width: 180px;</w:t>
-      </w:r>
-    </w:p>
-    <w:p>
-      <w:pPr>
-        <w:spacing w:after="0" w:before="0" w:line="240" w:lineRule="auto"/>
-        <w:jc w:val="left"/>
-      </w:pPr>
-      <w:r>
-        <w:rPr>
-          <w:rFonts w:ascii="Courier New" w:hAnsi="Courier New" w:eastAsia="Courier New"/>
-          <w:b w:val="0"/>
-          <w:sz w:val="18"/>
-        </w:rPr>
-        <w:t xml:space="preserve">    height: auto;</w:t>
-      </w:r>
-    </w:p>
-    <w:p>
-      <w:pPr>
-        <w:spacing w:after="0" w:before="0" w:line="240" w:lineRule="auto"/>
-        <w:jc w:val="left"/>
-      </w:pPr>
-      <w:r>
-        <w:rPr>
-          <w:rFonts w:ascii="Courier New" w:hAnsi="Courier New" w:eastAsia="Courier New"/>
-          <w:b w:val="0"/>
-          <w:sz w:val="18"/>
-        </w:rPr>
-        <w:t xml:space="preserve">    margin-bottom: 12px;</w:t>
-      </w:r>
-    </w:p>
-    <w:p>
-      <w:pPr>
-        <w:spacing w:after="0" w:before="0" w:line="240" w:lineRule="auto"/>
-        <w:jc w:val="left"/>
-      </w:pPr>
-      <w:r>
-        <w:rPr>
-          <w:rFonts w:ascii="Courier New" w:hAnsi="Courier New" w:eastAsia="Courier New"/>
-          <w:b w:val="0"/>
-          <w:sz w:val="18"/>
-        </w:rPr>
-        <w:t>}</w:t>
-      </w:r>
-    </w:p>
-    <w:p>
-      <w:pPr>
-        <w:spacing w:after="0" w:before="0" w:line="240" w:lineRule="auto"/>
-        <w:jc w:val="left"/>
-      </w:pPr>
-      <w:r>
-        <w:rPr>
-          <w:rFonts w:ascii="Courier New" w:hAnsi="Courier New" w:eastAsia="Courier New"/>
-          <w:b w:val="0"/>
-          <w:sz w:val="18"/>
-        </w:rPr>
-        <w:t xml:space="preserve"> </w:t>
-      </w:r>
-    </w:p>
-    <w:p>
-      <w:pPr>
-        <w:spacing w:after="0" w:before="0" w:line="240" w:lineRule="auto"/>
-        <w:jc w:val="left"/>
-      </w:pPr>
-      <w:r>
-        <w:rPr>
-          <w:rFonts w:ascii="Courier New" w:hAnsi="Courier New" w:eastAsia="Courier New"/>
-          <w:b w:val="0"/>
-          <w:sz w:val="18"/>
-        </w:rPr>
-        <w:t>.poet p {</w:t>
-      </w:r>
-    </w:p>
-    <w:p>
-      <w:pPr>
-        <w:spacing w:after="0" w:before="0" w:line="240" w:lineRule="auto"/>
-        <w:jc w:val="left"/>
-      </w:pPr>
-      <w:r>
-        <w:rPr>
-          <w:rFonts w:ascii="Courier New" w:hAnsi="Courier New" w:eastAsia="Courier New"/>
-          <w:b w:val="0"/>
-          <w:sz w:val="18"/>
-        </w:rPr>
-        <w:t xml:space="preserve">    font-size: 18px;</w:t>
-      </w:r>
-    </w:p>
-    <w:p>
-      <w:pPr>
-        <w:spacing w:after="0" w:before="0" w:line="240" w:lineRule="auto"/>
-        <w:jc w:val="left"/>
-      </w:pPr>
-      <w:r>
-        <w:rPr>
-          <w:rFonts w:ascii="Courier New" w:hAnsi="Courier New" w:eastAsia="Courier New"/>
-          <w:b w:val="0"/>
-          <w:sz w:val="18"/>
-        </w:rPr>
-        <w:t xml:space="preserve">    line-height: 1.5;</w:t>
-      </w:r>
-    </w:p>
-    <w:p>
-      <w:pPr>
-        <w:spacing w:after="0" w:before="0" w:line="240" w:lineRule="auto"/>
-        <w:jc w:val="left"/>
-      </w:pPr>
-      <w:r>
-        <w:rPr>
-          <w:rFonts w:ascii="Courier New" w:hAnsi="Courier New" w:eastAsia="Courier New"/>
-          <w:b w:val="0"/>
-          <w:sz w:val="18"/>
-        </w:rPr>
-        <w:t xml:space="preserve">    margin-bottom: 16px;</w:t>
-      </w:r>
-    </w:p>
-    <w:p>
-      <w:pPr>
-        <w:spacing w:after="0" w:before="0" w:line="240" w:lineRule="auto"/>
-        <w:jc w:val="left"/>
-      </w:pPr>
-      <w:r>
-        <w:rPr>
-          <w:rFonts w:ascii="Courier New" w:hAnsi="Courier New" w:eastAsia="Courier New"/>
-          <w:b w:val="0"/>
-          <w:sz w:val="18"/>
-        </w:rPr>
-        <w:t>}</w:t>
-      </w:r>
-    </w:p>
-    <w:p>
-      <w:pPr>
-        <w:spacing w:after="0" w:before="0" w:line="240" w:lineRule="auto"/>
-        <w:jc w:val="left"/>
-      </w:pPr>
-      <w:r>
-        <w:rPr>
-          <w:rFonts w:ascii="Courier New" w:hAnsi="Courier New" w:eastAsia="Courier New"/>
-          <w:b w:val="0"/>
-          <w:sz w:val="18"/>
-        </w:rPr>
-        <w:t xml:space="preserve"> </w:t>
-      </w:r>
-    </w:p>
-    <w:p>
-      <w:pPr>
-        <w:spacing w:after="0" w:before="0" w:line="240" w:lineRule="auto"/>
-        <w:jc w:val="left"/>
-      </w:pPr>
-      <w:r>
-        <w:rPr>
-          <w:rFonts w:ascii="Courier New" w:hAnsi="Courier New" w:eastAsia="Courier New"/>
-          <w:b w:val="0"/>
-          <w:sz w:val="18"/>
-        </w:rPr>
-        <w:t>.poet a {</w:t>
-      </w:r>
-    </w:p>
-    <w:p>
-      <w:pPr>
-        <w:spacing w:after="0" w:before="0" w:line="240" w:lineRule="auto"/>
-        <w:jc w:val="left"/>
-      </w:pPr>
-      <w:r>
-        <w:rPr>
-          <w:rFonts w:ascii="Courier New" w:hAnsi="Courier New" w:eastAsia="Courier New"/>
-          <w:b w:val="0"/>
-          <w:sz w:val="18"/>
-        </w:rPr>
-        <w:t xml:space="preserve">    color: blue;</w:t>
-      </w:r>
-    </w:p>
-    <w:p>
-      <w:pPr>
-        <w:spacing w:after="0" w:before="0" w:line="240" w:lineRule="auto"/>
-        <w:jc w:val="left"/>
-      </w:pPr>
-      <w:r>
-        <w:rPr>
-          <w:rFonts w:ascii="Courier New" w:hAnsi="Courier New" w:eastAsia="Courier New"/>
-          <w:b w:val="0"/>
-          <w:sz w:val="18"/>
-        </w:rPr>
-        <w:t>}</w:t>
-      </w:r>
-    </w:p>
-    <w:p>
-      <w:pPr>
-        <w:spacing w:after="0" w:before="0" w:line="240" w:lineRule="auto"/>
-        <w:jc w:val="left"/>
-      </w:pPr>
-      <w:r>
-        <w:rPr>
-          <w:rFonts w:ascii="Courier New" w:hAnsi="Courier New" w:eastAsia="Courier New"/>
-          <w:b w:val="0"/>
-          <w:sz w:val="18"/>
-        </w:rPr>
-        <w:t xml:space="preserve"> </w:t>
-      </w:r>
-    </w:p>
-    <w:p>
-      <w:pPr>
-        <w:spacing w:after="0" w:before="0" w:line="240" w:lineRule="auto"/>
-        <w:jc w:val="left"/>
-      </w:pPr>
-      <w:r>
-        <w:rPr>
-          <w:rFonts w:ascii="Courier New" w:hAnsi="Courier New" w:eastAsia="Courier New"/>
-          <w:b w:val="0"/>
-          <w:sz w:val="18"/>
-        </w:rPr>
-        <w:t>#pushkin,</w:t>
-      </w:r>
-    </w:p>
-    <w:p>
-      <w:pPr>
-        <w:spacing w:after="0" w:before="0" w:line="240" w:lineRule="auto"/>
-        <w:jc w:val="left"/>
-      </w:pPr>
-      <w:r>
-        <w:rPr>
-          <w:rFonts w:ascii="Courier New" w:hAnsi="Courier New" w:eastAsia="Courier New"/>
-          <w:b w:val="0"/>
-          <w:sz w:val="18"/>
-        </w:rPr>
-        <w:t>#lermontov {</w:t>
-      </w:r>
-    </w:p>
-    <w:p>
-      <w:pPr>
-        <w:spacing w:after="0" w:before="0" w:line="240" w:lineRule="auto"/>
-        <w:jc w:val="left"/>
-      </w:pPr>
-      <w:r>
-        <w:rPr>
-          <w:rFonts w:ascii="Courier New" w:hAnsi="Courier New" w:eastAsia="Courier New"/>
-          <w:b w:val="0"/>
-          <w:sz w:val="18"/>
-        </w:rPr>
-        <w:t xml:space="preserve">    width: max-content;</w:t>
-      </w:r>
-    </w:p>
-    <w:p>
-      <w:pPr>
-        <w:spacing w:after="0" w:before="0" w:line="240" w:lineRule="auto"/>
-        <w:jc w:val="left"/>
-      </w:pPr>
-      <w:r>
-        <w:rPr>
-          <w:rFonts w:ascii="Courier New" w:hAnsi="Courier New" w:eastAsia="Courier New"/>
-          <w:b w:val="0"/>
-          <w:sz w:val="18"/>
-        </w:rPr>
-        <w:t xml:space="preserve">    max-width: 100%;</w:t>
-      </w:r>
-    </w:p>
-    <w:p>
-      <w:pPr>
-        <w:spacing w:after="0" w:before="0" w:line="240" w:lineRule="auto"/>
-        <w:jc w:val="left"/>
-      </w:pPr>
-      <w:r>
-        <w:rPr>
-          <w:rFonts w:ascii="Courier New" w:hAnsi="Courier New" w:eastAsia="Courier New"/>
-          <w:b w:val="0"/>
-          <w:sz w:val="18"/>
-        </w:rPr>
-        <w:t xml:space="preserve">    margin-left: auto;</w:t>
-      </w:r>
-    </w:p>
-    <w:p>
-      <w:pPr>
-        <w:spacing w:after="0" w:before="0" w:line="240" w:lineRule="auto"/>
-        <w:jc w:val="left"/>
-      </w:pPr>
-      <w:r>
-        <w:rPr>
-          <w:rFonts w:ascii="Courier New" w:hAnsi="Courier New" w:eastAsia="Courier New"/>
-          <w:b w:val="0"/>
-          <w:sz w:val="18"/>
-        </w:rPr>
-        <w:t xml:space="preserve">    margin-right: auto;</w:t>
-      </w:r>
-    </w:p>
-    <w:p>
-      <w:pPr>
-        <w:spacing w:after="0" w:before="0" w:line="240" w:lineRule="auto"/>
-        <w:jc w:val="left"/>
-      </w:pPr>
-      <w:r>
-        <w:rPr>
-          <w:rFonts w:ascii="Courier New" w:hAnsi="Courier New" w:eastAsia="Courier New"/>
-          <w:b w:val="0"/>
-          <w:sz w:val="18"/>
-        </w:rPr>
-        <w:t xml:space="preserve">    text-align: left;</w:t>
-      </w:r>
-    </w:p>
-    <w:p>
-      <w:pPr>
-        <w:spacing w:after="0" w:before="0" w:line="240" w:lineRule="auto"/>
-        <w:jc w:val="left"/>
-      </w:pPr>
-      <w:r>
-        <w:rPr>
-          <w:rFonts w:ascii="Courier New" w:hAnsi="Courier New" w:eastAsia="Courier New"/>
-          <w:b w:val="0"/>
-          <w:sz w:val="18"/>
-        </w:rPr>
-        <w:t>}</w:t>
+        <w:t>2. Репозиторий учебных работ: https://github.com/FURFanTom1331FUR/Web-Design</w:t>
       </w:r>
     </w:p>
     <w:sectPr>
@@ -4450,6 +1265,10 @@
     <w:name w:val="Normal"/>
     <w:qFormat/>
     <w:rsid w:val="00FC693F"/>
+    <w:rPr>
+      <w:rFonts w:ascii="Times New Roman" w:hAnsi="Times New Roman"/>
+      <w:sz w:val="28"/>
+    </w:rPr>
   </w:style>
   <w:style w:type="paragraph" w:styleId="Header">
     <w:name w:val="header"/>

</xml_diff>

<commit_message>
Add screenshots into lab 1-4 reports
</commit_message>
<xml_diff>
--- a/lab1/Otchet_Lab1_Web-Dizayn.docx
+++ b/lab1/Otchet_Lab1_Web-Dizayn.docx
@@ -4,7 +4,7 @@
   <w:body>
     <w:p>
       <w:pPr>
-        <w:spacing w:after="80" w:before="0" w:line="276" w:lineRule="auto"/>
+        <w:spacing w:after="40" w:line="276" w:lineRule="auto"/>
         <w:jc w:val="center"/>
       </w:pPr>
       <w:r>
@@ -19,7 +19,7 @@
     </w:p>
     <w:p>
       <w:pPr>
-        <w:spacing w:after="80" w:before="0" w:line="276" w:lineRule="auto"/>
+        <w:spacing w:after="40" w:line="276" w:lineRule="auto"/>
         <w:jc w:val="center"/>
       </w:pPr>
       <w:r>
@@ -34,7 +34,7 @@
     </w:p>
     <w:p>
       <w:pPr>
-        <w:spacing w:after="80" w:before="0" w:line="276" w:lineRule="auto"/>
+        <w:spacing w:after="40" w:line="276" w:lineRule="auto"/>
         <w:jc w:val="center"/>
       </w:pPr>
       <w:r>
@@ -49,7 +49,7 @@
     </w:p>
     <w:p>
       <w:pPr>
-        <w:spacing w:after="80" w:before="0" w:line="276" w:lineRule="auto"/>
+        <w:spacing w:after="40" w:line="276" w:lineRule="auto"/>
         <w:jc w:val="center"/>
       </w:pPr>
       <w:r>
@@ -64,7 +64,7 @@
     </w:p>
     <w:p>
       <w:pPr>
-        <w:spacing w:after="80" w:before="0" w:line="276" w:lineRule="auto"/>
+        <w:spacing w:after="40" w:line="276" w:lineRule="auto"/>
         <w:jc w:val="center"/>
       </w:pPr>
       <w:r>
@@ -79,7 +79,7 @@
     </w:p>
     <w:p>
       <w:pPr>
-        <w:spacing w:after="80" w:before="0" w:line="276" w:lineRule="auto"/>
+        <w:spacing w:after="40" w:line="276" w:lineRule="auto"/>
         <w:jc w:val="center"/>
       </w:pPr>
       <w:r>
@@ -94,7 +94,7 @@
     </w:p>
     <w:p>
       <w:pPr>
-        <w:spacing w:after="240" w:before="0" w:line="276" w:lineRule="auto"/>
+        <w:spacing w:after="200" w:line="276" w:lineRule="auto"/>
         <w:jc w:val="center"/>
       </w:pPr>
       <w:r>
@@ -108,7 +108,7 @@
     </w:p>
     <w:p>
       <w:pPr>
-        <w:spacing w:after="80" w:before="0" w:line="276" w:lineRule="auto"/>
+        <w:spacing w:after="120" w:line="276" w:lineRule="auto"/>
         <w:jc w:val="center"/>
       </w:pPr>
       <w:r>
@@ -123,7 +123,7 @@
     </w:p>
     <w:p>
       <w:pPr>
-        <w:spacing w:after="120" w:before="0" w:line="276" w:lineRule="auto"/>
+        <w:spacing w:after="120" w:line="276" w:lineRule="auto"/>
         <w:jc w:val="center"/>
       </w:pPr>
       <w:r>
@@ -137,7 +137,7 @@
     </w:p>
     <w:p>
       <w:pPr>
-        <w:spacing w:after="80" w:before="0" w:line="276" w:lineRule="auto"/>
+        <w:spacing w:after="120" w:line="276" w:lineRule="auto"/>
         <w:jc w:val="center"/>
       </w:pPr>
       <w:r>
@@ -152,7 +152,7 @@
     </w:p>
     <w:p>
       <w:pPr>
-        <w:spacing w:after="80" w:before="0" w:line="276" w:lineRule="auto"/>
+        <w:spacing w:after="120" w:line="276" w:lineRule="auto"/>
         <w:jc w:val="center"/>
       </w:pPr>
       <w:r>
@@ -167,7 +167,7 @@
     </w:p>
     <w:p>
       <w:pPr>
-        <w:spacing w:after="80" w:before="0" w:line="276" w:lineRule="auto"/>
+        <w:spacing w:after="120" w:line="276" w:lineRule="auto"/>
         <w:jc w:val="center"/>
       </w:pPr>
       <w:r>
@@ -182,7 +182,7 @@
     </w:p>
     <w:p>
       <w:pPr>
-        <w:spacing w:after="160" w:before="0" w:line="276" w:lineRule="auto"/>
+        <w:spacing w:after="120" w:line="276" w:lineRule="auto"/>
         <w:jc w:val="center"/>
       </w:pPr>
       <w:r>
@@ -196,7 +196,7 @@
     </w:p>
     <w:p>
       <w:pPr>
-        <w:spacing w:after="80" w:before="0" w:line="276" w:lineRule="auto"/>
+        <w:spacing w:after="120" w:line="276" w:lineRule="auto"/>
         <w:jc w:val="center"/>
       </w:pPr>
       <w:r>
@@ -211,7 +211,7 @@
     </w:p>
     <w:p>
       <w:pPr>
-        <w:spacing w:after="80" w:before="0" w:line="276" w:lineRule="auto"/>
+        <w:spacing w:after="120" w:line="276" w:lineRule="auto"/>
         <w:jc w:val="center"/>
       </w:pPr>
       <w:r>
@@ -226,7 +226,7 @@
     </w:p>
     <w:p>
       <w:pPr>
-        <w:spacing w:after="320" w:before="0" w:line="276" w:lineRule="auto"/>
+        <w:spacing w:after="280" w:line="276" w:lineRule="auto"/>
         <w:jc w:val="center"/>
       </w:pPr>
       <w:r>
@@ -240,7 +240,7 @@
     </w:p>
     <w:p>
       <w:pPr>
-        <w:spacing w:after="40" w:before="0" w:line="276" w:lineRule="auto"/>
+        <w:spacing w:after="120" w:line="276" w:lineRule="auto"/>
         <w:jc w:val="left"/>
       </w:pPr>
       <w:r>
@@ -255,7 +255,7 @@
     </w:p>
     <w:p>
       <w:pPr>
-        <w:spacing w:after="200" w:before="0" w:line="276" w:lineRule="auto"/>
+        <w:spacing w:after="120" w:line="276" w:lineRule="auto"/>
         <w:jc w:val="left"/>
       </w:pPr>
       <w:r>
@@ -270,7 +270,7 @@
     </w:p>
     <w:p>
       <w:pPr>
-        <w:spacing w:after="40" w:before="0" w:line="276" w:lineRule="auto"/>
+        <w:spacing w:after="120" w:line="276" w:lineRule="auto"/>
         <w:jc w:val="left"/>
       </w:pPr>
       <w:r>
@@ -285,7 +285,7 @@
     </w:p>
     <w:p>
       <w:pPr>
-        <w:spacing w:after="200" w:before="0" w:line="276" w:lineRule="auto"/>
+        <w:spacing w:after="120" w:line="276" w:lineRule="auto"/>
         <w:jc w:val="left"/>
       </w:pPr>
       <w:r>
@@ -300,7 +300,7 @@
     </w:p>
     <w:p>
       <w:pPr>
-        <w:spacing w:after="40" w:before="0" w:line="276" w:lineRule="auto"/>
+        <w:spacing w:after="120" w:line="276" w:lineRule="auto"/>
         <w:jc w:val="left"/>
       </w:pPr>
       <w:r>
@@ -315,7 +315,7 @@
     </w:p>
     <w:p>
       <w:pPr>
-        <w:spacing w:after="480" w:before="0" w:line="276" w:lineRule="auto"/>
+        <w:spacing w:after="120" w:line="276" w:lineRule="auto"/>
         <w:jc w:val="left"/>
       </w:pPr>
       <w:r>
@@ -330,7 +330,21 @@
     </w:p>
     <w:p>
       <w:pPr>
-        <w:spacing w:after="80" w:before="0" w:line="276" w:lineRule="auto"/>
+        <w:spacing w:after="360" w:line="276" w:lineRule="auto"/>
+        <w:jc w:val="center"/>
+      </w:pPr>
+      <w:r>
+        <w:rPr>
+          <w:rFonts w:ascii="Times New Roman" w:hAnsi="Times New Roman" w:eastAsia="Times New Roman"/>
+          <w:b w:val="0"/>
+          <w:i w:val="0"/>
+          <w:sz w:val="28"/>
+        </w:rPr>
+      </w:r>
+    </w:p>
+    <w:p>
+      <w:pPr>
+        <w:spacing w:after="120" w:line="276" w:lineRule="auto"/>
         <w:jc w:val="center"/>
       </w:pPr>
       <w:r>
@@ -350,7 +364,7 @@
     </w:p>
     <w:p>
       <w:pPr>
-        <w:spacing w:after="80" w:before="0" w:line="276" w:lineRule="auto"/>
+        <w:spacing w:after="120" w:line="276" w:lineRule="auto"/>
         <w:jc w:val="center"/>
       </w:pPr>
       <w:r>
@@ -365,7 +379,7 @@
     </w:p>
     <w:p>
       <w:pPr>
-        <w:spacing w:after="120" w:before="0" w:line="276" w:lineRule="auto"/>
+        <w:spacing w:after="120" w:line="276" w:lineRule="auto"/>
         <w:jc w:val="left"/>
       </w:pPr>
       <w:r>
@@ -380,7 +394,7 @@
     </w:p>
     <w:p>
       <w:pPr>
-        <w:spacing w:after="120" w:before="0" w:line="276" w:lineRule="auto"/>
+        <w:spacing w:after="120" w:line="276" w:lineRule="auto"/>
         <w:jc w:val="left"/>
       </w:pPr>
       <w:r>
@@ -395,7 +409,7 @@
     </w:p>
     <w:p>
       <w:pPr>
-        <w:spacing w:after="120" w:before="0" w:line="276" w:lineRule="auto"/>
+        <w:spacing w:after="120" w:line="276" w:lineRule="auto"/>
         <w:jc w:val="left"/>
       </w:pPr>
       <w:r>
@@ -405,12 +419,12 @@
           <w:i w:val="0"/>
           <w:sz w:val="24"/>
         </w:rPr>
-        <w:t>Контрольные вопросы …………………….……………………………………..8</w:t>
+        <w:t>Результаты работы сайта (скриншоты) …………………………………………..6</w:t>
       </w:r>
     </w:p>
     <w:p>
       <w:pPr>
-        <w:spacing w:after="120" w:before="0" w:line="276" w:lineRule="auto"/>
+        <w:spacing w:after="120" w:line="276" w:lineRule="auto"/>
         <w:jc w:val="left"/>
       </w:pPr>
       <w:r>
@@ -420,12 +434,12 @@
           <w:i w:val="0"/>
           <w:sz w:val="24"/>
         </w:rPr>
-        <w:t>ЗАКЛЮЧЕНИЕ….................................................................................................11</w:t>
+        <w:t>Контрольные вопросы …………………….……………………………………..9</w:t>
       </w:r>
     </w:p>
     <w:p>
       <w:pPr>
-        <w:spacing w:after="120" w:before="0" w:line="276" w:lineRule="auto"/>
+        <w:spacing w:after="120" w:line="276" w:lineRule="auto"/>
         <w:jc w:val="left"/>
       </w:pPr>
       <w:r>
@@ -435,7 +449,22 @@
           <w:i w:val="0"/>
           <w:sz w:val="24"/>
         </w:rPr>
-        <w:t>СПИСОК ИСПОЛЬЗУЕМЫХ ИСТОЧНИКОВ….............................................12</w:t>
+        <w:t>ЗАКЛЮЧЕНИЕ….................................................................................................10</w:t>
+      </w:r>
+    </w:p>
+    <w:p>
+      <w:pPr>
+        <w:spacing w:after="120" w:line="276" w:lineRule="auto"/>
+        <w:jc w:val="left"/>
+      </w:pPr>
+      <w:r>
+        <w:rPr>
+          <w:rFonts w:ascii="Times New Roman" w:hAnsi="Times New Roman" w:eastAsia="Times New Roman"/>
+          <w:b w:val="0"/>
+          <w:i w:val="0"/>
+          <w:sz w:val="24"/>
+        </w:rPr>
+        <w:t>СПИСОК ИСПОЛЬЗУЕМЫХ ИСТОЧНИКОВ….............................................11</w:t>
       </w:r>
     </w:p>
     <w:p>
@@ -445,7 +474,7 @@
     </w:p>
     <w:p>
       <w:pPr>
-        <w:spacing w:after="80" w:before="0" w:line="276" w:lineRule="auto"/>
+        <w:spacing w:after="120" w:line="276" w:lineRule="auto"/>
         <w:jc w:val="center"/>
       </w:pPr>
       <w:r>
@@ -460,7 +489,7 @@
     </w:p>
     <w:p>
       <w:pPr>
-        <w:spacing w:after="120" w:before="0" w:line="276" w:lineRule="auto"/>
+        <w:spacing w:after="120" w:line="276" w:lineRule="auto"/>
         <w:ind w:firstLine="709"/>
         <w:jc w:val="both"/>
       </w:pPr>
@@ -471,12 +500,12 @@
           <w:i w:val="0"/>
           <w:sz w:val="28"/>
         </w:rPr>
-        <w:t>Лабораторный практикум для обучающихся по направлению 09.03.02 – Информационные системы и технологии разработан на кафедре информационных технологий. Данный материал использован для подготовки к выполнению лабораторных работ по курсу «Web-разработка».</w:t>
+        <w:t>Лабораторный практикум для обучающихся по направлению 09.03.02 – Информационные системы и технологии разработан на кафедре информационных технологий. Материал использован для подготовки к лабораторным работам по курсу «Web-разработка».</w:t>
       </w:r>
     </w:p>
     <w:p>
       <w:pPr>
-        <w:spacing w:after="120" w:before="0" w:line="276" w:lineRule="auto"/>
+        <w:spacing w:after="120" w:line="276" w:lineRule="auto"/>
         <w:ind w:firstLine="709"/>
         <w:jc w:val="both"/>
       </w:pPr>
@@ -487,7 +516,7 @@
           <w:i w:val="0"/>
           <w:sz w:val="28"/>
         </w:rPr>
-        <w:t>Большое внимание уделено созданию сайтов, применению языков разметки и стилей, а также разработке учебных веб-страниц с использованием HTML и CSS. Каждая лабораторная работа содержит теоретический материал, практическое задание и контрольные вопросы.</w:t>
+        <w:t>В работе рассматриваются создание учебных сайтов, применение HTML и CSS, а также оформление интерфейсов. Каждая лабораторная содержит задание, описание проекта, результаты (включая скриншоты) и контрольные вопросы.</w:t>
       </w:r>
     </w:p>
     <w:p>
@@ -497,7 +526,7 @@
     </w:p>
     <w:p>
       <w:pPr>
-        <w:spacing w:after="80" w:before="0" w:line="276" w:lineRule="auto"/>
+        <w:spacing w:after="120" w:line="276" w:lineRule="auto"/>
         <w:jc w:val="center"/>
       </w:pPr>
       <w:r>
@@ -512,7 +541,7 @@
     </w:p>
     <w:p>
       <w:pPr>
-        <w:spacing w:after="120" w:before="0" w:line="276" w:lineRule="auto"/>
+        <w:spacing w:after="120" w:line="276" w:lineRule="auto"/>
         <w:ind w:firstLine="709"/>
         <w:jc w:val="both"/>
       </w:pPr>
@@ -523,26 +552,12 @@
           <w:i w:val="0"/>
           <w:sz w:val="28"/>
         </w:rPr>
-        <w:t>Цель: научиться основам вёрстки web-страницы с применением языка гипертекстовой разметки HTML и каскадных таблиц стилей CSS.</w:t>
+        <w:t>Цель: научиться основам вёрстки web-страницы с применением HTML и CSS.</w:t>
       </w:r>
     </w:p>
     <w:p>
       <w:pPr>
-        <w:spacing w:after="80" w:before="0" w:line="276" w:lineRule="auto"/>
-        <w:jc w:val="both"/>
-      </w:pPr>
-      <w:r>
-        <w:rPr>
-          <w:rFonts w:ascii="Times New Roman" w:hAnsi="Times New Roman" w:eastAsia="Times New Roman"/>
-          <w:b w:val="0"/>
-          <w:i w:val="0"/>
-          <w:sz w:val="28"/>
-        </w:rPr>
-      </w:r>
-    </w:p>
-    <w:p>
-      <w:pPr>
-        <w:spacing w:after="120" w:before="0" w:line="276" w:lineRule="auto"/>
+        <w:spacing w:after="120" w:line="276" w:lineRule="auto"/>
         <w:jc w:val="left"/>
       </w:pPr>
       <w:r>
@@ -557,7 +572,7 @@
     </w:p>
     <w:p>
       <w:pPr>
-        <w:spacing w:after="120" w:before="0" w:line="276" w:lineRule="auto"/>
+        <w:spacing w:after="120" w:line="276" w:lineRule="auto"/>
         <w:ind w:firstLine="709"/>
         <w:jc w:val="both"/>
       </w:pPr>
@@ -568,12 +583,12 @@
           <w:i w:val="0"/>
           <w:sz w:val="28"/>
         </w:rPr>
-        <w:t>Создать одностраничный учебный сайт с применением HTML5 и CSS3: шапка и подвал, навигация по якорям, смысловые блоки с текстом и изображениями.</w:t>
+        <w:t>Создать одностраничный сайт с шапкой, подвалом, якорной навигацией и смысловыми блоками с текстом и изображениями.</w:t>
       </w:r>
     </w:p>
     <w:p>
       <w:pPr>
-        <w:spacing w:after="120" w:before="0" w:line="276" w:lineRule="auto"/>
+        <w:spacing w:after="120" w:line="276" w:lineRule="auto"/>
         <w:jc w:val="left"/>
       </w:pPr>
       <w:r>
@@ -588,7 +603,7 @@
     </w:p>
     <w:p>
       <w:pPr>
-        <w:spacing w:after="120" w:before="0" w:line="276" w:lineRule="auto"/>
+        <w:spacing w:after="120" w:line="276" w:lineRule="auto"/>
         <w:ind w:firstLine="709"/>
         <w:jc w:val="both"/>
       </w:pPr>
@@ -599,12 +614,12 @@
           <w:i w:val="0"/>
           <w:sz w:val="28"/>
         </w:rPr>
-        <w:t>Сайт «Легенды русской поэзии» — одностраничный ресурс о четырёх поэтах: С. Есенин, А. Пушкин, В. Маяковский, М. Лермонтов. У каждого блока: портрет, фрагмент стихотворения и ссылка на Википедию.</w:t>
+        <w:t>Сайт «Легенды русской поэзии»: Есенин, Пушкин, Маяковский, Лермонтов — портрет, фрагмент стиха, ссылка на Википедию.</w:t>
       </w:r>
     </w:p>
     <w:p>
       <w:pPr>
-        <w:spacing w:after="120" w:before="0" w:line="276" w:lineRule="auto"/>
+        <w:spacing w:after="120" w:line="276" w:lineRule="auto"/>
         <w:jc w:val="left"/>
       </w:pPr>
       <w:r>
@@ -619,7 +634,7 @@
     </w:p>
     <w:p>
       <w:pPr>
-        <w:spacing w:after="120" w:before="0" w:line="276" w:lineRule="auto"/>
+        <w:spacing w:after="120" w:line="276" w:lineRule="auto"/>
         <w:ind w:firstLine="709"/>
         <w:jc w:val="both"/>
       </w:pPr>
@@ -630,12 +645,12 @@
           <w:i w:val="0"/>
           <w:sz w:val="28"/>
         </w:rPr>
-        <w:t>HTML5 (index.html), CSS3 (style/style.css), шрифт Times New Roman, без JavaScript. Структура: шапка/подвал с логотипом и якорным меню (#esenin, #pushkin, #mayakovsky, #lermontov); основная часть — четыре секции .poet.</w:t>
+        <w:t>HTML5 + CSS3, без JavaScript. Файлы: lab1/index.html, lab1/style/style.css, изображения в lab1/src/.</w:t>
       </w:r>
     </w:p>
     <w:p>
       <w:pPr>
-        <w:spacing w:after="120" w:before="0" w:line="276" w:lineRule="auto"/>
+        <w:spacing w:after="120" w:line="276" w:lineRule="auto"/>
         <w:jc w:val="left"/>
       </w:pPr>
       <w:r>
@@ -650,7 +665,7 @@
     </w:p>
     <w:p>
       <w:pPr>
-        <w:spacing w:after="120" w:before="0" w:line="276" w:lineRule="auto"/>
+        <w:spacing w:after="120" w:line="276" w:lineRule="auto"/>
         <w:ind w:firstLine="709"/>
         <w:jc w:val="both"/>
       </w:pPr>
@@ -661,12 +676,12 @@
           <w:i w:val="0"/>
           <w:sz w:val="28"/>
         </w:rPr>
-        <w:t>Исходный код размещён в репозитории Web-Design, каталог lab1/ (файлы index.html, style/style.css, изображения в src/).</w:t>
+        <w:t>Код в репозитории Web-Design, каталог lab1/.</w:t>
       </w:r>
     </w:p>
     <w:p>
       <w:pPr>
-        <w:spacing w:after="120" w:before="0" w:line="276" w:lineRule="auto"/>
+        <w:spacing w:after="120" w:line="276" w:lineRule="auto"/>
         <w:jc w:val="left"/>
       </w:pPr>
       <w:r>
@@ -681,7 +696,7 @@
     </w:p>
     <w:p>
       <w:pPr>
-        <w:spacing w:after="120" w:before="0" w:line="276" w:lineRule="auto"/>
+        <w:spacing w:after="120" w:line="276" w:lineRule="auto"/>
         <w:ind w:firstLine="709"/>
         <w:jc w:val="both"/>
       </w:pPr>
@@ -692,12 +707,86 @@
           <w:i w:val="0"/>
           <w:sz w:val="28"/>
         </w:rPr>
-        <w:t>Страница корректно отображается в браузере; якорная навигация переходит к нужным секциям; стили шапки и подвала согласованы; сайт доступен локально и на GitHub Pages: https://furfantom1331fur.github.io/Web-Design/lab1/</w:t>
+        <w:t>Страница отображается в браузере, якоря работают. GitHub Pages: https://furfantom1331fur.github.io/Web-Design/lab1/</w:t>
+      </w:r>
+    </w:p>
+    <w:p>
+      <w:r>
+        <w:br w:type="page"/>
       </w:r>
     </w:p>
     <w:p>
       <w:pPr>
-        <w:spacing w:after="80" w:before="0" w:line="276" w:lineRule="auto"/>
+        <w:spacing w:after="120" w:line="276" w:lineRule="auto"/>
+        <w:jc w:val="center"/>
+      </w:pPr>
+      <w:r>
+        <w:rPr>
+          <w:rFonts w:ascii="Times New Roman" w:hAnsi="Times New Roman" w:eastAsia="Times New Roman"/>
+          <w:b/>
+          <w:i w:val="0"/>
+          <w:sz w:val="28"/>
+        </w:rPr>
+        <w:t>Результаты работы сайта (скриншоты)</w:t>
+      </w:r>
+    </w:p>
+    <w:p>
+      <w:pPr>
+        <w:spacing w:after="80" w:line="276" w:lineRule="auto"/>
+        <w:jc w:val="center"/>
+      </w:pPr>
+      <w:r>
+        <w:rPr>
+          <w:rFonts w:ascii="Times New Roman" w:hAnsi="Times New Roman" w:eastAsia="Times New Roman"/>
+          <w:b w:val="0"/>
+          <w:i/>
+          <w:sz w:val="24"/>
+        </w:rPr>
+        <w:t>Общий вид (верх страницы)</w:t>
+      </w:r>
+    </w:p>
+    <w:p>
+      <w:pPr>
+        <w:jc w:val="center"/>
+      </w:pPr>
+      <w:r>
+        <w:drawing>
+          <wp:inline xmlns:a="http://schemas.openxmlformats.org/drawingml/2006/main" xmlns:pic="http://schemas.openxmlformats.org/drawingml/2006/picture">
+            <wp:extent cx="5212080" cy="2671191"/>
+            <wp:docPr id="1" name="Picture 1"/>
+            <wp:cNvGraphicFramePr>
+              <a:graphicFrameLocks noChangeAspect="1"/>
+            </wp:cNvGraphicFramePr>
+            <a:graphic>
+              <a:graphicData uri="http://schemas.openxmlformats.org/drawingml/2006/picture">
+                <pic:pic>
+                  <pic:nvPicPr>
+                    <pic:cNvPr id="0" name="01_full_top.png"/>
+                    <pic:cNvPicPr/>
+                  </pic:nvPicPr>
+                  <pic:blipFill>
+                    <a:blip r:embed="rId9"/>
+                    <a:stretch>
+                      <a:fillRect/>
+                    </a:stretch>
+                  </pic:blipFill>
+                  <pic:spPr>
+                    <a:xfrm>
+                      <a:off x="0" y="0"/>
+                      <a:ext cx="5212080" cy="2671191"/>
+                    </a:xfrm>
+                    <a:prstGeom prst="rect"/>
+                  </pic:spPr>
+                </pic:pic>
+              </a:graphicData>
+            </a:graphic>
+          </wp:inline>
+        </w:drawing>
+      </w:r>
+    </w:p>
+    <w:p>
+      <w:pPr>
+        <w:spacing w:after="160" w:line="276" w:lineRule="auto"/>
         <w:jc w:val="both"/>
       </w:pPr>
       <w:r>
@@ -711,7 +800,347 @@
     </w:p>
     <w:p>
       <w:pPr>
-        <w:spacing w:after="120" w:before="0" w:line="276" w:lineRule="auto"/>
+        <w:spacing w:after="80" w:line="276" w:lineRule="auto"/>
+        <w:jc w:val="center"/>
+      </w:pPr>
+      <w:r>
+        <w:rPr>
+          <w:rFonts w:ascii="Times New Roman" w:hAnsi="Times New Roman" w:eastAsia="Times New Roman"/>
+          <w:b w:val="0"/>
+          <w:i/>
+          <w:sz w:val="24"/>
+        </w:rPr>
+        <w:t>Блок Есенина</w:t>
+      </w:r>
+    </w:p>
+    <w:p>
+      <w:pPr>
+        <w:jc w:val="center"/>
+      </w:pPr>
+      <w:r>
+        <w:drawing>
+          <wp:inline xmlns:a="http://schemas.openxmlformats.org/drawingml/2006/main" xmlns:pic="http://schemas.openxmlformats.org/drawingml/2006/picture">
+            <wp:extent cx="5212080" cy="2671191"/>
+            <wp:docPr id="2" name="Picture 2"/>
+            <wp:cNvGraphicFramePr>
+              <a:graphicFrameLocks noChangeAspect="1"/>
+            </wp:cNvGraphicFramePr>
+            <a:graphic>
+              <a:graphicData uri="http://schemas.openxmlformats.org/drawingml/2006/picture">
+                <pic:pic>
+                  <pic:nvPicPr>
+                    <pic:cNvPr id="0" name="02_esenin.png"/>
+                    <pic:cNvPicPr/>
+                  </pic:nvPicPr>
+                  <pic:blipFill>
+                    <a:blip r:embed="rId10"/>
+                    <a:stretch>
+                      <a:fillRect/>
+                    </a:stretch>
+                  </pic:blipFill>
+                  <pic:spPr>
+                    <a:xfrm>
+                      <a:off x="0" y="0"/>
+                      <a:ext cx="5212080" cy="2671191"/>
+                    </a:xfrm>
+                    <a:prstGeom prst="rect"/>
+                  </pic:spPr>
+                </pic:pic>
+              </a:graphicData>
+            </a:graphic>
+          </wp:inline>
+        </w:drawing>
+      </w:r>
+    </w:p>
+    <w:p>
+      <w:pPr>
+        <w:spacing w:after="160" w:line="276" w:lineRule="auto"/>
+        <w:jc w:val="both"/>
+      </w:pPr>
+      <w:r>
+        <w:rPr>
+          <w:rFonts w:ascii="Times New Roman" w:hAnsi="Times New Roman" w:eastAsia="Times New Roman"/>
+          <w:b w:val="0"/>
+          <w:i w:val="0"/>
+          <w:sz w:val="28"/>
+        </w:rPr>
+      </w:r>
+    </w:p>
+    <w:p>
+      <w:pPr>
+        <w:spacing w:after="80" w:line="276" w:lineRule="auto"/>
+        <w:jc w:val="center"/>
+      </w:pPr>
+      <w:r>
+        <w:rPr>
+          <w:rFonts w:ascii="Times New Roman" w:hAnsi="Times New Roman" w:eastAsia="Times New Roman"/>
+          <w:b w:val="0"/>
+          <w:i/>
+          <w:sz w:val="24"/>
+        </w:rPr>
+        <w:t>Блок Пушкина</w:t>
+      </w:r>
+    </w:p>
+    <w:p>
+      <w:pPr>
+        <w:jc w:val="center"/>
+      </w:pPr>
+      <w:r>
+        <w:drawing>
+          <wp:inline xmlns:a="http://schemas.openxmlformats.org/drawingml/2006/main" xmlns:pic="http://schemas.openxmlformats.org/drawingml/2006/picture">
+            <wp:extent cx="5212080" cy="2671191"/>
+            <wp:docPr id="3" name="Picture 3"/>
+            <wp:cNvGraphicFramePr>
+              <a:graphicFrameLocks noChangeAspect="1"/>
+            </wp:cNvGraphicFramePr>
+            <a:graphic>
+              <a:graphicData uri="http://schemas.openxmlformats.org/drawingml/2006/picture">
+                <pic:pic>
+                  <pic:nvPicPr>
+                    <pic:cNvPr id="0" name="03_pushkin.png"/>
+                    <pic:cNvPicPr/>
+                  </pic:nvPicPr>
+                  <pic:blipFill>
+                    <a:blip r:embed="rId11"/>
+                    <a:stretch>
+                      <a:fillRect/>
+                    </a:stretch>
+                  </pic:blipFill>
+                  <pic:spPr>
+                    <a:xfrm>
+                      <a:off x="0" y="0"/>
+                      <a:ext cx="5212080" cy="2671191"/>
+                    </a:xfrm>
+                    <a:prstGeom prst="rect"/>
+                  </pic:spPr>
+                </pic:pic>
+              </a:graphicData>
+            </a:graphic>
+          </wp:inline>
+        </w:drawing>
+      </w:r>
+    </w:p>
+    <w:p>
+      <w:pPr>
+        <w:spacing w:after="160" w:line="276" w:lineRule="auto"/>
+        <w:jc w:val="both"/>
+      </w:pPr>
+      <w:r>
+        <w:rPr>
+          <w:rFonts w:ascii="Times New Roman" w:hAnsi="Times New Roman" w:eastAsia="Times New Roman"/>
+          <w:b w:val="0"/>
+          <w:i w:val="0"/>
+          <w:sz w:val="28"/>
+        </w:rPr>
+      </w:r>
+    </w:p>
+    <w:p>
+      <w:pPr>
+        <w:spacing w:after="80" w:line="276" w:lineRule="auto"/>
+        <w:jc w:val="center"/>
+      </w:pPr>
+      <w:r>
+        <w:rPr>
+          <w:rFonts w:ascii="Times New Roman" w:hAnsi="Times New Roman" w:eastAsia="Times New Roman"/>
+          <w:b w:val="0"/>
+          <w:i/>
+          <w:sz w:val="24"/>
+        </w:rPr>
+        <w:t>Блок Маяковского</w:t>
+      </w:r>
+    </w:p>
+    <w:p>
+      <w:pPr>
+        <w:jc w:val="center"/>
+      </w:pPr>
+      <w:r>
+        <w:drawing>
+          <wp:inline xmlns:a="http://schemas.openxmlformats.org/drawingml/2006/main" xmlns:pic="http://schemas.openxmlformats.org/drawingml/2006/picture">
+            <wp:extent cx="5212080" cy="2671191"/>
+            <wp:docPr id="4" name="Picture 4"/>
+            <wp:cNvGraphicFramePr>
+              <a:graphicFrameLocks noChangeAspect="1"/>
+            </wp:cNvGraphicFramePr>
+            <a:graphic>
+              <a:graphicData uri="http://schemas.openxmlformats.org/drawingml/2006/picture">
+                <pic:pic>
+                  <pic:nvPicPr>
+                    <pic:cNvPr id="0" name="04_mayakovsky.png"/>
+                    <pic:cNvPicPr/>
+                  </pic:nvPicPr>
+                  <pic:blipFill>
+                    <a:blip r:embed="rId12"/>
+                    <a:stretch>
+                      <a:fillRect/>
+                    </a:stretch>
+                  </pic:blipFill>
+                  <pic:spPr>
+                    <a:xfrm>
+                      <a:off x="0" y="0"/>
+                      <a:ext cx="5212080" cy="2671191"/>
+                    </a:xfrm>
+                    <a:prstGeom prst="rect"/>
+                  </pic:spPr>
+                </pic:pic>
+              </a:graphicData>
+            </a:graphic>
+          </wp:inline>
+        </w:drawing>
+      </w:r>
+    </w:p>
+    <w:p>
+      <w:pPr>
+        <w:spacing w:after="160" w:line="276" w:lineRule="auto"/>
+        <w:jc w:val="both"/>
+      </w:pPr>
+      <w:r>
+        <w:rPr>
+          <w:rFonts w:ascii="Times New Roman" w:hAnsi="Times New Roman" w:eastAsia="Times New Roman"/>
+          <w:b w:val="0"/>
+          <w:i w:val="0"/>
+          <w:sz w:val="28"/>
+        </w:rPr>
+      </w:r>
+    </w:p>
+    <w:p>
+      <w:pPr>
+        <w:spacing w:after="80" w:line="276" w:lineRule="auto"/>
+        <w:jc w:val="center"/>
+      </w:pPr>
+      <w:r>
+        <w:rPr>
+          <w:rFonts w:ascii="Times New Roman" w:hAnsi="Times New Roman" w:eastAsia="Times New Roman"/>
+          <w:b w:val="0"/>
+          <w:i/>
+          <w:sz w:val="24"/>
+        </w:rPr>
+        <w:t>Блок Лермонтова</w:t>
+      </w:r>
+    </w:p>
+    <w:p>
+      <w:pPr>
+        <w:jc w:val="center"/>
+      </w:pPr>
+      <w:r>
+        <w:drawing>
+          <wp:inline xmlns:a="http://schemas.openxmlformats.org/drawingml/2006/main" xmlns:pic="http://schemas.openxmlformats.org/drawingml/2006/picture">
+            <wp:extent cx="5212080" cy="2671191"/>
+            <wp:docPr id="5" name="Picture 5"/>
+            <wp:cNvGraphicFramePr>
+              <a:graphicFrameLocks noChangeAspect="1"/>
+            </wp:cNvGraphicFramePr>
+            <a:graphic>
+              <a:graphicData uri="http://schemas.openxmlformats.org/drawingml/2006/picture">
+                <pic:pic>
+                  <pic:nvPicPr>
+                    <pic:cNvPr id="0" name="05_lermontov.png"/>
+                    <pic:cNvPicPr/>
+                  </pic:nvPicPr>
+                  <pic:blipFill>
+                    <a:blip r:embed="rId13"/>
+                    <a:stretch>
+                      <a:fillRect/>
+                    </a:stretch>
+                  </pic:blipFill>
+                  <pic:spPr>
+                    <a:xfrm>
+                      <a:off x="0" y="0"/>
+                      <a:ext cx="5212080" cy="2671191"/>
+                    </a:xfrm>
+                    <a:prstGeom prst="rect"/>
+                  </pic:spPr>
+                </pic:pic>
+              </a:graphicData>
+            </a:graphic>
+          </wp:inline>
+        </w:drawing>
+      </w:r>
+    </w:p>
+    <w:p>
+      <w:pPr>
+        <w:spacing w:after="160" w:line="276" w:lineRule="auto"/>
+        <w:jc w:val="both"/>
+      </w:pPr>
+      <w:r>
+        <w:rPr>
+          <w:rFonts w:ascii="Times New Roman" w:hAnsi="Times New Roman" w:eastAsia="Times New Roman"/>
+          <w:b w:val="0"/>
+          <w:i w:val="0"/>
+          <w:sz w:val="28"/>
+        </w:rPr>
+      </w:r>
+    </w:p>
+    <w:p>
+      <w:pPr>
+        <w:spacing w:after="80" w:line="276" w:lineRule="auto"/>
+        <w:jc w:val="center"/>
+      </w:pPr>
+      <w:r>
+        <w:rPr>
+          <w:rFonts w:ascii="Times New Roman" w:hAnsi="Times New Roman" w:eastAsia="Times New Roman"/>
+          <w:b w:val="0"/>
+          <w:i/>
+          <w:sz w:val="24"/>
+        </w:rPr>
+        <w:t>Подвал</w:t>
+      </w:r>
+    </w:p>
+    <w:p>
+      <w:pPr>
+        <w:jc w:val="center"/>
+      </w:pPr>
+      <w:r>
+        <w:drawing>
+          <wp:inline xmlns:a="http://schemas.openxmlformats.org/drawingml/2006/main" xmlns:pic="http://schemas.openxmlformats.org/drawingml/2006/picture">
+            <wp:extent cx="5212080" cy="2671191"/>
+            <wp:docPr id="6" name="Picture 6"/>
+            <wp:cNvGraphicFramePr>
+              <a:graphicFrameLocks noChangeAspect="1"/>
+            </wp:cNvGraphicFramePr>
+            <a:graphic>
+              <a:graphicData uri="http://schemas.openxmlformats.org/drawingml/2006/picture">
+                <pic:pic>
+                  <pic:nvPicPr>
+                    <pic:cNvPr id="0" name="05_lermontov.png"/>
+                    <pic:cNvPicPr/>
+                  </pic:nvPicPr>
+                  <pic:blipFill>
+                    <a:blip r:embed="rId13"/>
+                    <a:stretch>
+                      <a:fillRect/>
+                    </a:stretch>
+                  </pic:blipFill>
+                  <pic:spPr>
+                    <a:xfrm>
+                      <a:off x="0" y="0"/>
+                      <a:ext cx="5212080" cy="2671191"/>
+                    </a:xfrm>
+                    <a:prstGeom prst="rect"/>
+                  </pic:spPr>
+                </pic:pic>
+              </a:graphicData>
+            </a:graphic>
+          </wp:inline>
+        </w:drawing>
+      </w:r>
+    </w:p>
+    <w:p>
+      <w:pPr>
+        <w:spacing w:after="160" w:line="276" w:lineRule="auto"/>
+        <w:jc w:val="both"/>
+      </w:pPr>
+      <w:r>
+        <w:rPr>
+          <w:rFonts w:ascii="Times New Roman" w:hAnsi="Times New Roman" w:eastAsia="Times New Roman"/>
+          <w:b w:val="0"/>
+          <w:i w:val="0"/>
+          <w:sz w:val="28"/>
+        </w:rPr>
+      </w:r>
+    </w:p>
+    <w:p>
+      <w:pPr>
+        <w:spacing w:after="120" w:line="276" w:lineRule="auto"/>
         <w:jc w:val="left"/>
       </w:pPr>
       <w:r>
@@ -726,7 +1155,7 @@
     </w:p>
     <w:p>
       <w:pPr>
-        <w:spacing w:after="120" w:before="0" w:line="276" w:lineRule="auto"/>
+        <w:spacing w:after="120" w:line="276" w:lineRule="auto"/>
         <w:ind w:firstLine="425"/>
         <w:jc w:val="left"/>
       </w:pPr>
@@ -737,12 +1166,12 @@
           <w:i w:val="0"/>
           <w:sz w:val="28"/>
         </w:rPr>
-        <w:t>1. Какие обязательные теги входят в базовую структуру HTML5-документа?</w:t>
+        <w:t>1. Какие обязательные теги входят в структуру HTML5?</w:t>
       </w:r>
     </w:p>
     <w:p>
       <w:pPr>
-        <w:spacing w:after="120" w:before="0" w:line="276" w:lineRule="auto"/>
+        <w:spacing w:after="120" w:line="276" w:lineRule="auto"/>
         <w:ind w:firstLine="425"/>
         <w:jc w:val="left"/>
       </w:pPr>
@@ -753,12 +1182,12 @@
           <w:i w:val="0"/>
           <w:sz w:val="28"/>
         </w:rPr>
-        <w:t>2. Для чего нужны элементы &lt;head&gt; и &lt;body&gt;?</w:t>
+        <w:t>2. Для чего нужны &lt;head&gt; и &lt;body&gt;?</w:t>
       </w:r>
     </w:p>
     <w:p>
       <w:pPr>
-        <w:spacing w:after="120" w:before="0" w:line="276" w:lineRule="auto"/>
+        <w:spacing w:after="120" w:line="276" w:lineRule="auto"/>
         <w:ind w:firstLine="425"/>
         <w:jc w:val="left"/>
       </w:pPr>
@@ -769,12 +1198,12 @@
           <w:i w:val="0"/>
           <w:sz w:val="28"/>
         </w:rPr>
-        <w:t>3. Как подключить внешний файл стилей CSS?</w:t>
+        <w:t>3. Как подключить внешний CSS?</w:t>
       </w:r>
     </w:p>
     <w:p>
       <w:pPr>
-        <w:spacing w:after="120" w:before="0" w:line="276" w:lineRule="auto"/>
+        <w:spacing w:after="120" w:line="276" w:lineRule="auto"/>
         <w:ind w:firstLine="425"/>
         <w:jc w:val="left"/>
       </w:pPr>
@@ -785,12 +1214,12 @@
           <w:i w:val="0"/>
           <w:sz w:val="28"/>
         </w:rPr>
-        <w:t>4. Чем отличается блочный элемент от строчного?</w:t>
+        <w:t>4. Чем блочный элемент отличается от строчного?</w:t>
       </w:r>
     </w:p>
     <w:p>
       <w:pPr>
-        <w:spacing w:after="120" w:before="0" w:line="276" w:lineRule="auto"/>
+        <w:spacing w:after="120" w:line="276" w:lineRule="auto"/>
         <w:ind w:firstLine="425"/>
         <w:jc w:val="left"/>
       </w:pPr>
@@ -801,7 +1230,7 @@
           <w:i w:val="0"/>
           <w:sz w:val="28"/>
         </w:rPr>
-        <w:t>5. Как организовать навигацию по разделам одной страницы с помощью якорей?</w:t>
+        <w:t>5. Как сделать навигацию якорями?</w:t>
       </w:r>
     </w:p>
     <w:p>
@@ -811,7 +1240,7 @@
     </w:p>
     <w:p>
       <w:pPr>
-        <w:spacing w:after="80" w:before="0" w:line="276" w:lineRule="auto"/>
+        <w:spacing w:after="120" w:line="276" w:lineRule="auto"/>
         <w:jc w:val="center"/>
       </w:pPr>
       <w:r>
@@ -826,7 +1255,7 @@
     </w:p>
     <w:p>
       <w:pPr>
-        <w:spacing w:after="120" w:before="0" w:line="276" w:lineRule="auto"/>
+        <w:spacing w:after="120" w:line="276" w:lineRule="auto"/>
         <w:ind w:firstLine="709"/>
         <w:jc w:val="both"/>
       </w:pPr>
@@ -837,7 +1266,7 @@
           <w:i w:val="0"/>
           <w:sz w:val="28"/>
         </w:rPr>
-        <w:t>В ходе выполнения лабораторной работы № 1 разработан одностраничный сайт «Легенды русской поэзии» на чистом HTML и CSS. Получен практический опыт разметки секций, оформления шапки/подвала и якорной навигации. Поставленная цель — освоить основы вёрстки с применением HTML и CSS — достигнута.</w:t>
+        <w:t>Разработан одностраничный сайт «Легенды русской поэзии». Освоены основы HTML/CSS-вёрстки. Цель достигнута.</w:t>
       </w:r>
     </w:p>
     <w:p>
@@ -847,7 +1276,7 @@
     </w:p>
     <w:p>
       <w:pPr>
-        <w:spacing w:after="80" w:before="0" w:line="276" w:lineRule="auto"/>
+        <w:spacing w:after="120" w:line="276" w:lineRule="auto"/>
         <w:jc w:val="center"/>
       </w:pPr>
       <w:r>
@@ -862,8 +1291,7 @@
     </w:p>
     <w:p>
       <w:pPr>
-        <w:spacing w:after="120" w:before="0" w:line="276" w:lineRule="auto"/>
-        <w:ind w:firstLine="0"/>
+        <w:spacing w:after="120" w:line="276" w:lineRule="auto"/>
         <w:jc w:val="left"/>
       </w:pPr>
       <w:r>
@@ -878,8 +1306,7 @@
     </w:p>
     <w:p>
       <w:pPr>
-        <w:spacing w:after="120" w:before="0" w:line="276" w:lineRule="auto"/>
-        <w:ind w:firstLine="0"/>
+        <w:spacing w:after="120" w:line="276" w:lineRule="auto"/>
         <w:jc w:val="left"/>
       </w:pPr>
       <w:r>
@@ -889,7 +1316,7 @@
           <w:i w:val="0"/>
           <w:sz w:val="28"/>
         </w:rPr>
-        <w:t>2. Репозиторий учебных работ: https://github.com/FURFanTom1331FUR/Web-Design</w:t>
+        <w:t>2. Репозиторий: https://github.com/FURFanTom1331FUR/Web-Design</w:t>
       </w:r>
     </w:p>
     <w:sectPr>
@@ -1265,10 +1692,6 @@
     <w:name w:val="Normal"/>
     <w:qFormat/>
     <w:rsid w:val="00FC693F"/>
-    <w:rPr>
-      <w:rFonts w:ascii="Times New Roman" w:hAnsi="Times New Roman"/>
-      <w:sz w:val="28"/>
-    </w:rPr>
   </w:style>
   <w:style w:type="paragraph" w:styleId="Header">
     <w:name w:val="header"/>

</xml_diff>